<commit_message>
Fabric guide: add Security, Access & Environment Model deep-dive
For a government crown corporation: Entra security-group model (group-based, naming, PIM,
Conditional Access), Fabric access control defense-in-depth (tenant->capacity->workspace->item->
data), service-principal usage (per-env, least privilege, Key Vault, scoped tenant API), DEV/UAT/
PROD segregation (own workspaces/SPN/KV, no prod data downstream, promotion-only changes), a
who-gets-what access matrix by persona x environment, data privacy (PII masking, sensitivity
labels, Canadian residency, encryption, DLP), connection/network controls, and a tenant-guardrails
checklist. Added to all three formats (md, docx, html).
</commit_message>
<xml_diff>
--- a/milestone-guide/fabric-milestone-guide.docx
+++ b/milestone-guide/fabric-milestone-guide.docx
@@ -2983,6 +2983,32 @@
         <w:t>.*</w:t>
       </w:r>
     </w:p>
+    <w:p>
+      <w:r>
+        <w:t>&gt; Because BCPC is a crown corporation, the full **Entra security model, service-principal usage,</w:t>
+      </w:r>
+    </w:p>
+    <w:p>
+      <w:r>
+        <w:t>&gt; DEV/UAT/PROD segregation, and a who-gets-what access matrix** are set out in the</w:t>
+      </w:r>
+    </w:p>
+    <w:p>
+      <w:r>
+        <w:t xml:space="preserve">&gt; </w:t>
+      </w:r>
+      <w:r>
+        <w:rPr>
+          <w:b/>
+        </w:rPr>
+        <w:t>[Security, Access &amp; Environment Model](#security-access--environment-model--best-practice-design)</w:t>
+      </w:r>
+    </w:p>
+    <w:p>
+      <w:r>
+        <w:t>&gt; deep-dive near the end of this guide.</w:t>
+      </w:r>
+    </w:p>
     <w:tbl>
       <w:tblPr>
         <w:tblStyle w:val="LightGrid-Accent1"/>
@@ -6435,6 +6461,4298 @@
                 <w:sz w:val="18"/>
               </w:rPr>
               <w:t xml:space="preserve"> Validate the build-vs-consume workspace split with a real report and audience before rolling out broadly.</w:t>
+            </w:r>
+          </w:p>
+        </w:tc>
+      </w:tr>
+    </w:tbl>
+    <w:p/>
+    <w:p>
+      <w:pPr>
+        <w:pStyle w:val="Heading2"/>
+      </w:pPr>
+      <w:r/>
+      <w:r>
+        <w:t>Security, Access &amp; Environment Model — best-practice design</w:t>
+      </w:r>
+    </w:p>
+    <w:p>
+      <w:r>
+        <w:t>*BCPC is a government crown corporation: access control, data privacy, and environment isolation are</w:t>
+      </w:r>
+    </w:p>
+    <w:p>
+      <w:r>
+        <w:t>first-order requirements, not afterthoughts. This section expands the Security and Governance items</w:t>
+      </w:r>
+    </w:p>
+    <w:p>
+      <w:r>
+        <w:t>above into a concrete, best-practice design. It is a recommendation to adopt and refine with BCPC's</w:t>
+      </w:r>
+    </w:p>
+    <w:p>
+      <w:r>
+        <w:t>security team — the platform already provides the enforcement mechanisms it relies on.*</w:t>
+      </w:r>
+    </w:p>
+    <w:p>
+      <w:r>
+        <w:rPr>
+          <w:b/>
+        </w:rPr>
+        <w:t>Guiding principles</w:t>
+      </w:r>
+    </w:p>
+    <w:p>
+      <w:pPr>
+        <w:pStyle w:val="ListBullet"/>
+        <w:ind w:left="360"/>
+      </w:pPr>
+      <w:r>
+        <w:rPr>
+          <w:b/>
+        </w:rPr>
+        <w:t>Group-based, never individual.</w:t>
+      </w:r>
+      <w:r>
+        <w:t xml:space="preserve"> All access is granted to Microsoft Entra ID security groups; you</w:t>
+      </w:r>
+    </w:p>
+    <w:p>
+      <w:r>
+        <w:t xml:space="preserve">  change *membership*, never per-person permissions.</w:t>
+      </w:r>
+    </w:p>
+    <w:p>
+      <w:pPr>
+        <w:pStyle w:val="ListBullet"/>
+        <w:ind w:left="360"/>
+      </w:pPr>
+      <w:r>
+        <w:rPr>
+          <w:b/>
+        </w:rPr>
+        <w:t>Least privilege + just-in-time.</w:t>
+      </w:r>
+      <w:r>
+        <w:t xml:space="preserve"> People get the minimum role; privileged and production access is</w:t>
+      </w:r>
+    </w:p>
+    <w:p>
+      <w:r>
+        <w:t xml:space="preserve">  granted on demand through </w:t>
+      </w:r>
+      <w:r>
+        <w:rPr>
+          <w:b/>
+        </w:rPr>
+        <w:t>PIM</w:t>
+      </w:r>
+      <w:r>
+        <w:t xml:space="preserve"> (Privileged Identity Management) with approval — not standing.</w:t>
+      </w:r>
+    </w:p>
+    <w:p>
+      <w:pPr>
+        <w:pStyle w:val="ListBullet"/>
+        <w:ind w:left="360"/>
+      </w:pPr>
+      <w:r>
+        <w:rPr>
+          <w:b/>
+        </w:rPr>
+        <w:t>People and machines don't mix.</w:t>
+      </w:r>
+      <w:r>
+        <w:t xml:space="preserve"> Humans never authenticate as service principals; automation never</w:t>
+      </w:r>
+    </w:p>
+    <w:p>
+      <w:r>
+        <w:t xml:space="preserve">  runs as a personal account.</w:t>
+      </w:r>
+    </w:p>
+    <w:p>
+      <w:pPr>
+        <w:pStyle w:val="ListBullet"/>
+        <w:ind w:left="360"/>
+      </w:pPr>
+      <w:r>
+        <w:rPr>
+          <w:b/>
+        </w:rPr>
+        <w:t>Production data stays in production.</w:t>
+      </w:r>
+      <w:r>
+        <w:t xml:space="preserve"> Lower environments use masked, synthetic, or subset data.</w:t>
+      </w:r>
+    </w:p>
+    <w:p>
+      <w:pPr>
+        <w:pStyle w:val="ListBullet"/>
+        <w:ind w:left="360"/>
+      </w:pPr>
+      <w:r>
+        <w:rPr>
+          <w:b/>
+        </w:rPr>
+        <w:t>Change production only by promotion.</w:t>
+      </w:r>
+      <w:r>
+        <w:t xml:space="preserve"> No manual edits in PROD — changes flow through the</w:t>
+      </w:r>
+    </w:p>
+    <w:p>
+      <w:r>
+        <w:t xml:space="preserve">  deployment pipeline, executed by a service principal.</w:t>
+      </w:r>
+    </w:p>
+    <w:p>
+      <w:pPr>
+        <w:pStyle w:val="ListBullet"/>
+        <w:ind w:left="360"/>
+      </w:pPr>
+      <w:r>
+        <w:rPr>
+          <w:b/>
+        </w:rPr>
+        <w:t>Everything is auditable.</w:t>
+      </w:r>
+      <w:r>
+        <w:t xml:space="preserve"> Access grants, data reads, and pipeline actions are all logged.</w:t>
+      </w:r>
+    </w:p>
+    <w:p>
+      <w:pPr>
+        <w:pStyle w:val="Heading3"/>
+      </w:pPr>
+      <w:r/>
+      <w:r>
+        <w:t>Entra ID security model</w:t>
+      </w:r>
+    </w:p>
+    <w:p>
+      <w:pPr>
+        <w:jc w:val="center"/>
+      </w:pPr>
+      <w:r>
+        <w:drawing>
+          <wp:inline xmlns:a="http://schemas.openxmlformats.org/drawingml/2006/main" xmlns:pic="http://schemas.openxmlformats.org/drawingml/2006/picture">
+            <wp:extent cx="5669280" cy="1879761"/>
+            <wp:docPr id="9" name="Picture 9"/>
+            <wp:cNvGraphicFramePr>
+              <a:graphicFrameLocks noChangeAspect="1"/>
+            </wp:cNvGraphicFramePr>
+            <a:graphic>
+              <a:graphicData uri="http://schemas.openxmlformats.org/drawingml/2006/picture">
+                <pic:pic>
+                  <pic:nvPicPr>
+                    <pic:cNvPr id="0" name="image.png"/>
+                    <pic:cNvPicPr/>
+                  </pic:nvPicPr>
+                  <pic:blipFill>
+                    <a:blip r:embed="rId17"/>
+                    <a:stretch>
+                      <a:fillRect/>
+                    </a:stretch>
+                  </pic:blipFill>
+                  <pic:spPr>
+                    <a:xfrm>
+                      <a:off x="0" y="0"/>
+                      <a:ext cx="5669280" cy="1879761"/>
+                    </a:xfrm>
+                    <a:prstGeom prst="rect"/>
+                  </pic:spPr>
+                </pic:pic>
+              </a:graphicData>
+            </a:graphic>
+          </wp:inline>
+        </w:drawing>
+      </w:r>
+    </w:p>
+    <w:p>
+      <w:r>
+        <w:t xml:space="preserve">Access is assigned to </w:t>
+      </w:r>
+      <w:r>
+        <w:rPr>
+          <w:b/>
+        </w:rPr>
+        <w:t>groups</w:t>
+      </w:r>
+      <w:r>
+        <w:t>, and the groups are assigned to workspaces and capacities. Adding or</w:t>
+      </w:r>
+    </w:p>
+    <w:p>
+      <w:r>
+        <w:t>removing a person is a membership change — the permission model never changes.</w:t>
+      </w:r>
+    </w:p>
+    <w:tbl>
+      <w:tblPr>
+        <w:tblStyle w:val="LightGrid-Accent1"/>
+        <w:tblW w:type="auto" w:w="0"/>
+        <w:tblLook w:firstColumn="1" w:firstRow="1" w:lastColumn="0" w:lastRow="0" w:noHBand="0" w:noVBand="1" w:val="04A0"/>
+      </w:tblPr>
+      <w:tblGrid>
+        <w:gridCol w:w="2880"/>
+        <w:gridCol w:w="2880"/>
+        <w:gridCol w:w="2880"/>
+      </w:tblGrid>
+      <w:tr>
+        <w:tc>
+          <w:tcPr>
+            <w:tcW w:type="dxa" w:w="2880"/>
+          </w:tcPr>
+          <w:p>
+            <w:r>
+              <w:rPr>
+                <w:b/>
+                <w:sz w:val="18"/>
+              </w:rPr>
+            </w:r>
+            <w:r>
+              <w:rPr>
+                <w:b/>
+                <w:sz w:val="18"/>
+              </w:rPr>
+              <w:t>Group (naming convention)</w:t>
+            </w:r>
+          </w:p>
+        </w:tc>
+        <w:tc>
+          <w:tcPr>
+            <w:tcW w:type="dxa" w:w="2880"/>
+          </w:tcPr>
+          <w:p>
+            <w:r>
+              <w:rPr>
+                <w:b/>
+                <w:sz w:val="18"/>
+              </w:rPr>
+            </w:r>
+            <w:r>
+              <w:rPr>
+                <w:b/>
+                <w:sz w:val="18"/>
+              </w:rPr>
+              <w:t>Members</w:t>
+            </w:r>
+          </w:p>
+        </w:tc>
+        <w:tc>
+          <w:tcPr>
+            <w:tcW w:type="dxa" w:w="2880"/>
+          </w:tcPr>
+          <w:p>
+            <w:r>
+              <w:rPr>
+                <w:b/>
+                <w:sz w:val="18"/>
+              </w:rPr>
+            </w:r>
+            <w:r>
+              <w:rPr>
+                <w:b/>
+                <w:sz w:val="18"/>
+              </w:rPr>
+              <w:t>Purpose</w:t>
+            </w:r>
+          </w:p>
+        </w:tc>
+      </w:tr>
+      <w:tr>
+        <w:tc>
+          <w:tcPr>
+            <w:tcW w:type="dxa" w:w="2880"/>
+          </w:tcPr>
+          <w:p>
+            <w:r>
+              <w:rPr>
+                <w:sz w:val="18"/>
+              </w:rPr>
+            </w:r>
+            <w:r>
+              <w:rPr>
+                <w:rFonts w:ascii="Consolas" w:hAnsi="Consolas"/>
+                <w:color w:val="A31F34"/>
+                <w:sz w:val="18"/>
+              </w:rPr>
+              <w:t>BCPC-FAB-{ENV}-Engineers</w:t>
+            </w:r>
+          </w:p>
+        </w:tc>
+        <w:tc>
+          <w:tcPr>
+            <w:tcW w:type="dxa" w:w="2880"/>
+          </w:tcPr>
+          <w:p>
+            <w:r>
+              <w:rPr>
+                <w:sz w:val="18"/>
+              </w:rPr>
+            </w:r>
+            <w:r>
+              <w:rPr>
+                <w:sz w:val="18"/>
+              </w:rPr>
+              <w:t>Data engineers</w:t>
+            </w:r>
+          </w:p>
+        </w:tc>
+        <w:tc>
+          <w:tcPr>
+            <w:tcW w:type="dxa" w:w="2880"/>
+          </w:tcPr>
+          <w:p>
+            <w:r>
+              <w:rPr>
+                <w:sz w:val="18"/>
+              </w:rPr>
+            </w:r>
+            <w:r>
+              <w:rPr>
+                <w:sz w:val="18"/>
+              </w:rPr>
+              <w:t>Build access in that environment's workspaces</w:t>
+            </w:r>
+          </w:p>
+        </w:tc>
+      </w:tr>
+      <w:tr>
+        <w:tc>
+          <w:tcPr>
+            <w:tcW w:type="dxa" w:w="2880"/>
+          </w:tcPr>
+          <w:p>
+            <w:r>
+              <w:rPr>
+                <w:sz w:val="18"/>
+              </w:rPr>
+            </w:r>
+            <w:r>
+              <w:rPr>
+                <w:rFonts w:ascii="Consolas" w:hAnsi="Consolas"/>
+                <w:color w:val="A31F34"/>
+                <w:sz w:val="18"/>
+              </w:rPr>
+              <w:t>BCPC-FAB-{ENV}-ReportAuthors</w:t>
+            </w:r>
+          </w:p>
+        </w:tc>
+        <w:tc>
+          <w:tcPr>
+            <w:tcW w:type="dxa" w:w="2880"/>
+          </w:tcPr>
+          <w:p>
+            <w:r>
+              <w:rPr>
+                <w:sz w:val="18"/>
+              </w:rPr>
+            </w:r>
+            <w:r>
+              <w:rPr>
+                <w:sz w:val="18"/>
+              </w:rPr>
+              <w:t>Analysts</w:t>
+            </w:r>
+          </w:p>
+        </w:tc>
+        <w:tc>
+          <w:tcPr>
+            <w:tcW w:type="dxa" w:w="2880"/>
+          </w:tcPr>
+          <w:p>
+            <w:r>
+              <w:rPr>
+                <w:sz w:val="18"/>
+              </w:rPr>
+            </w:r>
+            <w:r>
+              <w:rPr>
+                <w:sz w:val="18"/>
+              </w:rPr>
+              <w:t>Author semantic models / reports in that environment</w:t>
+            </w:r>
+          </w:p>
+        </w:tc>
+      </w:tr>
+      <w:tr>
+        <w:tc>
+          <w:tcPr>
+            <w:tcW w:type="dxa" w:w="2880"/>
+          </w:tcPr>
+          <w:p>
+            <w:r>
+              <w:rPr>
+                <w:sz w:val="18"/>
+              </w:rPr>
+            </w:r>
+            <w:r>
+              <w:rPr>
+                <w:rFonts w:ascii="Consolas" w:hAnsi="Consolas"/>
+                <w:color w:val="A31F34"/>
+                <w:sz w:val="18"/>
+              </w:rPr>
+              <w:t>BCPC-FAB-{ENV}-Consumers</w:t>
+            </w:r>
+          </w:p>
+        </w:tc>
+        <w:tc>
+          <w:tcPr>
+            <w:tcW w:type="dxa" w:w="2880"/>
+          </w:tcPr>
+          <w:p>
+            <w:r>
+              <w:rPr>
+                <w:sz w:val="18"/>
+              </w:rPr>
+            </w:r>
+            <w:r>
+              <w:rPr>
+                <w:sz w:val="18"/>
+              </w:rPr>
+              <w:t>Business users</w:t>
+            </w:r>
+          </w:p>
+        </w:tc>
+        <w:tc>
+          <w:tcPr>
+            <w:tcW w:type="dxa" w:w="2880"/>
+          </w:tcPr>
+          <w:p>
+            <w:r>
+              <w:rPr>
+                <w:sz w:val="18"/>
+              </w:rPr>
+            </w:r>
+            <w:r>
+              <w:rPr>
+                <w:sz w:val="18"/>
+              </w:rPr>
+              <w:t>View published reports (via app)</w:t>
+            </w:r>
+          </w:p>
+        </w:tc>
+      </w:tr>
+      <w:tr>
+        <w:tc>
+          <w:tcPr>
+            <w:tcW w:type="dxa" w:w="2880"/>
+          </w:tcPr>
+          <w:p>
+            <w:r>
+              <w:rPr>
+                <w:sz w:val="18"/>
+              </w:rPr>
+            </w:r>
+            <w:r>
+              <w:rPr>
+                <w:rFonts w:ascii="Consolas" w:hAnsi="Consolas"/>
+                <w:color w:val="A31F34"/>
+                <w:sz w:val="18"/>
+              </w:rPr>
+              <w:t>BCPC-DATA-{DOMAIN}-Stewards</w:t>
+            </w:r>
+          </w:p>
+        </w:tc>
+        <w:tc>
+          <w:tcPr>
+            <w:tcW w:type="dxa" w:w="2880"/>
+          </w:tcPr>
+          <w:p>
+            <w:r>
+              <w:rPr>
+                <w:sz w:val="18"/>
+              </w:rPr>
+            </w:r>
+            <w:r>
+              <w:rPr>
+                <w:sz w:val="18"/>
+              </w:rPr>
+              <w:t>Data stewards</w:t>
+            </w:r>
+          </w:p>
+        </w:tc>
+        <w:tc>
+          <w:tcPr>
+            <w:tcW w:type="dxa" w:w="2880"/>
+          </w:tcPr>
+          <w:p>
+            <w:r>
+              <w:rPr>
+                <w:sz w:val="18"/>
+              </w:rPr>
+            </w:r>
+            <w:r>
+              <w:rPr>
+                <w:sz w:val="18"/>
+              </w:rPr>
+              <w:t>Governance for a data domain (Pensions, Employer, Member)</w:t>
+            </w:r>
+          </w:p>
+        </w:tc>
+      </w:tr>
+      <w:tr>
+        <w:tc>
+          <w:tcPr>
+            <w:tcW w:type="dxa" w:w="2880"/>
+          </w:tcPr>
+          <w:p>
+            <w:r>
+              <w:rPr>
+                <w:sz w:val="18"/>
+              </w:rPr>
+            </w:r>
+            <w:r>
+              <w:rPr>
+                <w:rFonts w:ascii="Consolas" w:hAnsi="Consolas"/>
+                <w:color w:val="A31F34"/>
+                <w:sz w:val="18"/>
+              </w:rPr>
+              <w:t>BCPC-FAB-Platform-Admins</w:t>
+            </w:r>
+          </w:p>
+        </w:tc>
+        <w:tc>
+          <w:tcPr>
+            <w:tcW w:type="dxa" w:w="2880"/>
+          </w:tcPr>
+          <w:p>
+            <w:r>
+              <w:rPr>
+                <w:sz w:val="18"/>
+              </w:rPr>
+            </w:r>
+            <w:r>
+              <w:rPr>
+                <w:sz w:val="18"/>
+              </w:rPr>
+              <w:t>Platform team</w:t>
+            </w:r>
+          </w:p>
+        </w:tc>
+        <w:tc>
+          <w:tcPr>
+            <w:tcW w:type="dxa" w:w="2880"/>
+          </w:tcPr>
+          <w:p>
+            <w:r>
+              <w:rPr>
+                <w:sz w:val="18"/>
+              </w:rPr>
+            </w:r>
+            <w:r>
+              <w:rPr>
+                <w:sz w:val="18"/>
+              </w:rPr>
+              <w:t xml:space="preserve">Tenant / capacity administration — </w:t>
+            </w:r>
+            <w:r>
+              <w:rPr>
+                <w:b/>
+                <w:sz w:val="18"/>
+              </w:rPr>
+              <w:t>PIM-enabled</w:t>
+            </w:r>
+          </w:p>
+        </w:tc>
+      </w:tr>
+      <w:tr>
+        <w:tc>
+          <w:tcPr>
+            <w:tcW w:type="dxa" w:w="2880"/>
+          </w:tcPr>
+          <w:p>
+            <w:r>
+              <w:rPr>
+                <w:sz w:val="18"/>
+              </w:rPr>
+            </w:r>
+            <w:r>
+              <w:rPr>
+                <w:rFonts w:ascii="Consolas" w:hAnsi="Consolas"/>
+                <w:color w:val="A31F34"/>
+                <w:sz w:val="18"/>
+              </w:rPr>
+              <w:t>BCPC-FAB-Auditors</w:t>
+            </w:r>
+          </w:p>
+        </w:tc>
+        <w:tc>
+          <w:tcPr>
+            <w:tcW w:type="dxa" w:w="2880"/>
+          </w:tcPr>
+          <w:p>
+            <w:r>
+              <w:rPr>
+                <w:sz w:val="18"/>
+              </w:rPr>
+            </w:r>
+            <w:r>
+              <w:rPr>
+                <w:sz w:val="18"/>
+              </w:rPr>
+              <w:t>Security / audit</w:t>
+            </w:r>
+          </w:p>
+        </w:tc>
+        <w:tc>
+          <w:tcPr>
+            <w:tcW w:type="dxa" w:w="2880"/>
+          </w:tcPr>
+          <w:p>
+            <w:r>
+              <w:rPr>
+                <w:sz w:val="18"/>
+              </w:rPr>
+            </w:r>
+            <w:r>
+              <w:rPr>
+                <w:sz w:val="18"/>
+              </w:rPr>
+              <w:t>Read + audit-log access across environments</w:t>
+            </w:r>
+          </w:p>
+        </w:tc>
+      </w:tr>
+      <w:tr>
+        <w:tc>
+          <w:tcPr>
+            <w:tcW w:type="dxa" w:w="2880"/>
+          </w:tcPr>
+          <w:p>
+            <w:r>
+              <w:rPr>
+                <w:sz w:val="18"/>
+              </w:rPr>
+            </w:r>
+            <w:r>
+              <w:rPr>
+                <w:rFonts w:ascii="Consolas" w:hAnsi="Consolas"/>
+                <w:color w:val="A31F34"/>
+                <w:sz w:val="18"/>
+              </w:rPr>
+              <w:t>BCPC-FAB-SPN-{ENV}</w:t>
+            </w:r>
+          </w:p>
+        </w:tc>
+        <w:tc>
+          <w:tcPr>
+            <w:tcW w:type="dxa" w:w="2880"/>
+          </w:tcPr>
+          <w:p>
+            <w:r>
+              <w:rPr>
+                <w:sz w:val="18"/>
+              </w:rPr>
+            </w:r>
+            <w:r>
+              <w:rPr>
+                <w:sz w:val="18"/>
+              </w:rPr>
+              <w:t>Service principals</w:t>
+            </w:r>
+          </w:p>
+        </w:tc>
+        <w:tc>
+          <w:tcPr>
+            <w:tcW w:type="dxa" w:w="2880"/>
+          </w:tcPr>
+          <w:p>
+            <w:r>
+              <w:rPr>
+                <w:sz w:val="18"/>
+              </w:rPr>
+            </w:r>
+            <w:r>
+              <w:rPr>
+                <w:sz w:val="18"/>
+              </w:rPr>
+              <w:t>Container for automation identities; scopes tenant API access</w:t>
+            </w:r>
+          </w:p>
+        </w:tc>
+      </w:tr>
+    </w:tbl>
+    <w:p/>
+    <w:p>
+      <w:r>
+        <w:t xml:space="preserve">*Supporting controls:* </w:t>
+      </w:r>
+      <w:r>
+        <w:rPr>
+          <w:b/>
+        </w:rPr>
+        <w:t>Conditional Access</w:t>
+      </w:r>
+      <w:r>
+        <w:t xml:space="preserve"> (MFA + compliant device + allowed location) on all Fabric</w:t>
+      </w:r>
+    </w:p>
+    <w:p>
+      <w:r>
+        <w:t xml:space="preserve">access; </w:t>
+      </w:r>
+      <w:r>
+        <w:rPr>
+          <w:b/>
+        </w:rPr>
+        <w:t>PIM</w:t>
+      </w:r>
+      <w:r>
+        <w:t xml:space="preserve"> for admin and production roles; </w:t>
+      </w:r>
+      <w:r>
+        <w:rPr>
+          <w:b/>
+        </w:rPr>
+        <w:t>quarterly access reviews</w:t>
+      </w:r>
+      <w:r>
+        <w:t>; and separately-held</w:t>
+      </w:r>
+    </w:p>
+    <w:p>
+      <w:r>
+        <w:rPr>
+          <w:b/>
+        </w:rPr>
+        <w:t>break-glass</w:t>
+      </w:r>
+      <w:r>
+        <w:t xml:space="preserve"> admin accounts excluded from Conditional Access for emergencies only.</w:t>
+      </w:r>
+    </w:p>
+    <w:p>
+      <w:pPr>
+        <w:pStyle w:val="Heading3"/>
+      </w:pPr>
+      <w:r/>
+      <w:r>
+        <w:t>Fabric access control — defense in depth</w:t>
+      </w:r>
+    </w:p>
+    <w:p>
+      <w:pPr>
+        <w:jc w:val="center"/>
+      </w:pPr>
+      <w:r>
+        <w:drawing>
+          <wp:inline xmlns:a="http://schemas.openxmlformats.org/drawingml/2006/main" xmlns:pic="http://schemas.openxmlformats.org/drawingml/2006/picture">
+            <wp:extent cx="5669280" cy="14419690"/>
+            <wp:docPr id="10" name="Picture 10"/>
+            <wp:cNvGraphicFramePr>
+              <a:graphicFrameLocks noChangeAspect="1"/>
+            </wp:cNvGraphicFramePr>
+            <a:graphic>
+              <a:graphicData uri="http://schemas.openxmlformats.org/drawingml/2006/picture">
+                <pic:pic>
+                  <pic:nvPicPr>
+                    <pic:cNvPr id="0" name="image.png"/>
+                    <pic:cNvPicPr/>
+                  </pic:nvPicPr>
+                  <pic:blipFill>
+                    <a:blip r:embed="rId18"/>
+                    <a:stretch>
+                      <a:fillRect/>
+                    </a:stretch>
+                  </pic:blipFill>
+                  <pic:spPr>
+                    <a:xfrm>
+                      <a:off x="0" y="0"/>
+                      <a:ext cx="5669280" cy="14419690"/>
+                    </a:xfrm>
+                    <a:prstGeom prst="rect"/>
+                  </pic:spPr>
+                </pic:pic>
+              </a:graphicData>
+            </a:graphic>
+          </wp:inline>
+        </w:drawing>
+      </w:r>
+    </w:p>
+    <w:p>
+      <w:r>
+        <w:t xml:space="preserve">Access is controlled at </w:t>
+      </w:r>
+      <w:r>
+        <w:rPr>
+          <w:b/>
+        </w:rPr>
+        <w:t>five layers</w:t>
+      </w:r>
+      <w:r>
+        <w:t>, each narrower than the last. A consumer, for example, passes</w:t>
+      </w:r>
+    </w:p>
+    <w:p>
+      <w:r>
+        <w:t xml:space="preserve">tenant policy, sits on the capacity, gets </w:t>
+      </w:r>
+      <w:r>
+        <w:rPr>
+          <w:b/>
+        </w:rPr>
+        <w:t>Viewer</w:t>
+      </w:r>
+      <w:r>
+        <w:t xml:space="preserve"> on one workspace, sees only the published report</w:t>
+      </w:r>
+    </w:p>
+    <w:p>
+      <w:r>
+        <w:t xml:space="preserve">item, and even then only the </w:t>
+      </w:r>
+      <w:r>
+        <w:rPr>
+          <w:b/>
+        </w:rPr>
+        <w:t>rows and columns</w:t>
+      </w:r>
+      <w:r>
+        <w:t xml:space="preserve"> their data-level security allows.</w:t>
+      </w:r>
+    </w:p>
+    <w:p>
+      <w:pPr>
+        <w:pStyle w:val="Heading3"/>
+      </w:pPr>
+      <w:r/>
+      <w:r>
+        <w:t>Service principals (SPNs) and managed identities</w:t>
+      </w:r>
+    </w:p>
+    <w:p>
+      <w:r>
+        <w:t xml:space="preserve">Automation — deployment, scheduled runs, and source connections — uses </w:t>
+      </w:r>
+      <w:r>
+        <w:rPr>
+          <w:b/>
+        </w:rPr>
+        <w:t>service principals</w:t>
+      </w:r>
+      <w:r>
+        <w:t xml:space="preserve"> (or</w:t>
+      </w:r>
+    </w:p>
+    <w:p>
+      <w:r>
+        <w:t>managed identities where Fabric supports them), never personal accounts. Best practice:</w:t>
+      </w:r>
+    </w:p>
+    <w:p>
+      <w:pPr>
+        <w:pStyle w:val="ListBullet"/>
+        <w:ind w:left="360"/>
+      </w:pPr>
+      <w:r>
+        <w:rPr>
+          <w:b/>
+        </w:rPr>
+        <w:t>One SPN per environment</w:t>
+      </w:r>
+      <w:r>
+        <w:t>, so a lower-environment credential can never touch production.</w:t>
+      </w:r>
+    </w:p>
+    <w:p>
+      <w:pPr>
+        <w:pStyle w:val="ListBullet"/>
+        <w:ind w:left="360"/>
+      </w:pPr>
+      <w:r>
+        <w:rPr>
+          <w:b/>
+        </w:rPr>
+        <w:t>Least privilege</w:t>
+      </w:r>
+      <w:r>
+        <w:t xml:space="preserve"> — grant the SPN only the workspace role it needs, not tenant admin.</w:t>
+      </w:r>
+    </w:p>
+    <w:p>
+      <w:pPr>
+        <w:pStyle w:val="ListBullet"/>
+        <w:ind w:left="360"/>
+      </w:pPr>
+      <w:r>
+        <w:rPr>
+          <w:b/>
+        </w:rPr>
+        <w:t>Secrets/certificates in Key Vault</w:t>
+      </w:r>
+      <w:r>
+        <w:t xml:space="preserve"> (certificate auth preferred over secrets), </w:t>
+      </w:r>
+      <w:r>
+        <w:rPr>
+          <w:b/>
+        </w:rPr>
+        <w:t>rotated</w:t>
+      </w:r>
+      <w:r>
+        <w:t xml:space="preserve"> on a</w:t>
+      </w:r>
+    </w:p>
+    <w:p>
+      <w:r>
+        <w:t xml:space="preserve">  schedule, </w:t>
+      </w:r>
+      <w:r>
+        <w:rPr>
+          <w:b/>
+        </w:rPr>
+        <w:t>never in git</w:t>
+      </w:r>
+      <w:r>
+        <w:t>.</w:t>
+      </w:r>
+    </w:p>
+    <w:p>
+      <w:pPr>
+        <w:pStyle w:val="ListBullet"/>
+        <w:ind w:left="360"/>
+      </w:pPr>
+      <w:r>
+        <w:t xml:space="preserve">Enable the tenant setting *"service principals can use Fabric APIs"* **only for the </w:t>
+      </w:r>
+      <w:r>
+        <w:rPr>
+          <w:rFonts w:ascii="Consolas" w:hAnsi="Consolas"/>
+          <w:color w:val="A31F34"/>
+        </w:rPr>
+        <w:t>BCPC-FAB-SPN-*</w:t>
+      </w:r>
+    </w:p>
+    <w:p>
+      <w:r>
+        <w:t xml:space="preserve">  group**, not the whole organization.</w:t>
+      </w:r>
+    </w:p>
+    <w:p>
+      <w:pPr>
+        <w:jc w:val="center"/>
+      </w:pPr>
+      <w:r>
+        <w:drawing>
+          <wp:inline xmlns:a="http://schemas.openxmlformats.org/drawingml/2006/main" xmlns:pic="http://schemas.openxmlformats.org/drawingml/2006/picture">
+            <wp:extent cx="5669280" cy="2746516"/>
+            <wp:docPr id="11" name="Picture 11"/>
+            <wp:cNvGraphicFramePr>
+              <a:graphicFrameLocks noChangeAspect="1"/>
+            </wp:cNvGraphicFramePr>
+            <a:graphic>
+              <a:graphicData uri="http://schemas.openxmlformats.org/drawingml/2006/picture">
+                <pic:pic>
+                  <pic:nvPicPr>
+                    <pic:cNvPr id="0" name="image.png"/>
+                    <pic:cNvPicPr/>
+                  </pic:nvPicPr>
+                  <pic:blipFill>
+                    <a:blip r:embed="rId19"/>
+                    <a:stretch>
+                      <a:fillRect/>
+                    </a:stretch>
+                  </pic:blipFill>
+                  <pic:spPr>
+                    <a:xfrm>
+                      <a:off x="0" y="0"/>
+                      <a:ext cx="5669280" cy="2746516"/>
+                    </a:xfrm>
+                    <a:prstGeom prst="rect"/>
+                  </pic:spPr>
+                </pic:pic>
+              </a:graphicData>
+            </a:graphic>
+          </wp:inline>
+        </w:drawing>
+      </w:r>
+    </w:p>
+    <w:tbl>
+      <w:tblPr>
+        <w:tblStyle w:val="LightGrid-Accent1"/>
+        <w:tblW w:type="auto" w:w="0"/>
+        <w:tblLook w:firstColumn="1" w:firstRow="1" w:lastColumn="0" w:lastRow="0" w:noHBand="0" w:noVBand="1" w:val="04A0"/>
+      </w:tblPr>
+      <w:tblGrid>
+        <w:gridCol w:w="2160"/>
+        <w:gridCol w:w="2160"/>
+        <w:gridCol w:w="2160"/>
+        <w:gridCol w:w="2160"/>
+      </w:tblGrid>
+      <w:tr>
+        <w:tc>
+          <w:tcPr>
+            <w:tcW w:type="dxa" w:w="2160"/>
+          </w:tcPr>
+          <w:p>
+            <w:r>
+              <w:rPr>
+                <w:b/>
+                <w:sz w:val="18"/>
+              </w:rPr>
+            </w:r>
+            <w:r>
+              <w:rPr>
+                <w:b/>
+                <w:sz w:val="18"/>
+              </w:rPr>
+              <w:t>Identity (per environment)</w:t>
+            </w:r>
+          </w:p>
+        </w:tc>
+        <w:tc>
+          <w:tcPr>
+            <w:tcW w:type="dxa" w:w="2160"/>
+          </w:tcPr>
+          <w:p>
+            <w:r>
+              <w:rPr>
+                <w:b/>
+                <w:sz w:val="18"/>
+              </w:rPr>
+            </w:r>
+            <w:r>
+              <w:rPr>
+                <w:b/>
+                <w:sz w:val="18"/>
+              </w:rPr>
+              <w:t>Used for</w:t>
+            </w:r>
+          </w:p>
+        </w:tc>
+        <w:tc>
+          <w:tcPr>
+            <w:tcW w:type="dxa" w:w="2160"/>
+          </w:tcPr>
+          <w:p>
+            <w:r>
+              <w:rPr>
+                <w:b/>
+                <w:sz w:val="18"/>
+              </w:rPr>
+            </w:r>
+            <w:r>
+              <w:rPr>
+                <w:b/>
+                <w:sz w:val="18"/>
+              </w:rPr>
+              <w:t>Access</w:t>
+            </w:r>
+          </w:p>
+        </w:tc>
+        <w:tc>
+          <w:tcPr>
+            <w:tcW w:type="dxa" w:w="2160"/>
+          </w:tcPr>
+          <w:p>
+            <w:r>
+              <w:rPr>
+                <w:b/>
+                <w:sz w:val="18"/>
+              </w:rPr>
+            </w:r>
+            <w:r>
+              <w:rPr>
+                <w:b/>
+                <w:sz w:val="18"/>
+              </w:rPr>
+              <w:t>Credential</w:t>
+            </w:r>
+          </w:p>
+        </w:tc>
+      </w:tr>
+      <w:tr>
+        <w:tc>
+          <w:tcPr>
+            <w:tcW w:type="dxa" w:w="2160"/>
+          </w:tcPr>
+          <w:p>
+            <w:r>
+              <w:rPr>
+                <w:sz w:val="18"/>
+              </w:rPr>
+            </w:r>
+            <w:r>
+              <w:rPr>
+                <w:b/>
+                <w:sz w:val="18"/>
+              </w:rPr>
+              <w:t>Deployment SPN</w:t>
+            </w:r>
+          </w:p>
+        </w:tc>
+        <w:tc>
+          <w:tcPr>
+            <w:tcW w:type="dxa" w:w="2160"/>
+          </w:tcPr>
+          <w:p>
+            <w:r>
+              <w:rPr>
+                <w:sz w:val="18"/>
+              </w:rPr>
+            </w:r>
+            <w:r>
+              <w:rPr>
+                <w:sz w:val="18"/>
+              </w:rPr>
+              <w:t>CI/CD — provision + promote code/config</w:t>
+            </w:r>
+          </w:p>
+        </w:tc>
+        <w:tc>
+          <w:tcPr>
+            <w:tcW w:type="dxa" w:w="2160"/>
+          </w:tcPr>
+          <w:p>
+            <w:r>
+              <w:rPr>
+                <w:sz w:val="18"/>
+              </w:rPr>
+            </w:r>
+            <w:r>
+              <w:rPr>
+                <w:sz w:val="18"/>
+              </w:rPr>
+              <w:t xml:space="preserve">Member on that env's workspaces; </w:t>
+            </w:r>
+            <w:r>
+              <w:rPr>
+                <w:b/>
+                <w:sz w:val="18"/>
+              </w:rPr>
+              <w:t>the only identity that changes PROD</w:t>
+            </w:r>
+          </w:p>
+        </w:tc>
+        <w:tc>
+          <w:tcPr>
+            <w:tcW w:type="dxa" w:w="2160"/>
+          </w:tcPr>
+          <w:p>
+            <w:r>
+              <w:rPr>
+                <w:sz w:val="18"/>
+              </w:rPr>
+            </w:r>
+            <w:r>
+              <w:rPr>
+                <w:sz w:val="18"/>
+              </w:rPr>
+              <w:t>Cert in that env's Key Vault</w:t>
+            </w:r>
+          </w:p>
+        </w:tc>
+      </w:tr>
+      <w:tr>
+        <w:tc>
+          <w:tcPr>
+            <w:tcW w:type="dxa" w:w="2160"/>
+          </w:tcPr>
+          <w:p>
+            <w:r>
+              <w:rPr>
+                <w:sz w:val="18"/>
+              </w:rPr>
+            </w:r>
+            <w:r>
+              <w:rPr>
+                <w:b/>
+                <w:sz w:val="18"/>
+              </w:rPr>
+              <w:t>Runtime SPN</w:t>
+            </w:r>
+          </w:p>
+        </w:tc>
+        <w:tc>
+          <w:tcPr>
+            <w:tcW w:type="dxa" w:w="2160"/>
+          </w:tcPr>
+          <w:p>
+            <w:r>
+              <w:rPr>
+                <w:sz w:val="18"/>
+              </w:rPr>
+            </w:r>
+            <w:r>
+              <w:rPr>
+                <w:sz w:val="18"/>
+              </w:rPr>
+              <w:t>Scheduled pipeline / notebook execution</w:t>
+            </w:r>
+          </w:p>
+        </w:tc>
+        <w:tc>
+          <w:tcPr>
+            <w:tcW w:type="dxa" w:w="2160"/>
+          </w:tcPr>
+          <w:p>
+            <w:r>
+              <w:rPr>
+                <w:sz w:val="18"/>
+              </w:rPr>
+            </w:r>
+            <w:r>
+              <w:rPr>
+                <w:sz w:val="18"/>
+              </w:rPr>
+              <w:t>Contributor on that env's workspaces</w:t>
+            </w:r>
+          </w:p>
+        </w:tc>
+        <w:tc>
+          <w:tcPr>
+            <w:tcW w:type="dxa" w:w="2160"/>
+          </w:tcPr>
+          <w:p>
+            <w:r>
+              <w:rPr>
+                <w:sz w:val="18"/>
+              </w:rPr>
+            </w:r>
+            <w:r>
+              <w:rPr>
+                <w:sz w:val="18"/>
+              </w:rPr>
+              <w:t>env Key Vault</w:t>
+            </w:r>
+          </w:p>
+        </w:tc>
+      </w:tr>
+      <w:tr>
+        <w:tc>
+          <w:tcPr>
+            <w:tcW w:type="dxa" w:w="2160"/>
+          </w:tcPr>
+          <w:p>
+            <w:r>
+              <w:rPr>
+                <w:sz w:val="18"/>
+              </w:rPr>
+            </w:r>
+            <w:r>
+              <w:rPr>
+                <w:b/>
+                <w:sz w:val="18"/>
+              </w:rPr>
+              <w:t>Gateway / connection account</w:t>
+            </w:r>
+          </w:p>
+        </w:tc>
+        <w:tc>
+          <w:tcPr>
+            <w:tcW w:type="dxa" w:w="2160"/>
+          </w:tcPr>
+          <w:p>
+            <w:r>
+              <w:rPr>
+                <w:sz w:val="18"/>
+              </w:rPr>
+            </w:r>
+            <w:r>
+              <w:rPr>
+                <w:sz w:val="18"/>
+              </w:rPr>
+              <w:t>Source connectivity via the gateway</w:t>
+            </w:r>
+          </w:p>
+        </w:tc>
+        <w:tc>
+          <w:tcPr>
+            <w:tcW w:type="dxa" w:w="2160"/>
+          </w:tcPr>
+          <w:p>
+            <w:r>
+              <w:rPr>
+                <w:sz w:val="18"/>
+              </w:rPr>
+            </w:r>
+            <w:r>
+              <w:rPr>
+                <w:b/>
+                <w:sz w:val="18"/>
+              </w:rPr>
+              <w:t>Read-only</w:t>
+            </w:r>
+            <w:r>
+              <w:rPr>
+                <w:sz w:val="18"/>
+              </w:rPr>
+              <w:t xml:space="preserve"> on the source database (least privilege)</w:t>
+            </w:r>
+          </w:p>
+        </w:tc>
+        <w:tc>
+          <w:tcPr>
+            <w:tcW w:type="dxa" w:w="2160"/>
+          </w:tcPr>
+          <w:p>
+            <w:r>
+              <w:rPr>
+                <w:sz w:val="18"/>
+              </w:rPr>
+            </w:r>
+            <w:r>
+              <w:rPr>
+                <w:sz w:val="18"/>
+              </w:rPr>
+              <w:t>env Key Vault</w:t>
+            </w:r>
+          </w:p>
+        </w:tc>
+      </w:tr>
+      <w:tr>
+        <w:tc>
+          <w:tcPr>
+            <w:tcW w:type="dxa" w:w="2160"/>
+          </w:tcPr>
+          <w:p>
+            <w:r>
+              <w:rPr>
+                <w:sz w:val="18"/>
+              </w:rPr>
+            </w:r>
+            <w:r>
+              <w:rPr>
+                <w:b/>
+                <w:sz w:val="18"/>
+              </w:rPr>
+              <w:t>Managed identity</w:t>
+            </w:r>
+            <w:r>
+              <w:rPr>
+                <w:sz w:val="18"/>
+              </w:rPr>
+              <w:t xml:space="preserve"> *(preferred where supported)*</w:t>
+            </w:r>
+          </w:p>
+        </w:tc>
+        <w:tc>
+          <w:tcPr>
+            <w:tcW w:type="dxa" w:w="2160"/>
+          </w:tcPr>
+          <w:p>
+            <w:r>
+              <w:rPr>
+                <w:sz w:val="18"/>
+              </w:rPr>
+            </w:r>
+            <w:r>
+              <w:rPr>
+                <w:sz w:val="18"/>
+              </w:rPr>
+              <w:t>Fabric-to-Azure resource access</w:t>
+            </w:r>
+          </w:p>
+        </w:tc>
+        <w:tc>
+          <w:tcPr>
+            <w:tcW w:type="dxa" w:w="2160"/>
+          </w:tcPr>
+          <w:p>
+            <w:r>
+              <w:rPr>
+                <w:sz w:val="18"/>
+              </w:rPr>
+            </w:r>
+            <w:r>
+              <w:rPr>
+                <w:sz w:val="18"/>
+              </w:rPr>
+              <w:t>Scoped to the specific resource</w:t>
+            </w:r>
+          </w:p>
+        </w:tc>
+        <w:tc>
+          <w:tcPr>
+            <w:tcW w:type="dxa" w:w="2160"/>
+          </w:tcPr>
+          <w:p>
+            <w:r>
+              <w:rPr>
+                <w:sz w:val="18"/>
+              </w:rPr>
+            </w:r>
+            <w:r>
+              <w:rPr>
+                <w:sz w:val="18"/>
+              </w:rPr>
+              <w:t>none to manage</w:t>
+            </w:r>
+          </w:p>
+        </w:tc>
+      </w:tr>
+    </w:tbl>
+    <w:p/>
+    <w:p>
+      <w:r>
+        <w:t>*Our control plane already follows this:* it authenticates as a service principal, reads connection</w:t>
+      </w:r>
+    </w:p>
+    <w:p>
+      <w:r>
+        <w:t>secrets from Key Vault at run time, and keeps no secrets (or host names) in git.</w:t>
+      </w:r>
+    </w:p>
+    <w:p>
+      <w:pPr>
+        <w:pStyle w:val="Heading3"/>
+      </w:pPr>
+      <w:r/>
+      <w:r>
+        <w:t>Environment segregation — lower vs production</w:t>
+      </w:r>
+    </w:p>
+    <w:p>
+      <w:pPr>
+        <w:jc w:val="center"/>
+      </w:pPr>
+      <w:r>
+        <w:drawing>
+          <wp:inline xmlns:a="http://schemas.openxmlformats.org/drawingml/2006/main" xmlns:pic="http://schemas.openxmlformats.org/drawingml/2006/picture">
+            <wp:extent cx="5669280" cy="841019"/>
+            <wp:docPr id="12" name="Picture 12"/>
+            <wp:cNvGraphicFramePr>
+              <a:graphicFrameLocks noChangeAspect="1"/>
+            </wp:cNvGraphicFramePr>
+            <a:graphic>
+              <a:graphicData uri="http://schemas.openxmlformats.org/drawingml/2006/picture">
+                <pic:pic>
+                  <pic:nvPicPr>
+                    <pic:cNvPr id="0" name="image.png"/>
+                    <pic:cNvPicPr/>
+                  </pic:nvPicPr>
+                  <pic:blipFill>
+                    <a:blip r:embed="rId20"/>
+                    <a:stretch>
+                      <a:fillRect/>
+                    </a:stretch>
+                  </pic:blipFill>
+                  <pic:spPr>
+                    <a:xfrm>
+                      <a:off x="0" y="0"/>
+                      <a:ext cx="5669280" cy="841019"/>
+                    </a:xfrm>
+                    <a:prstGeom prst="rect"/>
+                  </pic:spPr>
+                </pic:pic>
+              </a:graphicData>
+            </a:graphic>
+          </wp:inline>
+        </w:drawing>
+      </w:r>
+    </w:p>
+    <w:p>
+      <w:r>
+        <w:t xml:space="preserve">Every environment is a hard boundary with its </w:t>
+      </w:r>
+      <w:r>
+        <w:rPr>
+          <w:b/>
+        </w:rPr>
+        <w:t>own</w:t>
+      </w:r>
+      <w:r>
+        <w:t xml:space="preserve"> workspaces, service principals, Key Vault, and</w:t>
+      </w:r>
+    </w:p>
+    <w:p>
+      <w:r>
+        <w:t xml:space="preserve">source connections. </w:t>
+      </w:r>
+      <w:r>
+        <w:rPr>
+          <w:b/>
+        </w:rPr>
+        <w:t>Production data never flows downward</w:t>
+      </w:r>
+      <w:r>
+        <w:t xml:space="preserve"> — lower environments run on masked or</w:t>
+      </w:r>
+    </w:p>
+    <w:p>
+      <w:r>
+        <w:t xml:space="preserve">synthetic data. Promotion moves </w:t>
+      </w:r>
+      <w:r>
+        <w:rPr>
+          <w:b/>
+        </w:rPr>
+        <w:t>code and configuration only</w:t>
+      </w:r>
+      <w:r>
+        <w:t>, through the deployment pipeline.</w:t>
+      </w:r>
+    </w:p>
+    <w:tbl>
+      <w:tblPr>
+        <w:tblStyle w:val="LightGrid-Accent1"/>
+        <w:tblW w:type="auto" w:w="0"/>
+        <w:tblLook w:firstColumn="1" w:firstRow="1" w:lastColumn="0" w:lastRow="0" w:noHBand="0" w:noVBand="1" w:val="04A0"/>
+      </w:tblPr>
+      <w:tblGrid>
+        <w:gridCol w:w="2160"/>
+        <w:gridCol w:w="2160"/>
+        <w:gridCol w:w="2160"/>
+        <w:gridCol w:w="2160"/>
+      </w:tblGrid>
+      <w:tr>
+        <w:tc>
+          <w:tcPr>
+            <w:tcW w:type="dxa" w:w="2160"/>
+          </w:tcPr>
+          <w:p>
+            <w:r>
+              <w:rPr>
+                <w:b/>
+                <w:sz w:val="18"/>
+              </w:rPr>
+            </w:r>
+            <w:r>
+              <w:rPr>
+                <w:b/>
+                <w:sz w:val="18"/>
+              </w:rPr>
+              <w:t>Isolated per environment</w:t>
+            </w:r>
+          </w:p>
+        </w:tc>
+        <w:tc>
+          <w:tcPr>
+            <w:tcW w:type="dxa" w:w="2160"/>
+          </w:tcPr>
+          <w:p>
+            <w:r>
+              <w:rPr>
+                <w:b/>
+                <w:sz w:val="18"/>
+              </w:rPr>
+            </w:r>
+            <w:r>
+              <w:rPr>
+                <w:b/>
+                <w:sz w:val="18"/>
+              </w:rPr>
+              <w:t>DEV</w:t>
+            </w:r>
+          </w:p>
+        </w:tc>
+        <w:tc>
+          <w:tcPr>
+            <w:tcW w:type="dxa" w:w="2160"/>
+          </w:tcPr>
+          <w:p>
+            <w:r>
+              <w:rPr>
+                <w:b/>
+                <w:sz w:val="18"/>
+              </w:rPr>
+            </w:r>
+            <w:r>
+              <w:rPr>
+                <w:b/>
+                <w:sz w:val="18"/>
+              </w:rPr>
+              <w:t>UAT</w:t>
+            </w:r>
+          </w:p>
+        </w:tc>
+        <w:tc>
+          <w:tcPr>
+            <w:tcW w:type="dxa" w:w="2160"/>
+          </w:tcPr>
+          <w:p>
+            <w:r>
+              <w:rPr>
+                <w:b/>
+                <w:sz w:val="18"/>
+              </w:rPr>
+            </w:r>
+            <w:r>
+              <w:rPr>
+                <w:b/>
+                <w:sz w:val="18"/>
+              </w:rPr>
+              <w:t>PROD</w:t>
+            </w:r>
+          </w:p>
+        </w:tc>
+      </w:tr>
+      <w:tr>
+        <w:tc>
+          <w:tcPr>
+            <w:tcW w:type="dxa" w:w="2160"/>
+          </w:tcPr>
+          <w:p>
+            <w:r>
+              <w:rPr>
+                <w:sz w:val="18"/>
+              </w:rPr>
+            </w:r>
+            <w:r>
+              <w:rPr>
+                <w:sz w:val="18"/>
+              </w:rPr>
+              <w:t>Workspaces</w:t>
+            </w:r>
+          </w:p>
+        </w:tc>
+        <w:tc>
+          <w:tcPr>
+            <w:tcW w:type="dxa" w:w="2160"/>
+          </w:tcPr>
+          <w:p>
+            <w:r>
+              <w:rPr>
+                <w:sz w:val="18"/>
+              </w:rPr>
+            </w:r>
+            <w:r>
+              <w:rPr>
+                <w:sz w:val="18"/>
+              </w:rPr>
+              <w:t>separate</w:t>
+            </w:r>
+          </w:p>
+        </w:tc>
+        <w:tc>
+          <w:tcPr>
+            <w:tcW w:type="dxa" w:w="2160"/>
+          </w:tcPr>
+          <w:p>
+            <w:r>
+              <w:rPr>
+                <w:sz w:val="18"/>
+              </w:rPr>
+            </w:r>
+            <w:r>
+              <w:rPr>
+                <w:sz w:val="18"/>
+              </w:rPr>
+              <w:t>separate</w:t>
+            </w:r>
+          </w:p>
+        </w:tc>
+        <w:tc>
+          <w:tcPr>
+            <w:tcW w:type="dxa" w:w="2160"/>
+          </w:tcPr>
+          <w:p>
+            <w:r>
+              <w:rPr>
+                <w:sz w:val="18"/>
+              </w:rPr>
+            </w:r>
+            <w:r>
+              <w:rPr>
+                <w:sz w:val="18"/>
+              </w:rPr>
+              <w:t>separate</w:t>
+            </w:r>
+          </w:p>
+        </w:tc>
+      </w:tr>
+      <w:tr>
+        <w:tc>
+          <w:tcPr>
+            <w:tcW w:type="dxa" w:w="2160"/>
+          </w:tcPr>
+          <w:p>
+            <w:r>
+              <w:rPr>
+                <w:sz w:val="18"/>
+              </w:rPr>
+            </w:r>
+            <w:r>
+              <w:rPr>
+                <w:sz w:val="18"/>
+              </w:rPr>
+              <w:t>Capacity</w:t>
+            </w:r>
+          </w:p>
+        </w:tc>
+        <w:tc>
+          <w:tcPr>
+            <w:tcW w:type="dxa" w:w="2160"/>
+          </w:tcPr>
+          <w:p>
+            <w:r>
+              <w:rPr>
+                <w:sz w:val="18"/>
+              </w:rPr>
+            </w:r>
+            <w:r>
+              <w:rPr>
+                <w:sz w:val="18"/>
+              </w:rPr>
+              <w:t>shared acceptable</w:t>
+            </w:r>
+          </w:p>
+        </w:tc>
+        <w:tc>
+          <w:tcPr>
+            <w:tcW w:type="dxa" w:w="2160"/>
+          </w:tcPr>
+          <w:p>
+            <w:r>
+              <w:rPr>
+                <w:sz w:val="18"/>
+              </w:rPr>
+            </w:r>
+            <w:r>
+              <w:rPr>
+                <w:sz w:val="18"/>
+              </w:rPr>
+              <w:t>shared acceptable</w:t>
+            </w:r>
+          </w:p>
+        </w:tc>
+        <w:tc>
+          <w:tcPr>
+            <w:tcW w:type="dxa" w:w="2160"/>
+          </w:tcPr>
+          <w:p>
+            <w:r>
+              <w:rPr>
+                <w:sz w:val="18"/>
+              </w:rPr>
+            </w:r>
+            <w:r>
+              <w:rPr>
+                <w:b/>
+                <w:sz w:val="18"/>
+              </w:rPr>
+              <w:t>dedicated (recommended)</w:t>
+            </w:r>
+          </w:p>
+        </w:tc>
+      </w:tr>
+      <w:tr>
+        <w:tc>
+          <w:tcPr>
+            <w:tcW w:type="dxa" w:w="2160"/>
+          </w:tcPr>
+          <w:p>
+            <w:r>
+              <w:rPr>
+                <w:sz w:val="18"/>
+              </w:rPr>
+            </w:r>
+            <w:r>
+              <w:rPr>
+                <w:sz w:val="18"/>
+              </w:rPr>
+              <w:t>Entra groups</w:t>
+            </w:r>
+          </w:p>
+        </w:tc>
+        <w:tc>
+          <w:tcPr>
+            <w:tcW w:type="dxa" w:w="2160"/>
+          </w:tcPr>
+          <w:p>
+            <w:r>
+              <w:rPr>
+                <w:sz w:val="18"/>
+              </w:rPr>
+            </w:r>
+            <w:r>
+              <w:rPr>
+                <w:sz w:val="18"/>
+              </w:rPr>
+              <w:t>own</w:t>
+            </w:r>
+          </w:p>
+        </w:tc>
+        <w:tc>
+          <w:tcPr>
+            <w:tcW w:type="dxa" w:w="2160"/>
+          </w:tcPr>
+          <w:p>
+            <w:r>
+              <w:rPr>
+                <w:sz w:val="18"/>
+              </w:rPr>
+            </w:r>
+            <w:r>
+              <w:rPr>
+                <w:sz w:val="18"/>
+              </w:rPr>
+              <w:t>own</w:t>
+            </w:r>
+          </w:p>
+        </w:tc>
+        <w:tc>
+          <w:tcPr>
+            <w:tcW w:type="dxa" w:w="2160"/>
+          </w:tcPr>
+          <w:p>
+            <w:r>
+              <w:rPr>
+                <w:sz w:val="18"/>
+              </w:rPr>
+            </w:r>
+            <w:r>
+              <w:rPr>
+                <w:sz w:val="18"/>
+              </w:rPr>
+              <w:t>own</w:t>
+            </w:r>
+          </w:p>
+        </w:tc>
+      </w:tr>
+      <w:tr>
+        <w:tc>
+          <w:tcPr>
+            <w:tcW w:type="dxa" w:w="2160"/>
+          </w:tcPr>
+          <w:p>
+            <w:r>
+              <w:rPr>
+                <w:sz w:val="18"/>
+              </w:rPr>
+            </w:r>
+            <w:r>
+              <w:rPr>
+                <w:sz w:val="18"/>
+              </w:rPr>
+              <w:t>Service principals</w:t>
+            </w:r>
+          </w:p>
+        </w:tc>
+        <w:tc>
+          <w:tcPr>
+            <w:tcW w:type="dxa" w:w="2160"/>
+          </w:tcPr>
+          <w:p>
+            <w:r>
+              <w:rPr>
+                <w:sz w:val="18"/>
+              </w:rPr>
+            </w:r>
+            <w:r>
+              <w:rPr>
+                <w:sz w:val="18"/>
+              </w:rPr>
+              <w:t>own</w:t>
+            </w:r>
+          </w:p>
+        </w:tc>
+        <w:tc>
+          <w:tcPr>
+            <w:tcW w:type="dxa" w:w="2160"/>
+          </w:tcPr>
+          <w:p>
+            <w:r>
+              <w:rPr>
+                <w:sz w:val="18"/>
+              </w:rPr>
+            </w:r>
+            <w:r>
+              <w:rPr>
+                <w:sz w:val="18"/>
+              </w:rPr>
+              <w:t>own</w:t>
+            </w:r>
+          </w:p>
+        </w:tc>
+        <w:tc>
+          <w:tcPr>
+            <w:tcW w:type="dxa" w:w="2160"/>
+          </w:tcPr>
+          <w:p>
+            <w:r>
+              <w:rPr>
+                <w:sz w:val="18"/>
+              </w:rPr>
+            </w:r>
+            <w:r>
+              <w:rPr>
+                <w:sz w:val="18"/>
+              </w:rPr>
+              <w:t>own</w:t>
+            </w:r>
+          </w:p>
+        </w:tc>
+      </w:tr>
+      <w:tr>
+        <w:tc>
+          <w:tcPr>
+            <w:tcW w:type="dxa" w:w="2160"/>
+          </w:tcPr>
+          <w:p>
+            <w:r>
+              <w:rPr>
+                <w:sz w:val="18"/>
+              </w:rPr>
+            </w:r>
+            <w:r>
+              <w:rPr>
+                <w:sz w:val="18"/>
+              </w:rPr>
+              <w:t>Key Vault (secrets)</w:t>
+            </w:r>
+          </w:p>
+        </w:tc>
+        <w:tc>
+          <w:tcPr>
+            <w:tcW w:type="dxa" w:w="2160"/>
+          </w:tcPr>
+          <w:p>
+            <w:r>
+              <w:rPr>
+                <w:sz w:val="18"/>
+              </w:rPr>
+            </w:r>
+            <w:r>
+              <w:rPr>
+                <w:sz w:val="18"/>
+              </w:rPr>
+              <w:t>own</w:t>
+            </w:r>
+          </w:p>
+        </w:tc>
+        <w:tc>
+          <w:tcPr>
+            <w:tcW w:type="dxa" w:w="2160"/>
+          </w:tcPr>
+          <w:p>
+            <w:r>
+              <w:rPr>
+                <w:sz w:val="18"/>
+              </w:rPr>
+            </w:r>
+            <w:r>
+              <w:rPr>
+                <w:sz w:val="18"/>
+              </w:rPr>
+              <w:t>own</w:t>
+            </w:r>
+          </w:p>
+        </w:tc>
+        <w:tc>
+          <w:tcPr>
+            <w:tcW w:type="dxa" w:w="2160"/>
+          </w:tcPr>
+          <w:p>
+            <w:r>
+              <w:rPr>
+                <w:sz w:val="18"/>
+              </w:rPr>
+            </w:r>
+            <w:r>
+              <w:rPr>
+                <w:sz w:val="18"/>
+              </w:rPr>
+              <w:t xml:space="preserve">own — </w:t>
+            </w:r>
+            <w:r>
+              <w:rPr>
+                <w:b/>
+                <w:sz w:val="18"/>
+              </w:rPr>
+              <w:t>prod credentials live only here</w:t>
+            </w:r>
+          </w:p>
+        </w:tc>
+      </w:tr>
+      <w:tr>
+        <w:tc>
+          <w:tcPr>
+            <w:tcW w:type="dxa" w:w="2160"/>
+          </w:tcPr>
+          <w:p>
+            <w:r>
+              <w:rPr>
+                <w:sz w:val="18"/>
+              </w:rPr>
+            </w:r>
+            <w:r>
+              <w:rPr>
+                <w:sz w:val="18"/>
+              </w:rPr>
+              <w:t>Source connection</w:t>
+            </w:r>
+          </w:p>
+        </w:tc>
+        <w:tc>
+          <w:tcPr>
+            <w:tcW w:type="dxa" w:w="2160"/>
+          </w:tcPr>
+          <w:p>
+            <w:r>
+              <w:rPr>
+                <w:sz w:val="18"/>
+              </w:rPr>
+            </w:r>
+            <w:r>
+              <w:rPr>
+                <w:sz w:val="18"/>
+              </w:rPr>
+              <w:t>DEV source</w:t>
+            </w:r>
+          </w:p>
+        </w:tc>
+        <w:tc>
+          <w:tcPr>
+            <w:tcW w:type="dxa" w:w="2160"/>
+          </w:tcPr>
+          <w:p>
+            <w:r>
+              <w:rPr>
+                <w:sz w:val="18"/>
+              </w:rPr>
+            </w:r>
+            <w:r>
+              <w:rPr>
+                <w:sz w:val="18"/>
+              </w:rPr>
+              <w:t>UAT source</w:t>
+            </w:r>
+          </w:p>
+        </w:tc>
+        <w:tc>
+          <w:tcPr>
+            <w:tcW w:type="dxa" w:w="2160"/>
+          </w:tcPr>
+          <w:p>
+            <w:r>
+              <w:rPr>
+                <w:sz w:val="18"/>
+              </w:rPr>
+            </w:r>
+            <w:r>
+              <w:rPr>
+                <w:sz w:val="18"/>
+              </w:rPr>
+              <w:t>PROD source</w:t>
+            </w:r>
+          </w:p>
+        </w:tc>
+      </w:tr>
+      <w:tr>
+        <w:tc>
+          <w:tcPr>
+            <w:tcW w:type="dxa" w:w="2160"/>
+          </w:tcPr>
+          <w:p>
+            <w:r>
+              <w:rPr>
+                <w:sz w:val="18"/>
+              </w:rPr>
+            </w:r>
+            <w:r>
+              <w:rPr>
+                <w:sz w:val="18"/>
+              </w:rPr>
+              <w:t>Data</w:t>
+            </w:r>
+          </w:p>
+        </w:tc>
+        <w:tc>
+          <w:tcPr>
+            <w:tcW w:type="dxa" w:w="2160"/>
+          </w:tcPr>
+          <w:p>
+            <w:r>
+              <w:rPr>
+                <w:sz w:val="18"/>
+              </w:rPr>
+            </w:r>
+            <w:r>
+              <w:rPr>
+                <w:sz w:val="18"/>
+              </w:rPr>
+              <w:t>masked / synthetic</w:t>
+            </w:r>
+          </w:p>
+        </w:tc>
+        <w:tc>
+          <w:tcPr>
+            <w:tcW w:type="dxa" w:w="2160"/>
+          </w:tcPr>
+          <w:p>
+            <w:r>
+              <w:rPr>
+                <w:sz w:val="18"/>
+              </w:rPr>
+            </w:r>
+            <w:r>
+              <w:rPr>
+                <w:sz w:val="18"/>
+              </w:rPr>
+              <w:t>masked / representative</w:t>
+            </w:r>
+          </w:p>
+        </w:tc>
+        <w:tc>
+          <w:tcPr>
+            <w:tcW w:type="dxa" w:w="2160"/>
+          </w:tcPr>
+          <w:p>
+            <w:r>
+              <w:rPr>
+                <w:sz w:val="18"/>
+              </w:rPr>
+            </w:r>
+            <w:r>
+              <w:rPr>
+                <w:sz w:val="18"/>
+              </w:rPr>
+              <w:t>real (PII governed)</w:t>
+            </w:r>
+          </w:p>
+        </w:tc>
+      </w:tr>
+      <w:tr>
+        <w:tc>
+          <w:tcPr>
+            <w:tcW w:type="dxa" w:w="2160"/>
+          </w:tcPr>
+          <w:p>
+            <w:r>
+              <w:rPr>
+                <w:sz w:val="18"/>
+              </w:rPr>
+            </w:r>
+            <w:r>
+              <w:rPr>
+                <w:sz w:val="18"/>
+              </w:rPr>
+              <w:t>Human change access</w:t>
+            </w:r>
+          </w:p>
+        </w:tc>
+        <w:tc>
+          <w:tcPr>
+            <w:tcW w:type="dxa" w:w="2160"/>
+          </w:tcPr>
+          <w:p>
+            <w:r>
+              <w:rPr>
+                <w:sz w:val="18"/>
+              </w:rPr>
+            </w:r>
+            <w:r>
+              <w:rPr>
+                <w:sz w:val="18"/>
+              </w:rPr>
+              <w:t>build freely</w:t>
+            </w:r>
+          </w:p>
+        </w:tc>
+        <w:tc>
+          <w:tcPr>
+            <w:tcW w:type="dxa" w:w="2160"/>
+          </w:tcPr>
+          <w:p>
+            <w:r>
+              <w:rPr>
+                <w:sz w:val="18"/>
+              </w:rPr>
+            </w:r>
+            <w:r>
+              <w:rPr>
+                <w:sz w:val="18"/>
+              </w:rPr>
+              <w:t>limited</w:t>
+            </w:r>
+          </w:p>
+        </w:tc>
+        <w:tc>
+          <w:tcPr>
+            <w:tcW w:type="dxa" w:w="2160"/>
+          </w:tcPr>
+          <w:p>
+            <w:r>
+              <w:rPr>
+                <w:sz w:val="18"/>
+              </w:rPr>
+            </w:r>
+            <w:r>
+              <w:rPr>
+                <w:b/>
+                <w:sz w:val="18"/>
+              </w:rPr>
+              <w:t>none standing — promotion only</w:t>
+            </w:r>
+          </w:p>
+        </w:tc>
+      </w:tr>
+    </w:tbl>
+    <w:p/>
+    <w:p>
+      <w:pPr>
+        <w:pStyle w:val="Heading3"/>
+      </w:pPr>
+      <w:r/>
+      <w:r>
+        <w:t>Who gets what — access matrix</w:t>
+      </w:r>
+    </w:p>
+    <w:p>
+      <w:r>
+        <w:t>*The core of an access-control review: which persona gets which level in which environment. Adjust with</w:t>
+      </w:r>
+    </w:p>
+    <w:p>
+      <w:r>
+        <w:t>BCPC's security team, but the shape — broad in DEV, tight in PROD, promotion-only for changes — should hold.*</w:t>
+      </w:r>
+    </w:p>
+    <w:tbl>
+      <w:tblPr>
+        <w:tblStyle w:val="LightGrid-Accent1"/>
+        <w:tblW w:type="auto" w:w="0"/>
+        <w:tblLook w:firstColumn="1" w:firstRow="1" w:lastColumn="0" w:lastRow="0" w:noHBand="0" w:noVBand="1" w:val="04A0"/>
+      </w:tblPr>
+      <w:tblGrid>
+        <w:gridCol w:w="2160"/>
+        <w:gridCol w:w="2160"/>
+        <w:gridCol w:w="2160"/>
+        <w:gridCol w:w="2160"/>
+      </w:tblGrid>
+      <w:tr>
+        <w:tc>
+          <w:tcPr>
+            <w:tcW w:type="dxa" w:w="2160"/>
+          </w:tcPr>
+          <w:p>
+            <w:r>
+              <w:rPr>
+                <w:b/>
+                <w:sz w:val="18"/>
+              </w:rPr>
+            </w:r>
+            <w:r>
+              <w:rPr>
+                <w:b/>
+                <w:sz w:val="18"/>
+              </w:rPr>
+              <w:t>Persona / identity</w:t>
+            </w:r>
+          </w:p>
+        </w:tc>
+        <w:tc>
+          <w:tcPr>
+            <w:tcW w:type="dxa" w:w="2160"/>
+          </w:tcPr>
+          <w:p>
+            <w:r>
+              <w:rPr>
+                <w:b/>
+                <w:sz w:val="18"/>
+              </w:rPr>
+            </w:r>
+            <w:r>
+              <w:rPr>
+                <w:b/>
+                <w:sz w:val="18"/>
+              </w:rPr>
+              <w:t>DEV</w:t>
+            </w:r>
+          </w:p>
+        </w:tc>
+        <w:tc>
+          <w:tcPr>
+            <w:tcW w:type="dxa" w:w="2160"/>
+          </w:tcPr>
+          <w:p>
+            <w:r>
+              <w:rPr>
+                <w:b/>
+                <w:sz w:val="18"/>
+              </w:rPr>
+            </w:r>
+            <w:r>
+              <w:rPr>
+                <w:b/>
+                <w:sz w:val="18"/>
+              </w:rPr>
+              <w:t>UAT</w:t>
+            </w:r>
+          </w:p>
+        </w:tc>
+        <w:tc>
+          <w:tcPr>
+            <w:tcW w:type="dxa" w:w="2160"/>
+          </w:tcPr>
+          <w:p>
+            <w:r>
+              <w:rPr>
+                <w:b/>
+                <w:sz w:val="18"/>
+              </w:rPr>
+            </w:r>
+            <w:r>
+              <w:rPr>
+                <w:b/>
+                <w:sz w:val="18"/>
+              </w:rPr>
+              <w:t>PROD</w:t>
+            </w:r>
+          </w:p>
+        </w:tc>
+      </w:tr>
+      <w:tr>
+        <w:tc>
+          <w:tcPr>
+            <w:tcW w:type="dxa" w:w="2160"/>
+          </w:tcPr>
+          <w:p>
+            <w:r>
+              <w:rPr>
+                <w:sz w:val="18"/>
+              </w:rPr>
+            </w:r>
+            <w:r>
+              <w:rPr>
+                <w:b/>
+                <w:sz w:val="18"/>
+              </w:rPr>
+              <w:t>Platform / Fabric Admin</w:t>
+            </w:r>
+          </w:p>
+        </w:tc>
+        <w:tc>
+          <w:tcPr>
+            <w:tcW w:type="dxa" w:w="2160"/>
+          </w:tcPr>
+          <w:p>
+            <w:r>
+              <w:rPr>
+                <w:sz w:val="18"/>
+              </w:rPr>
+            </w:r>
+            <w:r>
+              <w:rPr>
+                <w:sz w:val="18"/>
+              </w:rPr>
+              <w:t>Admin (PIM)</w:t>
+            </w:r>
+          </w:p>
+        </w:tc>
+        <w:tc>
+          <w:tcPr>
+            <w:tcW w:type="dxa" w:w="2160"/>
+          </w:tcPr>
+          <w:p>
+            <w:r>
+              <w:rPr>
+                <w:sz w:val="18"/>
+              </w:rPr>
+            </w:r>
+            <w:r>
+              <w:rPr>
+                <w:sz w:val="18"/>
+              </w:rPr>
+              <w:t>Admin (PIM)</w:t>
+            </w:r>
+          </w:p>
+        </w:tc>
+        <w:tc>
+          <w:tcPr>
+            <w:tcW w:type="dxa" w:w="2160"/>
+          </w:tcPr>
+          <w:p>
+            <w:r>
+              <w:rPr>
+                <w:sz w:val="18"/>
+              </w:rPr>
+            </w:r>
+            <w:r>
+              <w:rPr>
+                <w:sz w:val="18"/>
+              </w:rPr>
+              <w:t xml:space="preserve">Admin — </w:t>
+            </w:r>
+            <w:r>
+              <w:rPr>
+                <w:b/>
+                <w:sz w:val="18"/>
+              </w:rPr>
+              <w:t>PIM just-in-time + approval</w:t>
+            </w:r>
+            <w:r>
+              <w:rPr>
+                <w:sz w:val="18"/>
+              </w:rPr>
+              <w:t>; break-glass held separately</w:t>
+            </w:r>
+          </w:p>
+        </w:tc>
+      </w:tr>
+      <w:tr>
+        <w:tc>
+          <w:tcPr>
+            <w:tcW w:type="dxa" w:w="2160"/>
+          </w:tcPr>
+          <w:p>
+            <w:r>
+              <w:rPr>
+                <w:sz w:val="18"/>
+              </w:rPr>
+            </w:r>
+            <w:r>
+              <w:rPr>
+                <w:b/>
+                <w:sz w:val="18"/>
+              </w:rPr>
+              <w:t>Data Engineer / Developer</w:t>
+            </w:r>
+          </w:p>
+        </w:tc>
+        <w:tc>
+          <w:tcPr>
+            <w:tcW w:type="dxa" w:w="2160"/>
+          </w:tcPr>
+          <w:p>
+            <w:r>
+              <w:rPr>
+                <w:sz w:val="18"/>
+              </w:rPr>
+            </w:r>
+            <w:r>
+              <w:rPr>
+                <w:sz w:val="18"/>
+              </w:rPr>
+              <w:t>Contributor / Member (build)</w:t>
+            </w:r>
+          </w:p>
+        </w:tc>
+        <w:tc>
+          <w:tcPr>
+            <w:tcW w:type="dxa" w:w="2160"/>
+          </w:tcPr>
+          <w:p>
+            <w:r>
+              <w:rPr>
+                <w:sz w:val="18"/>
+              </w:rPr>
+            </w:r>
+            <w:r>
+              <w:rPr>
+                <w:sz w:val="18"/>
+              </w:rPr>
+              <w:t>Viewer, or Contributor for fixes</w:t>
+            </w:r>
+          </w:p>
+        </w:tc>
+        <w:tc>
+          <w:tcPr>
+            <w:tcW w:type="dxa" w:w="2160"/>
+          </w:tcPr>
+          <w:p>
+            <w:r>
+              <w:rPr>
+                <w:sz w:val="18"/>
+              </w:rPr>
+            </w:r>
+            <w:r>
+              <w:rPr>
+                <w:b/>
+                <w:sz w:val="18"/>
+              </w:rPr>
+              <w:t>No standing access</w:t>
+            </w:r>
+            <w:r>
+              <w:rPr>
+                <w:sz w:val="18"/>
+              </w:rPr>
+              <w:t xml:space="preserve"> — changes via pipeline only</w:t>
+            </w:r>
+          </w:p>
+        </w:tc>
+      </w:tr>
+      <w:tr>
+        <w:tc>
+          <w:tcPr>
+            <w:tcW w:type="dxa" w:w="2160"/>
+          </w:tcPr>
+          <w:p>
+            <w:r>
+              <w:rPr>
+                <w:sz w:val="18"/>
+              </w:rPr>
+            </w:r>
+            <w:r>
+              <w:rPr>
+                <w:b/>
+                <w:sz w:val="18"/>
+              </w:rPr>
+              <w:t>Data Steward</w:t>
+            </w:r>
+          </w:p>
+        </w:tc>
+        <w:tc>
+          <w:tcPr>
+            <w:tcW w:type="dxa" w:w="2160"/>
+          </w:tcPr>
+          <w:p>
+            <w:r>
+              <w:rPr>
+                <w:sz w:val="18"/>
+              </w:rPr>
+            </w:r>
+            <w:r>
+              <w:rPr>
+                <w:sz w:val="18"/>
+              </w:rPr>
+              <w:t>Member (governance)</w:t>
+            </w:r>
+          </w:p>
+        </w:tc>
+        <w:tc>
+          <w:tcPr>
+            <w:tcW w:type="dxa" w:w="2160"/>
+          </w:tcPr>
+          <w:p>
+            <w:r>
+              <w:rPr>
+                <w:sz w:val="18"/>
+              </w:rPr>
+            </w:r>
+            <w:r>
+              <w:rPr>
+                <w:sz w:val="18"/>
+              </w:rPr>
+              <w:t>Member</w:t>
+            </w:r>
+          </w:p>
+        </w:tc>
+        <w:tc>
+          <w:tcPr>
+            <w:tcW w:type="dxa" w:w="2160"/>
+          </w:tcPr>
+          <w:p>
+            <w:r>
+              <w:rPr>
+                <w:sz w:val="18"/>
+              </w:rPr>
+            </w:r>
+            <w:r>
+              <w:rPr>
+                <w:sz w:val="18"/>
+              </w:rPr>
+              <w:t>Viewer + governance tooling (no data edits)</w:t>
+            </w:r>
+          </w:p>
+        </w:tc>
+      </w:tr>
+      <w:tr>
+        <w:tc>
+          <w:tcPr>
+            <w:tcW w:type="dxa" w:w="2160"/>
+          </w:tcPr>
+          <w:p>
+            <w:r>
+              <w:rPr>
+                <w:sz w:val="18"/>
+              </w:rPr>
+            </w:r>
+            <w:r>
+              <w:rPr>
+                <w:b/>
+                <w:sz w:val="18"/>
+              </w:rPr>
+              <w:t>Report Author / Analyst</w:t>
+            </w:r>
+          </w:p>
+        </w:tc>
+        <w:tc>
+          <w:tcPr>
+            <w:tcW w:type="dxa" w:w="2160"/>
+          </w:tcPr>
+          <w:p>
+            <w:r>
+              <w:rPr>
+                <w:sz w:val="18"/>
+              </w:rPr>
+            </w:r>
+            <w:r>
+              <w:rPr>
+                <w:sz w:val="18"/>
+              </w:rPr>
+              <w:t>Contributor (reporting workspace)</w:t>
+            </w:r>
+          </w:p>
+        </w:tc>
+        <w:tc>
+          <w:tcPr>
+            <w:tcW w:type="dxa" w:w="2160"/>
+          </w:tcPr>
+          <w:p>
+            <w:r>
+              <w:rPr>
+                <w:sz w:val="18"/>
+              </w:rPr>
+            </w:r>
+            <w:r>
+              <w:rPr>
+                <w:sz w:val="18"/>
+              </w:rPr>
+              <w:t>Contributor (validate)</w:t>
+            </w:r>
+          </w:p>
+        </w:tc>
+        <w:tc>
+          <w:tcPr>
+            <w:tcW w:type="dxa" w:w="2160"/>
+          </w:tcPr>
+          <w:p>
+            <w:r>
+              <w:rPr>
+                <w:sz w:val="18"/>
+              </w:rPr>
+            </w:r>
+            <w:r>
+              <w:rPr>
+                <w:sz w:val="18"/>
+              </w:rPr>
+              <w:t xml:space="preserve">Author only in a dedicated authoring workspace; </w:t>
+            </w:r>
+            <w:r>
+              <w:rPr>
+                <w:b/>
+                <w:sz w:val="18"/>
+              </w:rPr>
+              <w:t>Viewer</w:t>
+            </w:r>
+            <w:r>
+              <w:rPr>
+                <w:sz w:val="18"/>
+              </w:rPr>
+              <w:t xml:space="preserve"> on curated data</w:t>
+            </w:r>
+          </w:p>
+        </w:tc>
+      </w:tr>
+      <w:tr>
+        <w:tc>
+          <w:tcPr>
+            <w:tcW w:type="dxa" w:w="2160"/>
+          </w:tcPr>
+          <w:p>
+            <w:r>
+              <w:rPr>
+                <w:sz w:val="18"/>
+              </w:rPr>
+            </w:r>
+            <w:r>
+              <w:rPr>
+                <w:b/>
+                <w:sz w:val="18"/>
+              </w:rPr>
+              <w:t>Business Consumer</w:t>
+            </w:r>
+          </w:p>
+        </w:tc>
+        <w:tc>
+          <w:tcPr>
+            <w:tcW w:type="dxa" w:w="2160"/>
+          </w:tcPr>
+          <w:p>
+            <w:r>
+              <w:rPr>
+                <w:sz w:val="18"/>
+              </w:rPr>
+            </w:r>
+            <w:r>
+              <w:rPr>
+                <w:sz w:val="18"/>
+              </w:rPr>
+              <w:t>—</w:t>
+            </w:r>
+          </w:p>
+        </w:tc>
+        <w:tc>
+          <w:tcPr>
+            <w:tcW w:type="dxa" w:w="2160"/>
+          </w:tcPr>
+          <w:p>
+            <w:r>
+              <w:rPr>
+                <w:sz w:val="18"/>
+              </w:rPr>
+            </w:r>
+            <w:r>
+              <w:rPr>
+                <w:sz w:val="18"/>
+              </w:rPr>
+              <w:t>Viewer (UAT sign-off)</w:t>
+            </w:r>
+          </w:p>
+        </w:tc>
+        <w:tc>
+          <w:tcPr>
+            <w:tcW w:type="dxa" w:w="2160"/>
+          </w:tcPr>
+          <w:p>
+            <w:r>
+              <w:rPr>
+                <w:sz w:val="18"/>
+              </w:rPr>
+            </w:r>
+            <w:r>
+              <w:rPr>
+                <w:b/>
+                <w:sz w:val="18"/>
+              </w:rPr>
+              <w:t>Viewer via published app</w:t>
+            </w:r>
+            <w:r>
+              <w:rPr>
+                <w:sz w:val="18"/>
+              </w:rPr>
+              <w:t xml:space="preserve"> only</w:t>
+            </w:r>
+          </w:p>
+        </w:tc>
+      </w:tr>
+      <w:tr>
+        <w:tc>
+          <w:tcPr>
+            <w:tcW w:type="dxa" w:w="2160"/>
+          </w:tcPr>
+          <w:p>
+            <w:r>
+              <w:rPr>
+                <w:sz w:val="18"/>
+              </w:rPr>
+            </w:r>
+            <w:r>
+              <w:rPr>
+                <w:b/>
+                <w:sz w:val="18"/>
+              </w:rPr>
+              <w:t>Auditor / Security</w:t>
+            </w:r>
+          </w:p>
+        </w:tc>
+        <w:tc>
+          <w:tcPr>
+            <w:tcW w:type="dxa" w:w="2160"/>
+          </w:tcPr>
+          <w:p>
+            <w:r>
+              <w:rPr>
+                <w:sz w:val="18"/>
+              </w:rPr>
+            </w:r>
+            <w:r>
+              <w:rPr>
+                <w:sz w:val="18"/>
+              </w:rPr>
+              <w:t>Viewer + audit logs</w:t>
+            </w:r>
+          </w:p>
+        </w:tc>
+        <w:tc>
+          <w:tcPr>
+            <w:tcW w:type="dxa" w:w="2160"/>
+          </w:tcPr>
+          <w:p>
+            <w:r>
+              <w:rPr>
+                <w:sz w:val="18"/>
+              </w:rPr>
+            </w:r>
+            <w:r>
+              <w:rPr>
+                <w:sz w:val="18"/>
+              </w:rPr>
+              <w:t>Viewer + audit logs</w:t>
+            </w:r>
+          </w:p>
+        </w:tc>
+        <w:tc>
+          <w:tcPr>
+            <w:tcW w:type="dxa" w:w="2160"/>
+          </w:tcPr>
+          <w:p>
+            <w:r>
+              <w:rPr>
+                <w:sz w:val="18"/>
+              </w:rPr>
+            </w:r>
+            <w:r>
+              <w:rPr>
+                <w:sz w:val="18"/>
+              </w:rPr>
+              <w:t>Viewer + audit logs</w:t>
+            </w:r>
+          </w:p>
+        </w:tc>
+      </w:tr>
+      <w:tr>
+        <w:tc>
+          <w:tcPr>
+            <w:tcW w:type="dxa" w:w="2160"/>
+          </w:tcPr>
+          <w:p>
+            <w:r>
+              <w:rPr>
+                <w:sz w:val="18"/>
+              </w:rPr>
+            </w:r>
+            <w:r>
+              <w:rPr>
+                <w:b/>
+                <w:sz w:val="18"/>
+              </w:rPr>
+              <w:t>Deployment SPN</w:t>
+            </w:r>
+            <w:r>
+              <w:rPr>
+                <w:sz w:val="18"/>
+              </w:rPr>
+              <w:t xml:space="preserve"> (CI/CD)</w:t>
+            </w:r>
+          </w:p>
+        </w:tc>
+        <w:tc>
+          <w:tcPr>
+            <w:tcW w:type="dxa" w:w="2160"/>
+          </w:tcPr>
+          <w:p>
+            <w:r>
+              <w:rPr>
+                <w:sz w:val="18"/>
+              </w:rPr>
+            </w:r>
+            <w:r>
+              <w:rPr>
+                <w:sz w:val="18"/>
+              </w:rPr>
+              <w:t>Member (deploy)</w:t>
+            </w:r>
+          </w:p>
+        </w:tc>
+        <w:tc>
+          <w:tcPr>
+            <w:tcW w:type="dxa" w:w="2160"/>
+          </w:tcPr>
+          <w:p>
+            <w:r>
+              <w:rPr>
+                <w:sz w:val="18"/>
+              </w:rPr>
+            </w:r>
+            <w:r>
+              <w:rPr>
+                <w:sz w:val="18"/>
+              </w:rPr>
+              <w:t>Member (deploy)</w:t>
+            </w:r>
+          </w:p>
+        </w:tc>
+        <w:tc>
+          <w:tcPr>
+            <w:tcW w:type="dxa" w:w="2160"/>
+          </w:tcPr>
+          <w:p>
+            <w:r>
+              <w:rPr>
+                <w:sz w:val="18"/>
+              </w:rPr>
+            </w:r>
+            <w:r>
+              <w:rPr>
+                <w:sz w:val="18"/>
+              </w:rPr>
+              <w:t xml:space="preserve">Member (deploy) — </w:t>
+            </w:r>
+            <w:r>
+              <w:rPr>
+                <w:b/>
+                <w:sz w:val="18"/>
+              </w:rPr>
+              <w:t>only path to change PROD</w:t>
+            </w:r>
+          </w:p>
+        </w:tc>
+      </w:tr>
+      <w:tr>
+        <w:tc>
+          <w:tcPr>
+            <w:tcW w:type="dxa" w:w="2160"/>
+          </w:tcPr>
+          <w:p>
+            <w:r>
+              <w:rPr>
+                <w:sz w:val="18"/>
+              </w:rPr>
+            </w:r>
+            <w:r>
+              <w:rPr>
+                <w:b/>
+                <w:sz w:val="18"/>
+              </w:rPr>
+              <w:t>Runtime SPN</w:t>
+            </w:r>
+            <w:r>
+              <w:rPr>
+                <w:sz w:val="18"/>
+              </w:rPr>
+              <w:t xml:space="preserve"> (scheduled)</w:t>
+            </w:r>
+          </w:p>
+        </w:tc>
+        <w:tc>
+          <w:tcPr>
+            <w:tcW w:type="dxa" w:w="2160"/>
+          </w:tcPr>
+          <w:p>
+            <w:r>
+              <w:rPr>
+                <w:sz w:val="18"/>
+              </w:rPr>
+            </w:r>
+            <w:r>
+              <w:rPr>
+                <w:sz w:val="18"/>
+              </w:rPr>
+              <w:t>Contributor (run)</w:t>
+            </w:r>
+          </w:p>
+        </w:tc>
+        <w:tc>
+          <w:tcPr>
+            <w:tcW w:type="dxa" w:w="2160"/>
+          </w:tcPr>
+          <w:p>
+            <w:r>
+              <w:rPr>
+                <w:sz w:val="18"/>
+              </w:rPr>
+            </w:r>
+            <w:r>
+              <w:rPr>
+                <w:sz w:val="18"/>
+              </w:rPr>
+              <w:t>Contributor (run)</w:t>
+            </w:r>
+          </w:p>
+        </w:tc>
+        <w:tc>
+          <w:tcPr>
+            <w:tcW w:type="dxa" w:w="2160"/>
+          </w:tcPr>
+          <w:p>
+            <w:r>
+              <w:rPr>
+                <w:sz w:val="18"/>
+              </w:rPr>
+            </w:r>
+            <w:r>
+              <w:rPr>
+                <w:sz w:val="18"/>
+              </w:rPr>
+              <w:t>Contributor (run)</w:t>
+            </w:r>
+          </w:p>
+        </w:tc>
+      </w:tr>
+      <w:tr>
+        <w:tc>
+          <w:tcPr>
+            <w:tcW w:type="dxa" w:w="2160"/>
+          </w:tcPr>
+          <w:p>
+            <w:r>
+              <w:rPr>
+                <w:sz w:val="18"/>
+              </w:rPr>
+            </w:r>
+            <w:r>
+              <w:rPr>
+                <w:b/>
+                <w:sz w:val="18"/>
+              </w:rPr>
+              <w:t>Gateway / connection account</w:t>
+            </w:r>
+          </w:p>
+        </w:tc>
+        <w:tc>
+          <w:tcPr>
+            <w:tcW w:type="dxa" w:w="2160"/>
+          </w:tcPr>
+          <w:p>
+            <w:r>
+              <w:rPr>
+                <w:sz w:val="18"/>
+              </w:rPr>
+            </w:r>
+            <w:r>
+              <w:rPr>
+                <w:sz w:val="18"/>
+              </w:rPr>
+              <w:t>read-only on DEV source</w:t>
+            </w:r>
+          </w:p>
+        </w:tc>
+        <w:tc>
+          <w:tcPr>
+            <w:tcW w:type="dxa" w:w="2160"/>
+          </w:tcPr>
+          <w:p>
+            <w:r>
+              <w:rPr>
+                <w:sz w:val="18"/>
+              </w:rPr>
+            </w:r>
+            <w:r>
+              <w:rPr>
+                <w:sz w:val="18"/>
+              </w:rPr>
+              <w:t>read-only on UAT source</w:t>
+            </w:r>
+          </w:p>
+        </w:tc>
+        <w:tc>
+          <w:tcPr>
+            <w:tcW w:type="dxa" w:w="2160"/>
+          </w:tcPr>
+          <w:p>
+            <w:r>
+              <w:rPr>
+                <w:sz w:val="18"/>
+              </w:rPr>
+            </w:r>
+            <w:r>
+              <w:rPr>
+                <w:sz w:val="18"/>
+              </w:rPr>
+              <w:t>read-only on PROD source</w:t>
+            </w:r>
+          </w:p>
+        </w:tc>
+      </w:tr>
+    </w:tbl>
+    <w:p/>
+    <w:p>
+      <w:pPr>
+        <w:pStyle w:val="Heading3"/>
+      </w:pPr>
+      <w:r/>
+      <w:r>
+        <w:t>Data security &amp; privacy</w:t>
+      </w:r>
+    </w:p>
+    <w:tbl>
+      <w:tblPr>
+        <w:tblStyle w:val="LightGrid-Accent1"/>
+        <w:tblW w:type="auto" w:w="0"/>
+        <w:tblLook w:firstColumn="1" w:firstRow="1" w:lastColumn="0" w:lastRow="0" w:noHBand="0" w:noVBand="1" w:val="04A0"/>
+      </w:tblPr>
+      <w:tblGrid>
+        <w:gridCol w:w="4320"/>
+        <w:gridCol w:w="4320"/>
+      </w:tblGrid>
+      <w:tr>
+        <w:tc>
+          <w:tcPr>
+            <w:tcW w:type="dxa" w:w="4320"/>
+          </w:tcPr>
+          <w:p>
+            <w:r>
+              <w:rPr>
+                <w:b/>
+                <w:sz w:val="18"/>
+              </w:rPr>
+            </w:r>
+            <w:r>
+              <w:rPr>
+                <w:b/>
+                <w:sz w:val="18"/>
+              </w:rPr>
+              <w:t>Control</w:t>
+            </w:r>
+          </w:p>
+        </w:tc>
+        <w:tc>
+          <w:tcPr>
+            <w:tcW w:type="dxa" w:w="4320"/>
+          </w:tcPr>
+          <w:p>
+            <w:r>
+              <w:rPr>
+                <w:b/>
+                <w:sz w:val="18"/>
+              </w:rPr>
+            </w:r>
+            <w:r>
+              <w:rPr>
+                <w:b/>
+                <w:sz w:val="18"/>
+              </w:rPr>
+              <w:t>Best practice</w:t>
+            </w:r>
+          </w:p>
+        </w:tc>
+      </w:tr>
+      <w:tr>
+        <w:tc>
+          <w:tcPr>
+            <w:tcW w:type="dxa" w:w="4320"/>
+          </w:tcPr>
+          <w:p>
+            <w:r>
+              <w:rPr>
+                <w:sz w:val="18"/>
+              </w:rPr>
+            </w:r>
+            <w:r>
+              <w:rPr>
+                <w:b/>
+                <w:sz w:val="18"/>
+              </w:rPr>
+              <w:t>PII minimization</w:t>
+            </w:r>
+          </w:p>
+        </w:tc>
+        <w:tc>
+          <w:tcPr>
+            <w:tcW w:type="dxa" w:w="4320"/>
+          </w:tcPr>
+          <w:p>
+            <w:r>
+              <w:rPr>
+                <w:sz w:val="18"/>
+              </w:rPr>
+            </w:r>
+            <w:r>
+              <w:rPr>
+                <w:sz w:val="18"/>
+              </w:rPr>
+              <w:t xml:space="preserve">Mask or exclude sensitive columns </w:t>
+            </w:r>
+            <w:r>
+              <w:rPr>
+                <w:b/>
+                <w:sz w:val="18"/>
+              </w:rPr>
+              <w:t>at ingest</w:t>
+            </w:r>
+            <w:r>
+              <w:rPr>
+                <w:sz w:val="18"/>
+              </w:rPr>
+              <w:t xml:space="preserve"> (Silver) — sensitive data need never land raw in OneLake. *(Platform.)*</w:t>
+            </w:r>
+          </w:p>
+        </w:tc>
+      </w:tr>
+      <w:tr>
+        <w:tc>
+          <w:tcPr>
+            <w:tcW w:type="dxa" w:w="4320"/>
+          </w:tcPr>
+          <w:p>
+            <w:r>
+              <w:rPr>
+                <w:sz w:val="18"/>
+              </w:rPr>
+            </w:r>
+            <w:r>
+              <w:rPr>
+                <w:b/>
+                <w:sz w:val="18"/>
+              </w:rPr>
+              <w:t>Row / column security</w:t>
+            </w:r>
+          </w:p>
+        </w:tc>
+        <w:tc>
+          <w:tcPr>
+            <w:tcW w:type="dxa" w:w="4320"/>
+          </w:tcPr>
+          <w:p>
+            <w:r>
+              <w:rPr>
+                <w:sz w:val="18"/>
+              </w:rPr>
+            </w:r>
+            <w:r>
+              <w:rPr>
+                <w:sz w:val="18"/>
+              </w:rPr>
+              <w:t>OneLake row- and column-level security applied from config, consistently per environment. *(Platform.)*</w:t>
+            </w:r>
+          </w:p>
+        </w:tc>
+      </w:tr>
+      <w:tr>
+        <w:tc>
+          <w:tcPr>
+            <w:tcW w:type="dxa" w:w="4320"/>
+          </w:tcPr>
+          <w:p>
+            <w:r>
+              <w:rPr>
+                <w:sz w:val="18"/>
+              </w:rPr>
+            </w:r>
+            <w:r>
+              <w:rPr>
+                <w:b/>
+                <w:sz w:val="18"/>
+              </w:rPr>
+              <w:t>Masking</w:t>
+            </w:r>
+          </w:p>
+        </w:tc>
+        <w:tc>
+          <w:tcPr>
+            <w:tcW w:type="dxa" w:w="4320"/>
+          </w:tcPr>
+          <w:p>
+            <w:r>
+              <w:rPr>
+                <w:sz w:val="18"/>
+              </w:rPr>
+            </w:r>
+            <w:r>
+              <w:rPr>
+                <w:sz w:val="18"/>
+              </w:rPr>
+              <w:t>Dynamic masking at query time + static masking during processing. *(Platform.)*</w:t>
+            </w:r>
+          </w:p>
+        </w:tc>
+      </w:tr>
+      <w:tr>
+        <w:tc>
+          <w:tcPr>
+            <w:tcW w:type="dxa" w:w="4320"/>
+          </w:tcPr>
+          <w:p>
+            <w:r>
+              <w:rPr>
+                <w:sz w:val="18"/>
+              </w:rPr>
+            </w:r>
+            <w:r>
+              <w:rPr>
+                <w:b/>
+                <w:sz w:val="18"/>
+              </w:rPr>
+              <w:t>Sensitivity labels</w:t>
+            </w:r>
+          </w:p>
+        </w:tc>
+        <w:tc>
+          <w:tcPr>
+            <w:tcW w:type="dxa" w:w="4320"/>
+          </w:tcPr>
+          <w:p>
+            <w:r>
+              <w:rPr>
+                <w:sz w:val="18"/>
+              </w:rPr>
+            </w:r>
+            <w:r>
+              <w:rPr>
+                <w:sz w:val="18"/>
+              </w:rPr>
+              <w:t>Apply Microsoft Purview Information Protection labels (e.g. *Confidential – PII*) to items; labels travel with the data.</w:t>
+            </w:r>
+          </w:p>
+        </w:tc>
+      </w:tr>
+      <w:tr>
+        <w:tc>
+          <w:tcPr>
+            <w:tcW w:type="dxa" w:w="4320"/>
+          </w:tcPr>
+          <w:p>
+            <w:r>
+              <w:rPr>
+                <w:sz w:val="18"/>
+              </w:rPr>
+            </w:r>
+            <w:r>
+              <w:rPr>
+                <w:b/>
+                <w:sz w:val="18"/>
+              </w:rPr>
+              <w:t>Data residency</w:t>
+            </w:r>
+          </w:p>
+        </w:tc>
+        <w:tc>
+          <w:tcPr>
+            <w:tcW w:type="dxa" w:w="4320"/>
+          </w:tcPr>
+          <w:p>
+            <w:r>
+              <w:rPr>
+                <w:sz w:val="18"/>
+              </w:rPr>
+            </w:r>
+            <w:r>
+              <w:rPr>
+                <w:sz w:val="18"/>
+              </w:rPr>
+              <w:t xml:space="preserve">Host the Fabric capacity in a </w:t>
+            </w:r>
+            <w:r>
+              <w:rPr>
+                <w:b/>
+                <w:sz w:val="18"/>
+              </w:rPr>
+              <w:t>Canadian region</w:t>
+            </w:r>
+            <w:r>
+              <w:rPr>
+                <w:sz w:val="18"/>
+              </w:rPr>
+              <w:t xml:space="preserve"> (Canada Central / Canada East); confirm no cross-geo processing for a crown corporation.</w:t>
+            </w:r>
+          </w:p>
+        </w:tc>
+      </w:tr>
+      <w:tr>
+        <w:tc>
+          <w:tcPr>
+            <w:tcW w:type="dxa" w:w="4320"/>
+          </w:tcPr>
+          <w:p>
+            <w:r>
+              <w:rPr>
+                <w:sz w:val="18"/>
+              </w:rPr>
+            </w:r>
+            <w:r>
+              <w:rPr>
+                <w:b/>
+                <w:sz w:val="18"/>
+              </w:rPr>
+              <w:t>Encryption</w:t>
+            </w:r>
+          </w:p>
+        </w:tc>
+        <w:tc>
+          <w:tcPr>
+            <w:tcW w:type="dxa" w:w="4320"/>
+          </w:tcPr>
+          <w:p>
+            <w:r>
+              <w:rPr>
+                <w:sz w:val="18"/>
+              </w:rPr>
+            </w:r>
+            <w:r>
+              <w:rPr>
+                <w:sz w:val="18"/>
+              </w:rPr>
+              <w:t xml:space="preserve">Encrypted at rest by default; evaluate </w:t>
+            </w:r>
+            <w:r>
+              <w:rPr>
+                <w:b/>
+                <w:sz w:val="18"/>
+              </w:rPr>
+              <w:t>customer-managed keys</w:t>
+            </w:r>
+            <w:r>
+              <w:rPr>
+                <w:sz w:val="18"/>
+              </w:rPr>
+              <w:t xml:space="preserve"> if BCPC policy requires.</w:t>
+            </w:r>
+          </w:p>
+        </w:tc>
+      </w:tr>
+      <w:tr>
+        <w:tc>
+          <w:tcPr>
+            <w:tcW w:type="dxa" w:w="4320"/>
+          </w:tcPr>
+          <w:p>
+            <w:r>
+              <w:rPr>
+                <w:sz w:val="18"/>
+              </w:rPr>
+            </w:r>
+            <w:r>
+              <w:rPr>
+                <w:b/>
+                <w:sz w:val="18"/>
+              </w:rPr>
+              <w:t>DLP / export</w:t>
+            </w:r>
+          </w:p>
+        </w:tc>
+        <w:tc>
+          <w:tcPr>
+            <w:tcW w:type="dxa" w:w="4320"/>
+          </w:tcPr>
+          <w:p>
+            <w:r>
+              <w:rPr>
+                <w:sz w:val="18"/>
+              </w:rPr>
+            </w:r>
+            <w:r>
+              <w:rPr>
+                <w:sz w:val="18"/>
+              </w:rPr>
+              <w:t xml:space="preserve">Microsoft Purview DLP policies for Fabric; </w:t>
+            </w:r>
+            <w:r>
+              <w:rPr>
+                <w:b/>
+                <w:sz w:val="18"/>
+              </w:rPr>
+              <w:t>disable publish-to-web</w:t>
+            </w:r>
+            <w:r>
+              <w:rPr>
+                <w:sz w:val="18"/>
+              </w:rPr>
+              <w:t xml:space="preserve"> and restrict export/download on sensitive workspaces.</w:t>
+            </w:r>
+          </w:p>
+        </w:tc>
+      </w:tr>
+      <w:tr>
+        <w:tc>
+          <w:tcPr>
+            <w:tcW w:type="dxa" w:w="4320"/>
+          </w:tcPr>
+          <w:p>
+            <w:r>
+              <w:rPr>
+                <w:sz w:val="18"/>
+              </w:rPr>
+            </w:r>
+            <w:r>
+              <w:rPr>
+                <w:b/>
+                <w:sz w:val="18"/>
+              </w:rPr>
+              <w:t>No PII downstream</w:t>
+            </w:r>
+          </w:p>
+        </w:tc>
+        <w:tc>
+          <w:tcPr>
+            <w:tcW w:type="dxa" w:w="4320"/>
+          </w:tcPr>
+          <w:p>
+            <w:r>
+              <w:rPr>
+                <w:sz w:val="18"/>
+              </w:rPr>
+            </w:r>
+            <w:r>
+              <w:rPr>
+                <w:sz w:val="18"/>
+              </w:rPr>
+              <w:t>Lower environments and shared datasets carry masked/synthetic data only.</w:t>
+            </w:r>
+          </w:p>
+        </w:tc>
+      </w:tr>
+    </w:tbl>
+    <w:p/>
+    <w:p>
+      <w:pPr>
+        <w:pStyle w:val="Heading3"/>
+      </w:pPr>
+      <w:r/>
+      <w:r>
+        <w:t>Data connections &amp; network controls</w:t>
+      </w:r>
+    </w:p>
+    <w:tbl>
+      <w:tblPr>
+        <w:tblStyle w:val="LightGrid-Accent1"/>
+        <w:tblW w:type="auto" w:w="0"/>
+        <w:tblLook w:firstColumn="1" w:firstRow="1" w:lastColumn="0" w:lastRow="0" w:noHBand="0" w:noVBand="1" w:val="04A0"/>
+      </w:tblPr>
+      <w:tblGrid>
+        <w:gridCol w:w="4320"/>
+        <w:gridCol w:w="4320"/>
+      </w:tblGrid>
+      <w:tr>
+        <w:tc>
+          <w:tcPr>
+            <w:tcW w:type="dxa" w:w="4320"/>
+          </w:tcPr>
+          <w:p>
+            <w:r>
+              <w:rPr>
+                <w:b/>
+                <w:sz w:val="18"/>
+              </w:rPr>
+            </w:r>
+            <w:r>
+              <w:rPr>
+                <w:b/>
+                <w:sz w:val="18"/>
+              </w:rPr>
+              <w:t>Control</w:t>
+            </w:r>
+          </w:p>
+        </w:tc>
+        <w:tc>
+          <w:tcPr>
+            <w:tcW w:type="dxa" w:w="4320"/>
+          </w:tcPr>
+          <w:p>
+            <w:r>
+              <w:rPr>
+                <w:b/>
+                <w:sz w:val="18"/>
+              </w:rPr>
+            </w:r>
+            <w:r>
+              <w:rPr>
+                <w:b/>
+                <w:sz w:val="18"/>
+              </w:rPr>
+              <w:t>Best practice</w:t>
+            </w:r>
+          </w:p>
+        </w:tc>
+      </w:tr>
+      <w:tr>
+        <w:tc>
+          <w:tcPr>
+            <w:tcW w:type="dxa" w:w="4320"/>
+          </w:tcPr>
+          <w:p>
+            <w:r>
+              <w:rPr>
+                <w:sz w:val="18"/>
+              </w:rPr>
+            </w:r>
+            <w:r>
+              <w:rPr>
+                <w:b/>
+                <w:sz w:val="18"/>
+              </w:rPr>
+              <w:t>Connectivity path</w:t>
+            </w:r>
+          </w:p>
+        </w:tc>
+        <w:tc>
+          <w:tcPr>
+            <w:tcW w:type="dxa" w:w="4320"/>
+          </w:tcPr>
+          <w:p>
+            <w:r>
+              <w:rPr>
+                <w:sz w:val="18"/>
+              </w:rPr>
+            </w:r>
+            <w:r>
+              <w:rPr>
+                <w:sz w:val="18"/>
+              </w:rPr>
+              <w:t xml:space="preserve">Private only — through the data gateway or private endpoints; </w:t>
+            </w:r>
+            <w:r>
+              <w:rPr>
+                <w:b/>
+                <w:sz w:val="18"/>
+              </w:rPr>
+              <w:t>no public internet path</w:t>
+            </w:r>
+            <w:r>
+              <w:rPr>
+                <w:sz w:val="18"/>
+              </w:rPr>
+              <w:t xml:space="preserve"> to sources.</w:t>
+            </w:r>
+          </w:p>
+        </w:tc>
+      </w:tr>
+      <w:tr>
+        <w:tc>
+          <w:tcPr>
+            <w:tcW w:type="dxa" w:w="4320"/>
+          </w:tcPr>
+          <w:p>
+            <w:r>
+              <w:rPr>
+                <w:sz w:val="18"/>
+              </w:rPr>
+            </w:r>
+            <w:r>
+              <w:rPr>
+                <w:b/>
+                <w:sz w:val="18"/>
+              </w:rPr>
+              <w:t>Connection credentials</w:t>
+            </w:r>
+          </w:p>
+        </w:tc>
+        <w:tc>
+          <w:tcPr>
+            <w:tcW w:type="dxa" w:w="4320"/>
+          </w:tcPr>
+          <w:p>
+            <w:r>
+              <w:rPr>
+                <w:sz w:val="18"/>
+              </w:rPr>
+            </w:r>
+            <w:r>
+              <w:rPr>
+                <w:sz w:val="18"/>
+              </w:rPr>
+              <w:t xml:space="preserve">Least-privilege, </w:t>
+            </w:r>
+            <w:r>
+              <w:rPr>
+                <w:b/>
+                <w:sz w:val="18"/>
+              </w:rPr>
+              <w:t>read-only</w:t>
+            </w:r>
+            <w:r>
+              <w:rPr>
+                <w:sz w:val="18"/>
+              </w:rPr>
+              <w:t xml:space="preserve"> source accounts; credentials in Key Vault, never in config or git.</w:t>
+            </w:r>
+          </w:p>
+        </w:tc>
+      </w:tr>
+      <w:tr>
+        <w:tc>
+          <w:tcPr>
+            <w:tcW w:type="dxa" w:w="4320"/>
+          </w:tcPr>
+          <w:p>
+            <w:r>
+              <w:rPr>
+                <w:sz w:val="18"/>
+              </w:rPr>
+            </w:r>
+            <w:r>
+              <w:rPr>
+                <w:b/>
+                <w:sz w:val="18"/>
+              </w:rPr>
+              <w:t>Who can create connections</w:t>
+            </w:r>
+          </w:p>
+        </w:tc>
+        <w:tc>
+          <w:tcPr>
+            <w:tcW w:type="dxa" w:w="4320"/>
+          </w:tcPr>
+          <w:p>
+            <w:r>
+              <w:rPr>
+                <w:sz w:val="18"/>
+              </w:rPr>
+            </w:r>
+            <w:r>
+              <w:rPr>
+                <w:sz w:val="18"/>
+              </w:rPr>
+              <w:t xml:space="preserve">Restrict connection creation to platform admins / a defined group; </w:t>
+            </w:r>
+            <w:r>
+              <w:rPr>
+                <w:b/>
+                <w:sz w:val="18"/>
+              </w:rPr>
+              <w:t>share</w:t>
+            </w:r>
+            <w:r>
+              <w:rPr>
+                <w:sz w:val="18"/>
+              </w:rPr>
+              <w:t xml:space="preserve"> governed connections rather than scattering credentials.</w:t>
+            </w:r>
+          </w:p>
+        </w:tc>
+      </w:tr>
+      <w:tr>
+        <w:tc>
+          <w:tcPr>
+            <w:tcW w:type="dxa" w:w="4320"/>
+          </w:tcPr>
+          <w:p>
+            <w:r>
+              <w:rPr>
+                <w:sz w:val="18"/>
+              </w:rPr>
+            </w:r>
+            <w:r>
+              <w:rPr>
+                <w:b/>
+                <w:sz w:val="18"/>
+              </w:rPr>
+              <w:t>Connection reuse</w:t>
+            </w:r>
+          </w:p>
+        </w:tc>
+        <w:tc>
+          <w:tcPr>
+            <w:tcW w:type="dxa" w:w="4320"/>
+          </w:tcPr>
+          <w:p>
+            <w:r>
+              <w:rPr>
+                <w:sz w:val="18"/>
+              </w:rPr>
+            </w:r>
+            <w:r>
+              <w:rPr>
+                <w:sz w:val="18"/>
+              </w:rPr>
+              <w:t>One governed connection per source per environment, reused — not per-user copies.</w:t>
+            </w:r>
+          </w:p>
+        </w:tc>
+      </w:tr>
+      <w:tr>
+        <w:tc>
+          <w:tcPr>
+            <w:tcW w:type="dxa" w:w="4320"/>
+          </w:tcPr>
+          <w:p>
+            <w:r>
+              <w:rPr>
+                <w:sz w:val="18"/>
+              </w:rPr>
+            </w:r>
+            <w:r>
+              <w:rPr>
+                <w:b/>
+                <w:sz w:val="18"/>
+              </w:rPr>
+              <w:t>Gateway</w:t>
+            </w:r>
+          </w:p>
+        </w:tc>
+        <w:tc>
+          <w:tcPr>
+            <w:tcW w:type="dxa" w:w="4320"/>
+          </w:tcPr>
+          <w:p>
+            <w:r>
+              <w:rPr>
+                <w:sz w:val="18"/>
+              </w:rPr>
+            </w:r>
+            <w:r>
+              <w:rPr>
+                <w:sz w:val="18"/>
+              </w:rPr>
+              <w:t>Dedicated gateway VM(s); kept patched; clustered for HA if used for continuous mirroring.</w:t>
+            </w:r>
+          </w:p>
+        </w:tc>
+      </w:tr>
+      <w:tr>
+        <w:tc>
+          <w:tcPr>
+            <w:tcW w:type="dxa" w:w="4320"/>
+          </w:tcPr>
+          <w:p>
+            <w:r>
+              <w:rPr>
+                <w:sz w:val="18"/>
+              </w:rPr>
+            </w:r>
+            <w:r>
+              <w:rPr>
+                <w:b/>
+                <w:sz w:val="18"/>
+              </w:rPr>
+              <w:t>Access gating</w:t>
+            </w:r>
+          </w:p>
+        </w:tc>
+        <w:tc>
+          <w:tcPr>
+            <w:tcW w:type="dxa" w:w="4320"/>
+          </w:tcPr>
+          <w:p>
+            <w:r>
+              <w:rPr>
+                <w:sz w:val="18"/>
+              </w:rPr>
+            </w:r>
+            <w:r>
+              <w:rPr>
+                <w:sz w:val="18"/>
+              </w:rPr>
+              <w:t>Conditional Access (MFA + compliant device + allowed location) on all Fabric / Power BI access.</w:t>
+            </w:r>
+          </w:p>
+        </w:tc>
+      </w:tr>
+    </w:tbl>
+    <w:p/>
+    <w:p>
+      <w:pPr>
+        <w:pStyle w:val="Heading3"/>
+      </w:pPr>
+      <w:r/>
+      <w:r>
+        <w:t>Tenant-level guardrails (admin checklist)</w:t>
+      </w:r>
+    </w:p>
+    <w:tbl>
+      <w:tblPr>
+        <w:tblStyle w:val="LightGrid-Accent1"/>
+        <w:tblW w:type="auto" w:w="0"/>
+        <w:tblLook w:firstColumn="1" w:firstRow="1" w:lastColumn="0" w:lastRow="0" w:noHBand="0" w:noVBand="1" w:val="04A0"/>
+      </w:tblPr>
+      <w:tblGrid>
+        <w:gridCol w:w="4320"/>
+        <w:gridCol w:w="4320"/>
+      </w:tblGrid>
+      <w:tr>
+        <w:tc>
+          <w:tcPr>
+            <w:tcW w:type="dxa" w:w="4320"/>
+          </w:tcPr>
+          <w:p>
+            <w:r>
+              <w:rPr>
+                <w:b/>
+                <w:sz w:val="18"/>
+              </w:rPr>
+            </w:r>
+            <w:r>
+              <w:rPr>
+                <w:b/>
+                <w:sz w:val="18"/>
+              </w:rPr>
+              <w:t>Tenant setting</w:t>
+            </w:r>
+          </w:p>
+        </w:tc>
+        <w:tc>
+          <w:tcPr>
+            <w:tcW w:type="dxa" w:w="4320"/>
+          </w:tcPr>
+          <w:p>
+            <w:r>
+              <w:rPr>
+                <w:b/>
+                <w:sz w:val="18"/>
+              </w:rPr>
+            </w:r>
+            <w:r>
+              <w:rPr>
+                <w:b/>
+                <w:sz w:val="18"/>
+              </w:rPr>
+              <w:t>Recommended for BCPC</w:t>
+            </w:r>
+          </w:p>
+        </w:tc>
+      </w:tr>
+      <w:tr>
+        <w:tc>
+          <w:tcPr>
+            <w:tcW w:type="dxa" w:w="4320"/>
+          </w:tcPr>
+          <w:p>
+            <w:r>
+              <w:rPr>
+                <w:sz w:val="18"/>
+              </w:rPr>
+            </w:r>
+            <w:r>
+              <w:rPr>
+                <w:sz w:val="18"/>
+              </w:rPr>
+              <w:t>Service principals can use Fabric APIs</w:t>
+            </w:r>
+          </w:p>
+        </w:tc>
+        <w:tc>
+          <w:tcPr>
+            <w:tcW w:type="dxa" w:w="4320"/>
+          </w:tcPr>
+          <w:p>
+            <w:r>
+              <w:rPr>
+                <w:sz w:val="18"/>
+              </w:rPr>
+            </w:r>
+            <w:r>
+              <w:rPr>
+                <w:b/>
+                <w:sz w:val="18"/>
+              </w:rPr>
+              <w:t>Enabled only for the `BCPC-FAB-SPN-*` group</w:t>
+            </w:r>
+            <w:r>
+              <w:rPr>
+                <w:sz w:val="18"/>
+              </w:rPr>
+              <w:t>, not org-wide</w:t>
+            </w:r>
+          </w:p>
+        </w:tc>
+      </w:tr>
+      <w:tr>
+        <w:tc>
+          <w:tcPr>
+            <w:tcW w:type="dxa" w:w="4320"/>
+          </w:tcPr>
+          <w:p>
+            <w:r>
+              <w:rPr>
+                <w:sz w:val="18"/>
+              </w:rPr>
+            </w:r>
+            <w:r>
+              <w:rPr>
+                <w:sz w:val="18"/>
+              </w:rPr>
+              <w:t>Publish to web</w:t>
+            </w:r>
+          </w:p>
+        </w:tc>
+        <w:tc>
+          <w:tcPr>
+            <w:tcW w:type="dxa" w:w="4320"/>
+          </w:tcPr>
+          <w:p>
+            <w:r>
+              <w:rPr>
+                <w:sz w:val="18"/>
+              </w:rPr>
+            </w:r>
+            <w:r>
+              <w:rPr>
+                <w:b/>
+                <w:sz w:val="18"/>
+              </w:rPr>
+              <w:t>Disabled</w:t>
+            </w:r>
+          </w:p>
+        </w:tc>
+      </w:tr>
+      <w:tr>
+        <w:tc>
+          <w:tcPr>
+            <w:tcW w:type="dxa" w:w="4320"/>
+          </w:tcPr>
+          <w:p>
+            <w:r>
+              <w:rPr>
+                <w:sz w:val="18"/>
+              </w:rPr>
+            </w:r>
+            <w:r>
+              <w:rPr>
+                <w:sz w:val="18"/>
+              </w:rPr>
+              <w:t>External / guest sharing</w:t>
+            </w:r>
+          </w:p>
+        </w:tc>
+        <w:tc>
+          <w:tcPr>
+            <w:tcW w:type="dxa" w:w="4320"/>
+          </w:tcPr>
+          <w:p>
+            <w:r>
+              <w:rPr>
+                <w:sz w:val="18"/>
+              </w:rPr>
+            </w:r>
+            <w:r>
+              <w:rPr>
+                <w:b/>
+                <w:sz w:val="18"/>
+              </w:rPr>
+              <w:t>Disabled</w:t>
+            </w:r>
+            <w:r>
+              <w:rPr>
+                <w:sz w:val="18"/>
+              </w:rPr>
+              <w:t xml:space="preserve"> (or tightly restricted with approval)</w:t>
+            </w:r>
+          </w:p>
+        </w:tc>
+      </w:tr>
+      <w:tr>
+        <w:tc>
+          <w:tcPr>
+            <w:tcW w:type="dxa" w:w="4320"/>
+          </w:tcPr>
+          <w:p>
+            <w:r>
+              <w:rPr>
+                <w:sz w:val="18"/>
+              </w:rPr>
+            </w:r>
+            <w:r>
+              <w:rPr>
+                <w:sz w:val="18"/>
+              </w:rPr>
+              <w:t>Export &amp; download (Excel / CSV / …)</w:t>
+            </w:r>
+          </w:p>
+        </w:tc>
+        <w:tc>
+          <w:tcPr>
+            <w:tcW w:type="dxa" w:w="4320"/>
+          </w:tcPr>
+          <w:p>
+            <w:r>
+              <w:rPr>
+                <w:sz w:val="18"/>
+              </w:rPr>
+            </w:r>
+            <w:r>
+              <w:rPr>
+                <w:b/>
+                <w:sz w:val="18"/>
+              </w:rPr>
+              <w:t>Restricted</w:t>
+            </w:r>
+            <w:r>
+              <w:rPr>
+                <w:sz w:val="18"/>
+              </w:rPr>
+              <w:t xml:space="preserve"> for sensitive workspaces</w:t>
+            </w:r>
+          </w:p>
+        </w:tc>
+      </w:tr>
+      <w:tr>
+        <w:tc>
+          <w:tcPr>
+            <w:tcW w:type="dxa" w:w="4320"/>
+          </w:tcPr>
+          <w:p>
+            <w:r>
+              <w:rPr>
+                <w:sz w:val="18"/>
+              </w:rPr>
+            </w:r>
+            <w:r>
+              <w:rPr>
+                <w:sz w:val="18"/>
+              </w:rPr>
+              <w:t>Sensitivity labels</w:t>
+            </w:r>
+          </w:p>
+        </w:tc>
+        <w:tc>
+          <w:tcPr>
+            <w:tcW w:type="dxa" w:w="4320"/>
+          </w:tcPr>
+          <w:p>
+            <w:r>
+              <w:rPr>
+                <w:sz w:val="18"/>
+              </w:rPr>
+            </w:r>
+            <w:r>
+              <w:rPr>
+                <w:b/>
+                <w:sz w:val="18"/>
+              </w:rPr>
+              <w:t>Enabled and enforced</w:t>
+            </w:r>
+            <w:r>
+              <w:rPr>
+                <w:sz w:val="18"/>
+              </w:rPr>
+              <w:t>; mandatory labelling on new items</w:t>
+            </w:r>
+          </w:p>
+        </w:tc>
+      </w:tr>
+      <w:tr>
+        <w:tc>
+          <w:tcPr>
+            <w:tcW w:type="dxa" w:w="4320"/>
+          </w:tcPr>
+          <w:p>
+            <w:r>
+              <w:rPr>
+                <w:sz w:val="18"/>
+              </w:rPr>
+            </w:r>
+            <w:r>
+              <w:rPr>
+                <w:sz w:val="18"/>
+              </w:rPr>
+              <w:t>Audit logging</w:t>
+            </w:r>
+          </w:p>
+        </w:tc>
+        <w:tc>
+          <w:tcPr>
+            <w:tcW w:type="dxa" w:w="4320"/>
+          </w:tcPr>
+          <w:p>
+            <w:r>
+              <w:rPr>
+                <w:sz w:val="18"/>
+              </w:rPr>
+            </w:r>
+            <w:r>
+              <w:rPr>
+                <w:b/>
+                <w:sz w:val="18"/>
+              </w:rPr>
+              <w:t>Enabled</w:t>
+            </w:r>
+            <w:r>
+              <w:rPr>
+                <w:sz w:val="18"/>
+              </w:rPr>
+              <w:t>; logs shipped to BCPC's SIEM</w:t>
+            </w:r>
+          </w:p>
+        </w:tc>
+      </w:tr>
+      <w:tr>
+        <w:tc>
+          <w:tcPr>
+            <w:tcW w:type="dxa" w:w="4320"/>
+          </w:tcPr>
+          <w:p>
+            <w:r>
+              <w:rPr>
+                <w:sz w:val="18"/>
+              </w:rPr>
+            </w:r>
+            <w:r>
+              <w:rPr>
+                <w:sz w:val="18"/>
+              </w:rPr>
+              <w:t>Workspace creation</w:t>
+            </w:r>
+          </w:p>
+        </w:tc>
+        <w:tc>
+          <w:tcPr>
+            <w:tcW w:type="dxa" w:w="4320"/>
+          </w:tcPr>
+          <w:p>
+            <w:r>
+              <w:rPr>
+                <w:sz w:val="18"/>
+              </w:rPr>
+            </w:r>
+            <w:r>
+              <w:rPr>
+                <w:b/>
+                <w:sz w:val="18"/>
+              </w:rPr>
+              <w:t>Restricted</w:t>
+            </w:r>
+            <w:r>
+              <w:rPr>
+                <w:sz w:val="18"/>
+              </w:rPr>
+              <w:t xml:space="preserve"> to the platform team / request process</w:t>
+            </w:r>
+          </w:p>
+        </w:tc>
+      </w:tr>
+      <w:tr>
+        <w:tc>
+          <w:tcPr>
+            <w:tcW w:type="dxa" w:w="4320"/>
+          </w:tcPr>
+          <w:p>
+            <w:r>
+              <w:rPr>
+                <w:sz w:val="18"/>
+              </w:rPr>
+            </w:r>
+            <w:r>
+              <w:rPr>
+                <w:sz w:val="18"/>
+              </w:rPr>
+              <w:t>Capacity assignment</w:t>
+            </w:r>
+          </w:p>
+        </w:tc>
+        <w:tc>
+          <w:tcPr>
+            <w:tcW w:type="dxa" w:w="4320"/>
+          </w:tcPr>
+          <w:p>
+            <w:r>
+              <w:rPr>
+                <w:sz w:val="18"/>
+              </w:rPr>
+            </w:r>
+            <w:r>
+              <w:rPr>
+                <w:b/>
+                <w:sz w:val="18"/>
+              </w:rPr>
+              <w:t>Restricted</w:t>
+            </w:r>
+            <w:r>
+              <w:rPr>
+                <w:sz w:val="18"/>
+              </w:rPr>
+              <w:t xml:space="preserve"> — control which workspaces run on which capacity</w:t>
+            </w:r>
+          </w:p>
+        </w:tc>
+      </w:tr>
+      <w:tr>
+        <w:tc>
+          <w:tcPr>
+            <w:tcW w:type="dxa" w:w="4320"/>
+          </w:tcPr>
+          <w:p>
+            <w:r>
+              <w:rPr>
+                <w:sz w:val="18"/>
+              </w:rPr>
+            </w:r>
+            <w:r>
+              <w:rPr>
+                <w:sz w:val="18"/>
+              </w:rPr>
+              <w:t>Conditional Access</w:t>
+            </w:r>
+          </w:p>
+        </w:tc>
+        <w:tc>
+          <w:tcPr>
+            <w:tcW w:type="dxa" w:w="4320"/>
+          </w:tcPr>
+          <w:p>
+            <w:r>
+              <w:rPr>
+                <w:sz w:val="18"/>
+              </w:rPr>
+            </w:r>
+            <w:r>
+              <w:rPr>
+                <w:b/>
+                <w:sz w:val="18"/>
+              </w:rPr>
+              <w:t>Enforced</w:t>
+            </w:r>
+            <w:r>
+              <w:rPr>
+                <w:sz w:val="18"/>
+              </w:rPr>
+              <w:t xml:space="preserve"> on the Fabric / Power BI service</w:t>
             </w:r>
           </w:p>
         </w:tc>

</xml_diff>

<commit_message>
Fabric guide: add Hub & Spoke platform topology section
Justify and diagram the hub-and-spoke pattern Microsoft proposed: central hub workspace loads all
data (our control plane's medallion; certified Gold), domain spoke workspaces shortcut to it via
OneLake (no copy) with their own lakehouse, optional warehouse, semantic models and reports.
Includes topology diagram, 8-point justification, hub-vs-spoke ownership matrix, and honest design
considerations (RLS-through-shortcuts must use OneLake Security and be validated; shortcut don't
re-copy; Gold as versioned contracts; warehouses extend not re-derive; Direct Lake fallback;
capacity chargeback; per-env hubs+spokes). Added to md, docx, and html.
</commit_message>
<xml_diff>
--- a/milestone-guide/fabric-milestone-guide.docx
+++ b/milestone-guide/fabric-milestone-guide.docx
@@ -366,6 +366,51 @@
       </w:r>
     </w:p>
     <w:p>
+      <w:r>
+        <w:t xml:space="preserve">&gt; The recommended </w:t>
+      </w:r>
+      <w:r>
+        <w:rPr>
+          <w:b/>
+        </w:rPr>
+        <w:t>workspace shape</w:t>
+      </w:r>
+      <w:r>
+        <w:t xml:space="preserve"> — a central </w:t>
+      </w:r>
+      <w:r>
+        <w:rPr>
+          <w:b/>
+        </w:rPr>
+        <w:t>hub</w:t>
+      </w:r>
+      <w:r>
+        <w:t xml:space="preserve"> that loads the data, with domain </w:t>
+      </w:r>
+      <w:r>
+        <w:rPr>
+          <w:b/>
+        </w:rPr>
+        <w:t>spokes</w:t>
+      </w:r>
+    </w:p>
+    <w:p>
+      <w:r>
+        <w:t xml:space="preserve">&gt; that shortcut to it — is set out in the </w:t>
+      </w:r>
+      <w:r>
+        <w:rPr>
+          <w:b/>
+        </w:rPr>
+        <w:t>[Platform Topology — Hub &amp; Spoke](#platform-topology--hub--spoke)</w:t>
+      </w:r>
+    </w:p>
+    <w:p>
+      <w:r>
+        <w:t>&gt; section, along with the security model behind it.</w:t>
+      </w:r>
+    </w:p>
+    <w:p>
       <w:pPr>
         <w:pStyle w:val="Heading3"/>
       </w:pPr>
@@ -6467,6 +6512,1378 @@
       </w:tr>
     </w:tbl>
     <w:p/>
+    <w:p>
+      <w:pPr>
+        <w:pStyle w:val="Heading2"/>
+      </w:pPr>
+      <w:r/>
+      <w:r>
+        <w:t>Platform Topology — Hub &amp; Spoke</w:t>
+      </w:r>
+    </w:p>
+    <w:p>
+      <w:r>
+        <w:t xml:space="preserve">*The recommended shape for the platform: </w:t>
+      </w:r>
+      <w:r>
+        <w:rPr>
+          <w:b/>
+        </w:rPr>
+        <w:t>load data once into a central hub</w:t>
+      </w:r>
+      <w:r>
+        <w:t>, and let each business</w:t>
+      </w:r>
+    </w:p>
+    <w:p>
+      <w:r>
+        <w:t xml:space="preserve">area work in its </w:t>
+      </w:r>
+      <w:r>
+        <w:rPr>
+          <w:b/>
+        </w:rPr>
+        <w:t>own "spoke" workspace</w:t>
+      </w:r>
+      <w:r>
+        <w:t xml:space="preserve"> that references the hub's data through </w:t>
+      </w:r>
+      <w:r>
+        <w:rPr>
+          <w:b/>
+        </w:rPr>
+        <w:t>OneLake shortcuts</w:t>
+      </w:r>
+    </w:p>
+    <w:p>
+      <w:r>
+        <w:t>— no copies. This is Microsoft's enterprise pattern for Fabric (it's how domains and OneLake are meant</w:t>
+      </w:r>
+    </w:p>
+    <w:p>
+      <w:r>
+        <w:t>to be used), and it fits BCPC well.*</w:t>
+      </w:r>
+    </w:p>
+    <w:p>
+      <w:pPr>
+        <w:pStyle w:val="Heading3"/>
+      </w:pPr>
+      <w:r/>
+      <w:r>
+        <w:t>The pattern</w:t>
+      </w:r>
+    </w:p>
+    <w:p>
+      <w:pPr>
+        <w:jc w:val="center"/>
+      </w:pPr>
+      <w:r>
+        <w:drawing>
+          <wp:inline xmlns:a="http://schemas.openxmlformats.org/drawingml/2006/main" xmlns:pic="http://schemas.openxmlformats.org/drawingml/2006/picture">
+            <wp:extent cx="5669280" cy="5299419"/>
+            <wp:docPr id="9" name="Picture 9"/>
+            <wp:cNvGraphicFramePr>
+              <a:graphicFrameLocks noChangeAspect="1"/>
+            </wp:cNvGraphicFramePr>
+            <a:graphic>
+              <a:graphicData uri="http://schemas.openxmlformats.org/drawingml/2006/picture">
+                <pic:pic>
+                  <pic:nvPicPr>
+                    <pic:cNvPr id="0" name="image.png"/>
+                    <pic:cNvPicPr/>
+                  </pic:nvPicPr>
+                  <pic:blipFill>
+                    <a:blip r:embed="rId17"/>
+                    <a:stretch>
+                      <a:fillRect/>
+                    </a:stretch>
+                  </pic:blipFill>
+                  <pic:spPr>
+                    <a:xfrm>
+                      <a:off x="0" y="0"/>
+                      <a:ext cx="5669280" cy="5299419"/>
+                    </a:xfrm>
+                    <a:prstGeom prst="rect"/>
+                  </pic:spPr>
+                </pic:pic>
+              </a:graphicData>
+            </a:graphic>
+          </wp:inline>
+        </w:drawing>
+      </w:r>
+    </w:p>
+    <w:p>
+      <w:pPr>
+        <w:pStyle w:val="ListBullet"/>
+        <w:ind w:left="360"/>
+      </w:pPr>
+      <w:r>
+        <w:rPr>
+          <w:b/>
+        </w:rPr>
+        <w:t>Hub</w:t>
+      </w:r>
+      <w:r>
+        <w:t xml:space="preserve"> — a central workspace owned by the platform team. All ingestion and the medallion</w:t>
+      </w:r>
+    </w:p>
+    <w:p>
+      <w:r>
+        <w:t xml:space="preserve">  (Bronze → Silver → </w:t>
+      </w:r>
+      <w:r>
+        <w:rPr>
+          <w:b/>
+        </w:rPr>
+        <w:t>Gold certified data products</w:t>
+      </w:r>
+      <w:r>
+        <w:t xml:space="preserve">) live here. There is </w:t>
+      </w:r>
+      <w:r>
+        <w:rPr>
+          <w:b/>
+        </w:rPr>
+        <w:t>one physical copy</w:t>
+      </w:r>
+      <w:r>
+        <w:t xml:space="preserve"> of</w:t>
+      </w:r>
+    </w:p>
+    <w:p>
+      <w:r>
+        <w:t xml:space="preserve">  the data. *This is exactly what our control plane produces.*</w:t>
+      </w:r>
+    </w:p>
+    <w:p>
+      <w:pPr>
+        <w:pStyle w:val="ListBullet"/>
+        <w:ind w:left="360"/>
+      </w:pPr>
+      <w:r>
+        <w:rPr>
+          <w:b/>
+        </w:rPr>
+        <w:t>Spokes</w:t>
+      </w:r>
+      <w:r>
+        <w:t xml:space="preserve"> — a workspace per business area (domain), owned by that domain's team. Each has its **own</w:t>
+      </w:r>
+    </w:p>
+    <w:p>
+      <w:r>
+        <w:t xml:space="preserve">  lakehouse</w:t>
+      </w:r>
+      <w:r>
+        <w:rPr>
+          <w:b/>
+        </w:rPr>
+        <w:t xml:space="preserve"> that </w:t>
+      </w:r>
+      <w:r>
+        <w:t>shortcuts</w:t>
+      </w:r>
+      <w:r>
+        <w:rPr>
+          <w:b/>
+        </w:rPr>
+        <w:t xml:space="preserve"> to the hub's Gold (a pointer, not a copy), plus its own </w:t>
+      </w:r>
+      <w:r>
+        <w:t>semantic</w:t>
+      </w:r>
+    </w:p>
+    <w:p>
+      <w:r>
+        <w:t xml:space="preserve">  models and reports</w:t>
+      </w:r>
+      <w:r>
+        <w:rPr>
+          <w:b/>
+        </w:rPr>
+        <w:t xml:space="preserve">, and — where it needs a T-SQL surface or extra marts — its own </w:t>
+      </w:r>
+      <w:r>
+        <w:t>Warehouse**.</w:t>
+      </w:r>
+    </w:p>
+    <w:p>
+      <w:pPr>
+        <w:pStyle w:val="ListBullet"/>
+        <w:ind w:left="360"/>
+      </w:pPr>
+      <w:r>
+        <w:rPr>
+          <w:b/>
+        </w:rPr>
+        <w:t>OneLake shortcuts</w:t>
+      </w:r>
+      <w:r>
+        <w:t xml:space="preserve"> are references, not copies: the data stays in the hub, governed once, and every</w:t>
+      </w:r>
+    </w:p>
+    <w:p>
+      <w:r>
+        <w:t xml:space="preserve">  spoke sees the same single source of truth.</w:t>
+      </w:r>
+    </w:p>
+    <w:p>
+      <w:pPr>
+        <w:pStyle w:val="Heading3"/>
+      </w:pPr>
+      <w:r/>
+      <w:r>
+        <w:t>Why this is the right design for BCPC</w:t>
+      </w:r>
+    </w:p>
+    <w:p>
+      <w:r>
+        <w:t xml:space="preserve">1. </w:t>
+      </w:r>
+      <w:r>
+        <w:rPr>
+          <w:b/>
+        </w:rPr>
+        <w:t>One copy, one truth.</w:t>
+      </w:r>
+      <w:r>
+        <w:t xml:space="preserve"> Data is ingested once into the hub; spokes reference it. No copies to</w:t>
+      </w:r>
+    </w:p>
+    <w:p>
+      <w:r>
+        <w:t xml:space="preserve">   reconcile, consistent numbers everywhere, lower storage.</w:t>
+      </w:r>
+    </w:p>
+    <w:p>
+      <w:r>
+        <w:t xml:space="preserve">2. </w:t>
+      </w:r>
+      <w:r>
+        <w:rPr>
+          <w:b/>
+        </w:rPr>
+        <w:t>Ownership that matches the org.</w:t>
+      </w:r>
+      <w:r>
+        <w:t xml:space="preserve"> The platform team owns the hub (ingestion, medallion, certified</w:t>
+      </w:r>
+    </w:p>
+    <w:p>
+      <w:r>
+        <w:t xml:space="preserve">   data); domain teams own their spokes (models, reports, marts). It makes the</w:t>
+      </w:r>
+    </w:p>
+    <w:p>
+      <w:r>
+        <w:t xml:space="preserve">   </w:t>
+      </w:r>
+      <w:r>
+        <w:rPr>
+          <w:b/>
+        </w:rPr>
+        <w:t>governance operating model physical</w:t>
+      </w:r>
+      <w:r>
+        <w:t xml:space="preserve">, and maps directly onto </w:t>
+      </w:r>
+      <w:r>
+        <w:rPr>
+          <w:b/>
+        </w:rPr>
+        <w:t>Fabric domains</w:t>
+      </w:r>
+      <w:r>
+        <w:t>.</w:t>
+      </w:r>
+    </w:p>
+    <w:p>
+      <w:r>
+        <w:t xml:space="preserve">3. </w:t>
+      </w:r>
+      <w:r>
+        <w:rPr>
+          <w:b/>
+        </w:rPr>
+        <w:t>Self-service without a bottleneck.</w:t>
+      </w:r>
+      <w:r>
+        <w:t xml:space="preserve"> Domains build freely in their own workspace, on governed and</w:t>
+      </w:r>
+    </w:p>
+    <w:p>
+      <w:r>
+        <w:t xml:space="preserve">   certified data — the platform team isn't in the path of every report.</w:t>
+      </w:r>
+    </w:p>
+    <w:p>
+      <w:r>
+        <w:t xml:space="preserve">4. </w:t>
+      </w:r>
+      <w:r>
+        <w:rPr>
+          <w:b/>
+        </w:rPr>
+        <w:t>Security isolation (a crown-corp fit).</w:t>
+      </w:r>
+      <w:r>
+        <w:t xml:space="preserve"> The hub is </w:t>
+      </w:r>
+      <w:r>
+        <w:rPr>
+          <w:b/>
+        </w:rPr>
+        <w:t>write-locked</w:t>
+      </w:r>
+      <w:r>
+        <w:t xml:space="preserve"> to the platform team; each</w:t>
+      </w:r>
+    </w:p>
+    <w:p>
+      <w:r>
+        <w:t xml:space="preserve">   spoke gets </w:t>
+      </w:r>
+      <w:r>
+        <w:rPr>
+          <w:b/>
+        </w:rPr>
+        <w:t>least-privilege</w:t>
+      </w:r>
+      <w:r>
+        <w:t xml:space="preserve"> access to only the products it needs; **row/column security is</w:t>
+      </w:r>
+    </w:p>
+    <w:p>
+      <w:r>
+        <w:t xml:space="preserve">   defined once at the hub** (OneLake Security) and enforced for every spoke consumer. Blast radius is</w:t>
+      </w:r>
+    </w:p>
+    <w:p>
+      <w:r>
+        <w:t xml:space="preserve">   contained per workspace / capacity.</w:t>
+      </w:r>
+    </w:p>
+    <w:p>
+      <w:r>
+        <w:t xml:space="preserve">5. </w:t>
+      </w:r>
+      <w:r>
+        <w:rPr>
+          <w:b/>
+        </w:rPr>
+        <w:t>Governed consumption.</w:t>
+      </w:r>
+      <w:r>
+        <w:t xml:space="preserve"> Spokes consume </w:t>
+      </w:r>
+      <w:r>
+        <w:rPr>
+          <w:b/>
+        </w:rPr>
+        <w:t>certified</w:t>
+      </w:r>
+      <w:r>
+        <w:t xml:space="preserve"> Gold data products, discovered through</w:t>
+      </w:r>
+    </w:p>
+    <w:p>
+      <w:r>
+        <w:t xml:space="preserve">   domains / the OneLake catalog — the endorsement model applies.</w:t>
+      </w:r>
+    </w:p>
+    <w:p>
+      <w:r>
+        <w:t xml:space="preserve">6. </w:t>
+      </w:r>
+      <w:r>
+        <w:rPr>
+          <w:b/>
+        </w:rPr>
+        <w:t>Cost &amp; capacity isolation.</w:t>
+      </w:r>
+      <w:r>
+        <w:t xml:space="preserve"> Spokes run on </w:t>
+      </w:r>
+      <w:r>
+        <w:rPr>
+          <w:b/>
+        </w:rPr>
+        <w:t>their own capacity</w:t>
+      </w:r>
+      <w:r>
+        <w:t>, so query cost is attributed to</w:t>
+      </w:r>
+    </w:p>
+    <w:p>
+      <w:r>
+        <w:t xml:space="preserve">   the domain that incurs it (chargeback), and a heavy spoke can't starve ingestion.</w:t>
+      </w:r>
+    </w:p>
+    <w:p>
+      <w:r>
+        <w:t xml:space="preserve">7. </w:t>
+      </w:r>
+      <w:r>
+        <w:rPr>
+          <w:b/>
+        </w:rPr>
+        <w:t>Flexibility where it's needed.</w:t>
+      </w:r>
+      <w:r>
+        <w:t xml:space="preserve"> A spoke needing a T-SQL surface or extra marts creates its **own</w:t>
+      </w:r>
+    </w:p>
+    <w:p>
+      <w:r>
+        <w:t xml:space="preserve">   Warehouse** over the hub shortcuts — without polluting the hub or forking the Gold.</w:t>
+      </w:r>
+    </w:p>
+    <w:p>
+      <w:r>
+        <w:t xml:space="preserve">8. </w:t>
+      </w:r>
+      <w:r>
+        <w:rPr>
+          <w:b/>
+        </w:rPr>
+        <w:t>No rework for us.</w:t>
+      </w:r>
+      <w:r>
+        <w:t xml:space="preserve"> Our control plane *is* the hub engine; its **Gold layer is the certified data</w:t>
+      </w:r>
+    </w:p>
+    <w:p>
+      <w:r>
+        <w:t xml:space="preserve">   products** spokes shortcut to. Hub-and-spoke is the consumption topology on top of what we've built.</w:t>
+      </w:r>
+    </w:p>
+    <w:p>
+      <w:pPr>
+        <w:pStyle w:val="Heading3"/>
+      </w:pPr>
+      <w:r/>
+      <w:r>
+        <w:t>Hub vs Spoke — who owns what</w:t>
+      </w:r>
+    </w:p>
+    <w:tbl>
+      <w:tblPr>
+        <w:tblStyle w:val="LightGrid-Accent1"/>
+        <w:tblW w:type="auto" w:w="0"/>
+        <w:tblLook w:firstColumn="1" w:firstRow="1" w:lastColumn="0" w:lastRow="0" w:noHBand="0" w:noVBand="1" w:val="04A0"/>
+      </w:tblPr>
+      <w:tblGrid>
+        <w:gridCol w:w="2880"/>
+        <w:gridCol w:w="2880"/>
+        <w:gridCol w:w="2880"/>
+      </w:tblGrid>
+      <w:tr>
+        <w:tc>
+          <w:tcPr>
+            <w:tcW w:type="dxa" w:w="2880"/>
+          </w:tcPr>
+          <w:p>
+            <w:r>
+              <w:rPr>
+                <w:b/>
+                <w:sz w:val="18"/>
+              </w:rPr>
+            </w:r>
+            <w:r>
+              <w:rPr>
+                <w:b/>
+                <w:sz w:val="18"/>
+              </w:rPr>
+              <w:t>Concern</w:t>
+            </w:r>
+          </w:p>
+        </w:tc>
+        <w:tc>
+          <w:tcPr>
+            <w:tcW w:type="dxa" w:w="2880"/>
+          </w:tcPr>
+          <w:p>
+            <w:r>
+              <w:rPr>
+                <w:b/>
+                <w:sz w:val="18"/>
+              </w:rPr>
+            </w:r>
+            <w:r>
+              <w:rPr>
+                <w:b/>
+                <w:sz w:val="18"/>
+              </w:rPr>
+              <w:t>Hub (Platform team)</w:t>
+            </w:r>
+          </w:p>
+        </w:tc>
+        <w:tc>
+          <w:tcPr>
+            <w:tcW w:type="dxa" w:w="2880"/>
+          </w:tcPr>
+          <w:p>
+            <w:r>
+              <w:rPr>
+                <w:b/>
+                <w:sz w:val="18"/>
+              </w:rPr>
+            </w:r>
+            <w:r>
+              <w:rPr>
+                <w:b/>
+                <w:sz w:val="18"/>
+              </w:rPr>
+              <w:t>Spoke (Domain team)</w:t>
+            </w:r>
+          </w:p>
+        </w:tc>
+      </w:tr>
+      <w:tr>
+        <w:tc>
+          <w:tcPr>
+            <w:tcW w:type="dxa" w:w="2880"/>
+          </w:tcPr>
+          <w:p>
+            <w:r>
+              <w:rPr>
+                <w:sz w:val="18"/>
+              </w:rPr>
+            </w:r>
+            <w:r>
+              <w:rPr>
+                <w:b/>
+                <w:sz w:val="18"/>
+              </w:rPr>
+              <w:t>Owns</w:t>
+            </w:r>
+          </w:p>
+        </w:tc>
+        <w:tc>
+          <w:tcPr>
+            <w:tcW w:type="dxa" w:w="2880"/>
+          </w:tcPr>
+          <w:p>
+            <w:r>
+              <w:rPr>
+                <w:sz w:val="18"/>
+              </w:rPr>
+            </w:r>
+            <w:r>
+              <w:rPr>
+                <w:sz w:val="18"/>
+              </w:rPr>
+              <w:t>ingestion, Bronze / Silver, certified Gold</w:t>
+            </w:r>
+          </w:p>
+        </w:tc>
+        <w:tc>
+          <w:tcPr>
+            <w:tcW w:type="dxa" w:w="2880"/>
+          </w:tcPr>
+          <w:p>
+            <w:r>
+              <w:rPr>
+                <w:sz w:val="18"/>
+              </w:rPr>
+            </w:r>
+            <w:r>
+              <w:rPr>
+                <w:sz w:val="18"/>
+              </w:rPr>
+              <w:t>own lakehouse, warehouse, semantic models, reports</w:t>
+            </w:r>
+          </w:p>
+        </w:tc>
+      </w:tr>
+      <w:tr>
+        <w:tc>
+          <w:tcPr>
+            <w:tcW w:type="dxa" w:w="2880"/>
+          </w:tcPr>
+          <w:p>
+            <w:r>
+              <w:rPr>
+                <w:sz w:val="18"/>
+              </w:rPr>
+            </w:r>
+            <w:r>
+              <w:rPr>
+                <w:b/>
+                <w:sz w:val="18"/>
+              </w:rPr>
+              <w:t>Writes data</w:t>
+            </w:r>
+          </w:p>
+        </w:tc>
+        <w:tc>
+          <w:tcPr>
+            <w:tcW w:type="dxa" w:w="2880"/>
+          </w:tcPr>
+          <w:p>
+            <w:r>
+              <w:rPr>
+                <w:sz w:val="18"/>
+              </w:rPr>
+            </w:r>
+            <w:r>
+              <w:rPr>
+                <w:sz w:val="18"/>
+              </w:rPr>
+              <w:t>yes — only the platform service principal</w:t>
+            </w:r>
+          </w:p>
+        </w:tc>
+        <w:tc>
+          <w:tcPr>
+            <w:tcW w:type="dxa" w:w="2880"/>
+          </w:tcPr>
+          <w:p>
+            <w:r>
+              <w:rPr>
+                <w:sz w:val="18"/>
+              </w:rPr>
+            </w:r>
+            <w:r>
+              <w:rPr>
+                <w:sz w:val="18"/>
+              </w:rPr>
+              <w:t>no writes to the hub; writes only in its own workspace</w:t>
+            </w:r>
+          </w:p>
+        </w:tc>
+      </w:tr>
+      <w:tr>
+        <w:tc>
+          <w:tcPr>
+            <w:tcW w:type="dxa" w:w="2880"/>
+          </w:tcPr>
+          <w:p>
+            <w:r>
+              <w:rPr>
+                <w:sz w:val="18"/>
+              </w:rPr>
+            </w:r>
+            <w:r>
+              <w:rPr>
+                <w:b/>
+                <w:sz w:val="18"/>
+              </w:rPr>
+              <w:t>Consumes</w:t>
+            </w:r>
+          </w:p>
+        </w:tc>
+        <w:tc>
+          <w:tcPr>
+            <w:tcW w:type="dxa" w:w="2880"/>
+          </w:tcPr>
+          <w:p>
+            <w:r>
+              <w:rPr>
+                <w:sz w:val="18"/>
+              </w:rPr>
+            </w:r>
+            <w:r>
+              <w:rPr>
+                <w:sz w:val="18"/>
+              </w:rPr>
+              <w:t>—</w:t>
+            </w:r>
+          </w:p>
+        </w:tc>
+        <w:tc>
+          <w:tcPr>
+            <w:tcW w:type="dxa" w:w="2880"/>
+          </w:tcPr>
+          <w:p>
+            <w:r>
+              <w:rPr>
+                <w:sz w:val="18"/>
+              </w:rPr>
+            </w:r>
+            <w:r>
+              <w:rPr>
+                <w:sz w:val="18"/>
+              </w:rPr>
+              <w:t>shortcuts to hub Gold (no copy)</w:t>
+            </w:r>
+          </w:p>
+        </w:tc>
+      </w:tr>
+      <w:tr>
+        <w:tc>
+          <w:tcPr>
+            <w:tcW w:type="dxa" w:w="2880"/>
+          </w:tcPr>
+          <w:p>
+            <w:r>
+              <w:rPr>
+                <w:sz w:val="18"/>
+              </w:rPr>
+            </w:r>
+            <w:r>
+              <w:rPr>
+                <w:b/>
+                <w:sz w:val="18"/>
+              </w:rPr>
+              <w:t>Security</w:t>
+            </w:r>
+          </w:p>
+        </w:tc>
+        <w:tc>
+          <w:tcPr>
+            <w:tcW w:type="dxa" w:w="2880"/>
+          </w:tcPr>
+          <w:p>
+            <w:r>
+              <w:rPr>
+                <w:sz w:val="18"/>
+              </w:rPr>
+            </w:r>
+            <w:r>
+              <w:rPr>
+                <w:sz w:val="18"/>
+              </w:rPr>
+              <w:t>defines RLS / CLS / masking once (OneLake Security)</w:t>
+            </w:r>
+          </w:p>
+        </w:tc>
+        <w:tc>
+          <w:tcPr>
+            <w:tcW w:type="dxa" w:w="2880"/>
+          </w:tcPr>
+          <w:p>
+            <w:r>
+              <w:rPr>
+                <w:sz w:val="18"/>
+              </w:rPr>
+            </w:r>
+            <w:r>
+              <w:rPr>
+                <w:sz w:val="18"/>
+              </w:rPr>
+              <w:t>inherits hub security; sets report / item access</w:t>
+            </w:r>
+          </w:p>
+        </w:tc>
+      </w:tr>
+      <w:tr>
+        <w:tc>
+          <w:tcPr>
+            <w:tcW w:type="dxa" w:w="2880"/>
+          </w:tcPr>
+          <w:p>
+            <w:r>
+              <w:rPr>
+                <w:sz w:val="18"/>
+              </w:rPr>
+            </w:r>
+            <w:r>
+              <w:rPr>
+                <w:b/>
+                <w:sz w:val="18"/>
+              </w:rPr>
+              <w:t>Capacity</w:t>
+            </w:r>
+          </w:p>
+        </w:tc>
+        <w:tc>
+          <w:tcPr>
+            <w:tcW w:type="dxa" w:w="2880"/>
+          </w:tcPr>
+          <w:p>
+            <w:r>
+              <w:rPr>
+                <w:sz w:val="18"/>
+              </w:rPr>
+            </w:r>
+            <w:r>
+              <w:rPr>
+                <w:sz w:val="18"/>
+              </w:rPr>
+              <w:t>platform capacity</w:t>
+            </w:r>
+          </w:p>
+        </w:tc>
+        <w:tc>
+          <w:tcPr>
+            <w:tcW w:type="dxa" w:w="2880"/>
+          </w:tcPr>
+          <w:p>
+            <w:r>
+              <w:rPr>
+                <w:sz w:val="18"/>
+              </w:rPr>
+            </w:r>
+            <w:r>
+              <w:rPr>
+                <w:sz w:val="18"/>
+              </w:rPr>
+              <w:t>its own capacity (chargeback)</w:t>
+            </w:r>
+          </w:p>
+        </w:tc>
+      </w:tr>
+      <w:tr>
+        <w:tc>
+          <w:tcPr>
+            <w:tcW w:type="dxa" w:w="2880"/>
+          </w:tcPr>
+          <w:p>
+            <w:r>
+              <w:rPr>
+                <w:sz w:val="18"/>
+              </w:rPr>
+            </w:r>
+            <w:r>
+              <w:rPr>
+                <w:b/>
+                <w:sz w:val="18"/>
+              </w:rPr>
+              <w:t>Governance</w:t>
+            </w:r>
+          </w:p>
+        </w:tc>
+        <w:tc>
+          <w:tcPr>
+            <w:tcW w:type="dxa" w:w="2880"/>
+          </w:tcPr>
+          <w:p>
+            <w:r>
+              <w:rPr>
+                <w:sz w:val="18"/>
+              </w:rPr>
+            </w:r>
+            <w:r>
+              <w:rPr>
+                <w:sz w:val="18"/>
+              </w:rPr>
+              <w:t>certifies data products</w:t>
+            </w:r>
+          </w:p>
+        </w:tc>
+        <w:tc>
+          <w:tcPr>
+            <w:tcW w:type="dxa" w:w="2880"/>
+          </w:tcPr>
+          <w:p>
+            <w:r>
+              <w:rPr>
+                <w:sz w:val="18"/>
+              </w:rPr>
+            </w:r>
+            <w:r>
+              <w:rPr>
+                <w:sz w:val="18"/>
+              </w:rPr>
+              <w:t>consumes certified products; certifies its own reports/models</w:t>
+            </w:r>
+          </w:p>
+        </w:tc>
+      </w:tr>
+    </w:tbl>
+    <w:p/>
+    <w:p>
+      <w:pPr>
+        <w:pStyle w:val="Heading3"/>
+      </w:pPr>
+      <w:r/>
+      <w:r>
+        <w:t>Design considerations to get right</w:t>
+      </w:r>
+    </w:p>
+    <w:p>
+      <w:r>
+        <w:t>*Honest trade-offs — the pattern is sound, but a few things must be designed deliberately for a</w:t>
+      </w:r>
+    </w:p>
+    <w:p>
+      <w:r>
+        <w:t>security-sensitive shop.*</w:t>
+      </w:r>
+    </w:p>
+    <w:tbl>
+      <w:tblPr>
+        <w:tblStyle w:val="LightGrid-Accent1"/>
+        <w:tblW w:type="auto" w:w="0"/>
+        <w:tblLook w:firstColumn="1" w:firstRow="1" w:lastColumn="0" w:lastRow="0" w:noHBand="0" w:noVBand="1" w:val="04A0"/>
+      </w:tblPr>
+      <w:tblGrid>
+        <w:gridCol w:w="4320"/>
+        <w:gridCol w:w="4320"/>
+      </w:tblGrid>
+      <w:tr>
+        <w:tc>
+          <w:tcPr>
+            <w:tcW w:type="dxa" w:w="4320"/>
+          </w:tcPr>
+          <w:p>
+            <w:r>
+              <w:rPr>
+                <w:b/>
+                <w:sz w:val="18"/>
+              </w:rPr>
+            </w:r>
+            <w:r>
+              <w:rPr>
+                <w:b/>
+                <w:sz w:val="18"/>
+              </w:rPr>
+              <w:t>Consideration</w:t>
+            </w:r>
+          </w:p>
+        </w:tc>
+        <w:tc>
+          <w:tcPr>
+            <w:tcW w:type="dxa" w:w="4320"/>
+          </w:tcPr>
+          <w:p>
+            <w:r>
+              <w:rPr>
+                <w:b/>
+                <w:sz w:val="18"/>
+              </w:rPr>
+            </w:r>
+            <w:r>
+              <w:rPr>
+                <w:b/>
+                <w:sz w:val="18"/>
+              </w:rPr>
+              <w:t>What to do</w:t>
+            </w:r>
+          </w:p>
+        </w:tc>
+      </w:tr>
+      <w:tr>
+        <w:tc>
+          <w:tcPr>
+            <w:tcW w:type="dxa" w:w="4320"/>
+          </w:tcPr>
+          <w:p>
+            <w:r>
+              <w:rPr>
+                <w:sz w:val="18"/>
+              </w:rPr>
+            </w:r>
+            <w:r>
+              <w:rPr>
+                <w:b/>
+                <w:sz w:val="18"/>
+              </w:rPr>
+              <w:t>RLS through shortcuts</w:t>
+            </w:r>
+          </w:p>
+        </w:tc>
+        <w:tc>
+          <w:tcPr>
+            <w:tcW w:type="dxa" w:w="4320"/>
+          </w:tcPr>
+          <w:p>
+            <w:r>
+              <w:rPr>
+                <w:sz w:val="18"/>
+              </w:rPr>
+            </w:r>
+            <w:r>
+              <w:rPr>
+                <w:sz w:val="18"/>
+              </w:rPr>
+              <w:t xml:space="preserve">Define row/column security at the </w:t>
+            </w:r>
+            <w:r>
+              <w:rPr>
+                <w:b/>
+                <w:sz w:val="18"/>
+              </w:rPr>
+              <w:t>hub</w:t>
+            </w:r>
+            <w:r>
+              <w:rPr>
+                <w:sz w:val="18"/>
+              </w:rPr>
+              <w:t xml:space="preserve"> using </w:t>
+            </w:r>
+            <w:r>
+              <w:rPr>
+                <w:b/>
+                <w:sz w:val="18"/>
+              </w:rPr>
+              <w:t>OneLake Security</w:t>
+            </w:r>
+            <w:r>
+              <w:rPr>
+                <w:sz w:val="18"/>
+              </w:rPr>
+              <w:t xml:space="preserve"> (storage-layer). Column security flows to consumers, and hub-side row security is enforced — but RLS propagation through cross-workspace shortcuts has </w:t>
+            </w:r>
+            <w:r>
+              <w:rPr>
+                <w:b/>
+                <w:sz w:val="18"/>
+              </w:rPr>
+              <w:t>known gotchas</w:t>
+            </w:r>
+            <w:r>
+              <w:rPr>
+                <w:sz w:val="18"/>
+              </w:rPr>
+              <w:t xml:space="preserve"> if done the older way, so </w:t>
+            </w:r>
+            <w:r>
+              <w:rPr>
+                <w:b/>
+                <w:sz w:val="18"/>
+              </w:rPr>
+              <w:t>validate</w:t>
+            </w:r>
+            <w:r>
+              <w:rPr>
+                <w:sz w:val="18"/>
+              </w:rPr>
+              <w:t xml:space="preserve"> that a spoke user sees only permitted rows/columns *before go-live*.</w:t>
+            </w:r>
+          </w:p>
+        </w:tc>
+      </w:tr>
+      <w:tr>
+        <w:tc>
+          <w:tcPr>
+            <w:tcW w:type="dxa" w:w="4320"/>
+          </w:tcPr>
+          <w:p>
+            <w:r>
+              <w:rPr>
+                <w:sz w:val="18"/>
+              </w:rPr>
+            </w:r>
+            <w:r>
+              <w:rPr>
+                <w:b/>
+                <w:sz w:val="18"/>
+              </w:rPr>
+              <w:t>Shortcut, don't re-copy</w:t>
+            </w:r>
+          </w:p>
+        </w:tc>
+        <w:tc>
+          <w:tcPr>
+            <w:tcW w:type="dxa" w:w="4320"/>
+          </w:tcPr>
+          <w:p>
+            <w:r>
+              <w:rPr>
+                <w:sz w:val="18"/>
+              </w:rPr>
+            </w:r>
+            <w:r>
+              <w:rPr>
+                <w:sz w:val="18"/>
+              </w:rPr>
+              <w:t xml:space="preserve">Standard: spokes </w:t>
+            </w:r>
+            <w:r>
+              <w:rPr>
+                <w:b/>
+                <w:sz w:val="18"/>
+              </w:rPr>
+              <w:t>reference</w:t>
+            </w:r>
+            <w:r>
+              <w:rPr>
+                <w:sz w:val="18"/>
+              </w:rPr>
+              <w:t xml:space="preserve"> hub Gold by shortcut and must not re-ingest or copy it — prevents drift and duplicate governance.</w:t>
+            </w:r>
+          </w:p>
+        </w:tc>
+      </w:tr>
+      <w:tr>
+        <w:tc>
+          <w:tcPr>
+            <w:tcW w:type="dxa" w:w="4320"/>
+          </w:tcPr>
+          <w:p>
+            <w:r>
+              <w:rPr>
+                <w:sz w:val="18"/>
+              </w:rPr>
+            </w:r>
+            <w:r>
+              <w:rPr>
+                <w:b/>
+                <w:sz w:val="18"/>
+              </w:rPr>
+              <w:t>Data-product contracts</w:t>
+            </w:r>
+          </w:p>
+        </w:tc>
+        <w:tc>
+          <w:tcPr>
+            <w:tcW w:type="dxa" w:w="4320"/>
+          </w:tcPr>
+          <w:p>
+            <w:r>
+              <w:rPr>
+                <w:sz w:val="18"/>
+              </w:rPr>
+            </w:r>
+            <w:r>
+              <w:rPr>
+                <w:sz w:val="18"/>
+              </w:rPr>
+              <w:t xml:space="preserve">Hub Gold schema changes ripple to spokes; treat Gold as </w:t>
+            </w:r>
+            <w:r>
+              <w:rPr>
+                <w:b/>
+                <w:sz w:val="18"/>
+              </w:rPr>
+              <w:t>versioned contracts</w:t>
+            </w:r>
+            <w:r>
+              <w:rPr>
+                <w:sz w:val="18"/>
+              </w:rPr>
+              <w:t xml:space="preserve"> with change notice to consumers.</w:t>
+            </w:r>
+          </w:p>
+        </w:tc>
+      </w:tr>
+      <w:tr>
+        <w:tc>
+          <w:tcPr>
+            <w:tcW w:type="dxa" w:w="4320"/>
+          </w:tcPr>
+          <w:p>
+            <w:r>
+              <w:rPr>
+                <w:sz w:val="18"/>
+              </w:rPr>
+            </w:r>
+            <w:r>
+              <w:rPr>
+                <w:b/>
+                <w:sz w:val="18"/>
+              </w:rPr>
+              <w:t>Warehouses extend, not re-derive</w:t>
+            </w:r>
+          </w:p>
+        </w:tc>
+        <w:tc>
+          <w:tcPr>
+            <w:tcW w:type="dxa" w:w="4320"/>
+          </w:tcPr>
+          <w:p>
+            <w:r>
+              <w:rPr>
+                <w:sz w:val="18"/>
+              </w:rPr>
+            </w:r>
+            <w:r>
+              <w:rPr>
+                <w:sz w:val="18"/>
+              </w:rPr>
+              <w:t xml:space="preserve">Spoke warehouses build marts </w:t>
+            </w:r>
+            <w:r>
+              <w:rPr>
+                <w:b/>
+                <w:sz w:val="18"/>
+              </w:rPr>
+              <w:t>on top of</w:t>
+            </w:r>
+            <w:r>
+              <w:rPr>
+                <w:sz w:val="18"/>
+              </w:rPr>
+              <w:t xml:space="preserve"> certified Gold; they should not re-implement the Gold transformations (avoids logic drift).</w:t>
+            </w:r>
+          </w:p>
+        </w:tc>
+      </w:tr>
+      <w:tr>
+        <w:tc>
+          <w:tcPr>
+            <w:tcW w:type="dxa" w:w="4320"/>
+          </w:tcPr>
+          <w:p>
+            <w:r>
+              <w:rPr>
+                <w:sz w:val="18"/>
+              </w:rPr>
+            </w:r>
+            <w:r>
+              <w:rPr>
+                <w:b/>
+                <w:sz w:val="18"/>
+              </w:rPr>
+              <w:t>Direct Lake over shortcuts</w:t>
+            </w:r>
+          </w:p>
+        </w:tc>
+        <w:tc>
+          <w:tcPr>
+            <w:tcW w:type="dxa" w:w="4320"/>
+          </w:tcPr>
+          <w:p>
+            <w:r>
+              <w:rPr>
+                <w:sz w:val="18"/>
+              </w:rPr>
+            </w:r>
+            <w:r>
+              <w:rPr>
+                <w:sz w:val="18"/>
+              </w:rPr>
+              <w:t xml:space="preserve">Semantic models can use </w:t>
+            </w:r>
+            <w:r>
+              <w:rPr>
+                <w:b/>
+                <w:sz w:val="18"/>
+              </w:rPr>
+              <w:t>Direct Lake</w:t>
+            </w:r>
+            <w:r>
+              <w:rPr>
+                <w:sz w:val="18"/>
+              </w:rPr>
+              <w:t xml:space="preserve"> on shortcuts to Delta Gold; validate there's no unexpected DirectQuery fallback for your cases.</w:t>
+            </w:r>
+          </w:p>
+        </w:tc>
+      </w:tr>
+      <w:tr>
+        <w:tc>
+          <w:tcPr>
+            <w:tcW w:type="dxa" w:w="4320"/>
+          </w:tcPr>
+          <w:p>
+            <w:r>
+              <w:rPr>
+                <w:sz w:val="18"/>
+              </w:rPr>
+            </w:r>
+            <w:r>
+              <w:rPr>
+                <w:b/>
+                <w:sz w:val="18"/>
+              </w:rPr>
+              <w:t>Capacity planning</w:t>
+            </w:r>
+          </w:p>
+        </w:tc>
+        <w:tc>
+          <w:tcPr>
+            <w:tcW w:type="dxa" w:w="4320"/>
+          </w:tcPr>
+          <w:p>
+            <w:r>
+              <w:rPr>
+                <w:sz w:val="18"/>
+              </w:rPr>
+            </w:r>
+            <w:r>
+              <w:rPr>
+                <w:sz w:val="18"/>
+              </w:rPr>
+              <w:t xml:space="preserve">Shortcut query compute is billed to the </w:t>
+            </w:r>
+            <w:r>
+              <w:rPr>
+                <w:b/>
+                <w:sz w:val="18"/>
+              </w:rPr>
+              <w:t>consuming</w:t>
+            </w:r>
+            <w:r>
+              <w:rPr>
+                <w:sz w:val="18"/>
+              </w:rPr>
+              <w:t xml:space="preserve"> spoke's capacity — good for chargeback, but size each spoke capacity for its workload.</w:t>
+            </w:r>
+          </w:p>
+        </w:tc>
+      </w:tr>
+      <w:tr>
+        <w:tc>
+          <w:tcPr>
+            <w:tcW w:type="dxa" w:w="4320"/>
+          </w:tcPr>
+          <w:p>
+            <w:r>
+              <w:rPr>
+                <w:sz w:val="18"/>
+              </w:rPr>
+            </w:r>
+            <w:r>
+              <w:rPr>
+                <w:b/>
+                <w:sz w:val="18"/>
+              </w:rPr>
+              <w:t>Environment model still applies</w:t>
+            </w:r>
+          </w:p>
+        </w:tc>
+        <w:tc>
+          <w:tcPr>
+            <w:tcW w:type="dxa" w:w="4320"/>
+          </w:tcPr>
+          <w:p>
+            <w:r>
+              <w:rPr>
+                <w:sz w:val="18"/>
+              </w:rPr>
+            </w:r>
+            <w:r>
+              <w:rPr>
+                <w:sz w:val="18"/>
+              </w:rPr>
+              <w:t xml:space="preserve">Each of </w:t>
+            </w:r>
+            <w:r>
+              <w:rPr>
+                <w:b/>
+                <w:sz w:val="18"/>
+              </w:rPr>
+              <w:t>DEV / UAT / PROD</w:t>
+            </w:r>
+            <w:r>
+              <w:rPr>
+                <w:sz w:val="18"/>
+              </w:rPr>
+              <w:t xml:space="preserve"> has its own hub *and* its own spokes; the promotion and access rules in the Security section apply within each environment.</w:t>
+            </w:r>
+          </w:p>
+        </w:tc>
+      </w:tr>
+    </w:tbl>
+    <w:p/>
+    <w:p>
+      <w:r>
+        <w:t xml:space="preserve">&gt; </w:t>
+      </w:r>
+      <w:r>
+        <w:rPr>
+          <w:b/>
+        </w:rPr>
+        <w:t>How it maps to the milestones.</w:t>
+      </w:r>
+      <w:r>
+        <w:t xml:space="preserve"> This topology realizes Milestone 1's *Define Workspace Structure*,</w:t>
+      </w:r>
+    </w:p>
+    <w:p>
+      <w:r>
+        <w:t>&gt; *Domain Alignment Strategy*, *Lakehouse Organization Standards*, and *Data Sharing Standards*; the</w:t>
+      </w:r>
+    </w:p>
+    <w:p>
+      <w:r>
+        <w:t>&gt; Milestone 3 semantic models and reports are what live in the spokes.</w:t>
+      </w:r>
+    </w:p>
     <w:p>
       <w:pPr>
         <w:pStyle w:val="Heading2"/>
@@ -6640,7 +8057,7 @@
         <w:drawing>
           <wp:inline xmlns:a="http://schemas.openxmlformats.org/drawingml/2006/main" xmlns:pic="http://schemas.openxmlformats.org/drawingml/2006/picture">
             <wp:extent cx="5669280" cy="1879761"/>
-            <wp:docPr id="9" name="Picture 9"/>
+            <wp:docPr id="10" name="Picture 10"/>
             <wp:cNvGraphicFramePr>
               <a:graphicFrameLocks noChangeAspect="1"/>
             </wp:cNvGraphicFramePr>
@@ -6652,7 +8069,7 @@
                     <pic:cNvPicPr/>
                   </pic:nvPicPr>
                   <pic:blipFill>
-                    <a:blip r:embed="rId17"/>
+                    <a:blip r:embed="rId18"/>
                     <a:stretch>
                       <a:fillRect/>
                     </a:stretch>
@@ -7243,7 +8660,7 @@
         <w:drawing>
           <wp:inline xmlns:a="http://schemas.openxmlformats.org/drawingml/2006/main" xmlns:pic="http://schemas.openxmlformats.org/drawingml/2006/picture">
             <wp:extent cx="5669280" cy="14419690"/>
-            <wp:docPr id="10" name="Picture 10"/>
+            <wp:docPr id="11" name="Picture 11"/>
             <wp:cNvGraphicFramePr>
               <a:graphicFrameLocks noChangeAspect="1"/>
             </wp:cNvGraphicFramePr>
@@ -7255,7 +8672,7 @@
                     <pic:cNvPicPr/>
                   </pic:nvPicPr>
                   <pic:blipFill>
-                    <a:blip r:embed="rId18"/>
+                    <a:blip r:embed="rId19"/>
                     <a:stretch>
                       <a:fillRect/>
                     </a:stretch>
@@ -7441,7 +8858,7 @@
         <w:drawing>
           <wp:inline xmlns:a="http://schemas.openxmlformats.org/drawingml/2006/main" xmlns:pic="http://schemas.openxmlformats.org/drawingml/2006/picture">
             <wp:extent cx="5669280" cy="2746516"/>
-            <wp:docPr id="11" name="Picture 11"/>
+            <wp:docPr id="12" name="Picture 12"/>
             <wp:cNvGraphicFramePr>
               <a:graphicFrameLocks noChangeAspect="1"/>
             </wp:cNvGraphicFramePr>
@@ -7453,7 +8870,7 @@
                     <pic:cNvPicPr/>
                   </pic:nvPicPr>
                   <pic:blipFill>
-                    <a:blip r:embed="rId19"/>
+                    <a:blip r:embed="rId20"/>
                     <a:stretch>
                       <a:fillRect/>
                     </a:stretch>
@@ -7915,7 +9332,7 @@
         <w:drawing>
           <wp:inline xmlns:a="http://schemas.openxmlformats.org/drawingml/2006/main" xmlns:pic="http://schemas.openxmlformats.org/drawingml/2006/picture">
             <wp:extent cx="5669280" cy="841019"/>
-            <wp:docPr id="12" name="Picture 12"/>
+            <wp:docPr id="13" name="Picture 13"/>
             <wp:cNvGraphicFramePr>
               <a:graphicFrameLocks noChangeAspect="1"/>
             </wp:cNvGraphicFramePr>
@@ -7927,7 +9344,7 @@
                     <pic:cNvPicPr/>
                   </pic:nvPicPr>
                   <pic:blipFill>
-                    <a:blip r:embed="rId20"/>
+                    <a:blip r:embed="rId21"/>
                     <a:stretch>
                       <a:fillRect/>
                     </a:stretch>

</xml_diff>

<commit_message>
Fabric guide: add hub/spoke CI/CD promotion, lower-env spokes guidance, template extensibility + reference links
Answer the CICD questions: three promotion tracks (hub content via config-as-code; spoke scaffold
via deployment template per env; spoke content via Fabric Git + deployment pipelines). Critical
rule: shortcuts provisioned per-env pointing at env-local hub, never promoted cross-env. Recommend
standing up spokes in lower envs (min UAT+PROD for business sign-off; full DEV+UAT+PROD for
builders). Feature workspaces are a natural manifest/cp_bootstrap extension (workspace+lakehouse+
env-local shortcuts+roles+capacity). Added provisioned-vs-promoted matrix, template steps, and a
References section with Microsoft Learn links (converted to inline links for docx compatibility).
</commit_message>
<xml_diff>
--- a/milestone-guide/fabric-milestone-guide.docx
+++ b/milestone-guide/fabric-milestone-guide.docx
@@ -7541,7 +7541,7 @@
               <w:rPr>
                 <w:sz w:val="18"/>
               </w:rPr>
-              <w:t xml:space="preserve"> that a spoke user sees only permitted rows/columns *before go-live*.</w:t>
+              <w:t xml:space="preserve"> that a spoke user sees only permitted rows/columns *before go-live* (see References).</w:t>
             </w:r>
           </w:p>
         </w:tc>
@@ -7860,193 +7860,32 @@
       </w:tr>
     </w:tbl>
     <w:p/>
-    <w:p>
-      <w:r>
-        <w:t xml:space="preserve">&gt; </w:t>
-      </w:r>
-      <w:r>
-        <w:rPr>
-          <w:b/>
-        </w:rPr>
-        <w:t>How it maps to the milestones.</w:t>
-      </w:r>
-      <w:r>
-        <w:t xml:space="preserve"> This topology realizes Milestone 1's *Define Workspace Structure*,</w:t>
-      </w:r>
-    </w:p>
-    <w:p>
-      <w:r>
-        <w:t>&gt; *Domain Alignment Strategy*, *Lakehouse Organization Standards*, and *Data Sharing Standards*; the</w:t>
-      </w:r>
-    </w:p>
-    <w:p>
-      <w:r>
-        <w:t>&gt; Milestone 3 semantic models and reports are what live in the spokes.</w:t>
-      </w:r>
-    </w:p>
-    <w:p>
-      <w:pPr>
-        <w:pStyle w:val="Heading2"/>
-      </w:pPr>
-      <w:r/>
-      <w:r>
-        <w:t>Security, Access &amp; Environment Model — best-practice design</w:t>
-      </w:r>
-    </w:p>
-    <w:p>
-      <w:r>
-        <w:t>*BCPC is a government crown corporation: access control, data privacy, and environment isolation are</w:t>
-      </w:r>
-    </w:p>
-    <w:p>
-      <w:r>
-        <w:t>first-order requirements, not afterthoughts. This section expands the Security and Governance items</w:t>
-      </w:r>
-    </w:p>
-    <w:p>
-      <w:r>
-        <w:t>above into a concrete, best-practice design. It is a recommendation to adopt and refine with BCPC's</w:t>
-      </w:r>
-    </w:p>
-    <w:p>
-      <w:r>
-        <w:t>security team — the platform already provides the enforcement mechanisms it relies on.*</w:t>
-      </w:r>
-    </w:p>
-    <w:p>
-      <w:r>
-        <w:rPr>
-          <w:b/>
-        </w:rPr>
-        <w:t>Guiding principles</w:t>
-      </w:r>
-    </w:p>
-    <w:p>
-      <w:pPr>
-        <w:pStyle w:val="ListBullet"/>
-        <w:ind w:left="360"/>
-      </w:pPr>
-      <w:r>
-        <w:rPr>
-          <w:b/>
-        </w:rPr>
-        <w:t>Group-based, never individual.</w:t>
-      </w:r>
-      <w:r>
-        <w:t xml:space="preserve"> All access is granted to Microsoft Entra ID security groups; you</w:t>
-      </w:r>
-    </w:p>
-    <w:p>
-      <w:r>
-        <w:t xml:space="preserve">  change *membership*, never per-person permissions.</w:t>
-      </w:r>
-    </w:p>
-    <w:p>
-      <w:pPr>
-        <w:pStyle w:val="ListBullet"/>
-        <w:ind w:left="360"/>
-      </w:pPr>
-      <w:r>
-        <w:rPr>
-          <w:b/>
-        </w:rPr>
-        <w:t>Least privilege + just-in-time.</w:t>
-      </w:r>
-      <w:r>
-        <w:t xml:space="preserve"> People get the minimum role; privileged and production access is</w:t>
-      </w:r>
-    </w:p>
-    <w:p>
-      <w:r>
-        <w:t xml:space="preserve">  granted on demand through </w:t>
-      </w:r>
-      <w:r>
-        <w:rPr>
-          <w:b/>
-        </w:rPr>
-        <w:t>PIM</w:t>
-      </w:r>
-      <w:r>
-        <w:t xml:space="preserve"> (Privileged Identity Management) with approval — not standing.</w:t>
-      </w:r>
-    </w:p>
-    <w:p>
-      <w:pPr>
-        <w:pStyle w:val="ListBullet"/>
-        <w:ind w:left="360"/>
-      </w:pPr>
-      <w:r>
-        <w:rPr>
-          <w:b/>
-        </w:rPr>
-        <w:t>People and machines don't mix.</w:t>
-      </w:r>
-      <w:r>
-        <w:t xml:space="preserve"> Humans never authenticate as service principals; automation never</w:t>
-      </w:r>
-    </w:p>
-    <w:p>
-      <w:r>
-        <w:t xml:space="preserve">  runs as a personal account.</w:t>
-      </w:r>
-    </w:p>
-    <w:p>
-      <w:pPr>
-        <w:pStyle w:val="ListBullet"/>
-        <w:ind w:left="360"/>
-      </w:pPr>
-      <w:r>
-        <w:rPr>
-          <w:b/>
-        </w:rPr>
-        <w:t>Production data stays in production.</w:t>
-      </w:r>
-      <w:r>
-        <w:t xml:space="preserve"> Lower environments use masked, synthetic, or subset data.</w:t>
-      </w:r>
-    </w:p>
-    <w:p>
-      <w:pPr>
-        <w:pStyle w:val="ListBullet"/>
-        <w:ind w:left="360"/>
-      </w:pPr>
-      <w:r>
-        <w:rPr>
-          <w:b/>
-        </w:rPr>
-        <w:t>Change production only by promotion.</w:t>
-      </w:r>
-      <w:r>
-        <w:t xml:space="preserve"> No manual edits in PROD — changes flow through the</w:t>
-      </w:r>
-    </w:p>
-    <w:p>
-      <w:r>
-        <w:t xml:space="preserve">  deployment pipeline, executed by a service principal.</w:t>
-      </w:r>
-    </w:p>
-    <w:p>
-      <w:pPr>
-        <w:pStyle w:val="ListBullet"/>
-        <w:ind w:left="360"/>
-      </w:pPr>
-      <w:r>
-        <w:rPr>
-          <w:b/>
-        </w:rPr>
-        <w:t>Everything is auditable.</w:t>
-      </w:r>
-      <w:r>
-        <w:t xml:space="preserve"> Access grants, data reads, and pipeline actions are all logged.</w:t>
-      </w:r>
-    </w:p>
     <w:p>
       <w:pPr>
         <w:pStyle w:val="Heading3"/>
       </w:pPr>
       <w:r/>
       <w:r>
-        <w:t>Entra ID security model</w:t>
+        <w:t>Promotion &amp; CI/CD across hub and spokes</w:t>
+      </w:r>
+    </w:p>
+    <w:p>
+      <w:r>
+        <w:t xml:space="preserve">*Two things get promoted, by two owners, on </w:t>
+      </w:r>
+      <w:r>
+        <w:rPr>
+          <w:b/>
+        </w:rPr>
+        <w:t>three tracks</w:t>
+      </w:r>
+      <w:r>
+        <w:t xml:space="preserve"> — plus the template that stamps out the</w:t>
+      </w:r>
+    </w:p>
+    <w:p>
+      <w:r>
+        <w:t>spoke skeletons.*</w:t>
       </w:r>
     </w:p>
     <w:p>
@@ -8056,7 +7895,7 @@
       <w:r>
         <w:drawing>
           <wp:inline xmlns:a="http://schemas.openxmlformats.org/drawingml/2006/main" xmlns:pic="http://schemas.openxmlformats.org/drawingml/2006/picture">
-            <wp:extent cx="5669280" cy="1879761"/>
+            <wp:extent cx="5669280" cy="1078654"/>
             <wp:docPr id="10" name="Picture 10"/>
             <wp:cNvGraphicFramePr>
               <a:graphicFrameLocks noChangeAspect="1"/>
@@ -8077,7 +7916,7 @@
                   <pic:spPr>
                     <a:xfrm>
                       <a:off x="0" y="0"/>
-                      <a:ext cx="5669280" cy="1879761"/>
+                      <a:ext cx="5669280" cy="1078654"/>
                     </a:xfrm>
                     <a:prstGeom prst="rect"/>
                   </pic:spPr>
@@ -8089,22 +7928,180 @@
       </w:r>
     </w:p>
     <w:p>
-      <w:r>
-        <w:t xml:space="preserve">Access is assigned to </w:t>
-      </w:r>
+      <w:pPr>
+        <w:pStyle w:val="ListBullet"/>
+        <w:ind w:left="360"/>
+      </w:pPr>
       <w:r>
         <w:rPr>
           <w:b/>
         </w:rPr>
-        <w:t>groups</w:t>
-      </w:r>
-      <w:r>
-        <w:t>, and the groups are assigned to workspaces and capacities. Adding or</w:t>
+        <w:t>Hub content — platform team, config-as-code.</w:t>
+      </w:r>
+      <w:r>
+        <w:t xml:space="preserve"> Our control plane already promotes the whole</w:t>
       </w:r>
     </w:p>
     <w:p>
       <w:r>
-        <w:t>removing a person is a membership change — the permission model never changes.</w:t>
+        <w:t xml:space="preserve">  medallion (ingestion, DQ, gold, security) </w:t>
+      </w:r>
+      <w:r>
+        <w:rPr>
+          <w:b/>
+        </w:rPr>
+        <w:t>identically</w:t>
+      </w:r>
+      <w:r>
+        <w:t xml:space="preserve"> DEV → UAT → PROD via GitHub Actions →</w:t>
+      </w:r>
+    </w:p>
+    <w:p>
+      <w:r>
+        <w:t xml:space="preserve">  </w:t>
+      </w:r>
+      <w:r>
+        <w:rPr>
+          <w:rFonts w:ascii="Consolas" w:hAnsi="Consolas"/>
+          <w:color w:val="A31F34"/>
+        </w:rPr>
+        <w:t>cp_bootstrap</w:t>
+      </w:r>
+      <w:r>
+        <w:t xml:space="preserve"> / </w:t>
+      </w:r>
+      <w:r>
+        <w:rPr>
+          <w:rFonts w:ascii="Consolas" w:hAnsi="Consolas"/>
+          <w:color w:val="A31F34"/>
+        </w:rPr>
+        <w:t>cp_config</w:t>
+      </w:r>
+      <w:r>
+        <w:t>. The deploy service principal is the only identity that changes PROD.</w:t>
+      </w:r>
+    </w:p>
+    <w:p>
+      <w:pPr>
+        <w:pStyle w:val="ListBullet"/>
+        <w:ind w:left="360"/>
+      </w:pPr>
+      <w:r>
+        <w:rPr>
+          <w:b/>
+        </w:rPr>
+        <w:t>Spoke scaffold — platform team, deployment template.</w:t>
+      </w:r>
+      <w:r>
+        <w:t xml:space="preserve"> The same template provisions each</w:t>
+      </w:r>
+    </w:p>
+    <w:p>
+      <w:r>
+        <w:t xml:space="preserve">  predefined spoke workspace </w:t>
+      </w:r>
+      <w:r>
+        <w:rPr>
+          <w:b/>
+        </w:rPr>
+        <w:t>per environment</w:t>
+      </w:r>
+      <w:r>
+        <w:t>: the workspace, its lakehouse, its **shortcuts to</w:t>
+      </w:r>
+    </w:p>
+    <w:p>
+      <w:r>
+        <w:t xml:space="preserve">  that environment's hub Gold**, Entra role assignments, and capacity. One command, all environments.</w:t>
+      </w:r>
+    </w:p>
+    <w:p>
+      <w:pPr>
+        <w:pStyle w:val="ListBullet"/>
+        <w:ind w:left="360"/>
+      </w:pPr>
+      <w:r>
+        <w:rPr>
+          <w:b/>
+        </w:rPr>
+        <w:t>Spoke content — domain teams, Fabric CI/CD.</w:t>
+      </w:r>
+      <w:r>
+        <w:t xml:space="preserve"> Each domain owns its reports, semantic models, and</w:t>
+      </w:r>
+    </w:p>
+    <w:p>
+      <w:r>
+        <w:t xml:space="preserve">  any warehouse logic, and promotes them DEV-spoke → UAT-spoke → PROD-spoke using **Git integration +</w:t>
+      </w:r>
+    </w:p>
+    <w:p>
+      <w:r>
+        <w:t xml:space="preserve">  Fabric deployment pipelines** (</w:t>
+      </w:r>
+      <w:r>
+        <w:rPr>
+          <w:color w:val="1A5FB4"/>
+          <w:u w:val="single"/>
+        </w:rPr>
+        <w:t>deployment pipelines</w:t>
+      </w:r>
+      <w:r>
+        <w:t xml:space="preserve"> · </w:t>
+      </w:r>
+      <w:r>
+        <w:rPr>
+          <w:color w:val="1A5FB4"/>
+          <w:u w:val="single"/>
+        </w:rPr>
+        <w:t>Git</w:t>
+      </w:r>
+      <w:r>
+        <w:t>), with</w:t>
+      </w:r>
+    </w:p>
+    <w:p>
+      <w:r>
+        <w:t xml:space="preserve">  deployment rules for any per-env bits.</w:t>
+      </w:r>
+    </w:p>
+    <w:p>
+      <w:r>
+        <w:rPr>
+          <w:b/>
+        </w:rPr>
+        <w:t>The critical shortcut rule.</w:t>
+      </w:r>
+      <w:r>
+        <w:t xml:space="preserve"> Shortcuts are </w:t>
+      </w:r>
+      <w:r>
+        <w:rPr>
+          <w:b/>
+        </w:rPr>
+        <w:t>provisioned per environment by the template</w:t>
+      </w:r>
+      <w:r>
+        <w:t xml:space="preserve"> and point</w:t>
+      </w:r>
+    </w:p>
+    <w:p>
+      <w:r>
+        <w:t xml:space="preserve">at the </w:t>
+      </w:r>
+      <w:r>
+        <w:rPr>
+          <w:b/>
+        </w:rPr>
+        <w:t>env-local hub</w:t>
+      </w:r>
+      <w:r>
+        <w:t xml:space="preserve"> — they are *not* promoted as content. This guarantees a UAT spoke can only</w:t>
+      </w:r>
+    </w:p>
+    <w:p>
+      <w:r>
+        <w:t>ever reference UAT data, never PROD. (Promote code/config — never data, never cross-env pointers.)</w:t>
       </w:r>
     </w:p>
     <w:tbl>
@@ -8135,7 +8132,7 @@
                 <w:b/>
                 <w:sz w:val="18"/>
               </w:rPr>
-              <w:t>Group (naming convention)</w:t>
+              <w:t>Spoke element</w:t>
             </w:r>
           </w:p>
         </w:tc>
@@ -8155,7 +8152,7 @@
                 <w:b/>
                 <w:sz w:val="18"/>
               </w:rPr>
-              <w:t>Members</w:t>
+              <w:t>Provisioned by platform template (per env)</w:t>
             </w:r>
           </w:p>
         </w:tc>
@@ -8175,7 +8172,7 @@
                 <w:b/>
                 <w:sz w:val="18"/>
               </w:rPr>
-              <w:t>Purpose</w:t>
+              <w:t>Promoted by domain (Fabric CI/CD)</w:t>
             </w:r>
           </w:p>
         </w:tc>
@@ -8193,11 +8190,9 @@
             </w:r>
             <w:r>
               <w:rPr>
-                <w:rFonts w:ascii="Consolas" w:hAnsi="Consolas"/>
-                <w:color w:val="A31F34"/>
-                <w:sz w:val="18"/>
-              </w:rPr>
-              <w:t>BCPC-FAB-{ENV}-Engineers</w:t>
+                <w:sz w:val="18"/>
+              </w:rPr>
+              <w:t>Workspace</w:t>
             </w:r>
           </w:p>
         </w:tc>
@@ -8215,7 +8210,7 @@
               <w:rPr>
                 <w:sz w:val="18"/>
               </w:rPr>
-              <w:t>Data engineers</w:t>
+              <w:t>yes</w:t>
             </w:r>
           </w:p>
         </w:tc>
@@ -8233,7 +8228,7 @@
               <w:rPr>
                 <w:sz w:val="18"/>
               </w:rPr>
-              <w:t>Build access in that environment's workspaces</w:t>
+              <w:t>—</w:t>
             </w:r>
           </w:p>
         </w:tc>
@@ -8251,11 +8246,9 @@
             </w:r>
             <w:r>
               <w:rPr>
-                <w:rFonts w:ascii="Consolas" w:hAnsi="Consolas"/>
-                <w:color w:val="A31F34"/>
-                <w:sz w:val="18"/>
-              </w:rPr>
-              <w:t>BCPC-FAB-{ENV}-ReportAuthors</w:t>
+                <w:sz w:val="18"/>
+              </w:rPr>
+              <w:t>Lakehouse</w:t>
             </w:r>
           </w:p>
         </w:tc>
@@ -8273,7 +8266,7 @@
               <w:rPr>
                 <w:sz w:val="18"/>
               </w:rPr>
-              <w:t>Analysts</w:t>
+              <w:t>yes</w:t>
             </w:r>
           </w:p>
         </w:tc>
@@ -8291,7 +8284,7 @@
               <w:rPr>
                 <w:sz w:val="18"/>
               </w:rPr>
-              <w:t>Author semantic models / reports in that environment</w:t>
+              <w:t>—</w:t>
             </w:r>
           </w:p>
         </w:tc>
@@ -8309,11 +8302,9 @@
             </w:r>
             <w:r>
               <w:rPr>
-                <w:rFonts w:ascii="Consolas" w:hAnsi="Consolas"/>
-                <w:color w:val="A31F34"/>
-                <w:sz w:val="18"/>
-              </w:rPr>
-              <w:t>BCPC-FAB-{ENV}-Consumers</w:t>
+                <w:sz w:val="18"/>
+              </w:rPr>
+              <w:t>Shortcuts to hub Gold</w:t>
             </w:r>
           </w:p>
         </w:tc>
@@ -8331,7 +8322,14 @@
               <w:rPr>
                 <w:sz w:val="18"/>
               </w:rPr>
-              <w:t>Business users</w:t>
+              <w:t xml:space="preserve">yes — </w:t>
+            </w:r>
+            <w:r>
+              <w:rPr>
+                <w:b/>
+                <w:sz w:val="18"/>
+              </w:rPr>
+              <w:t>env-local, never cross-env</w:t>
             </w:r>
           </w:p>
         </w:tc>
@@ -8349,7 +8347,7 @@
               <w:rPr>
                 <w:sz w:val="18"/>
               </w:rPr>
-              <w:t>View published reports (via app)</w:t>
+              <w:t>—</w:t>
             </w:r>
           </w:p>
         </w:tc>
@@ -8367,11 +8365,9 @@
             </w:r>
             <w:r>
               <w:rPr>
-                <w:rFonts w:ascii="Consolas" w:hAnsi="Consolas"/>
-                <w:color w:val="A31F34"/>
-                <w:sz w:val="18"/>
-              </w:rPr>
-              <w:t>BCPC-DATA-{DOMAIN}-Stewards</w:t>
+                <w:sz w:val="18"/>
+              </w:rPr>
+              <w:t>Entra role assignments</w:t>
             </w:r>
           </w:p>
         </w:tc>
@@ -8389,7 +8385,7 @@
               <w:rPr>
                 <w:sz w:val="18"/>
               </w:rPr>
-              <w:t>Data stewards</w:t>
+              <w:t>yes</w:t>
             </w:r>
           </w:p>
         </w:tc>
@@ -8407,7 +8403,7 @@
               <w:rPr>
                 <w:sz w:val="18"/>
               </w:rPr>
-              <w:t>Governance for a data domain (Pensions, Employer, Member)</w:t>
+              <w:t>—</w:t>
             </w:r>
           </w:p>
         </w:tc>
@@ -8425,11 +8421,9 @@
             </w:r>
             <w:r>
               <w:rPr>
-                <w:rFonts w:ascii="Consolas" w:hAnsi="Consolas"/>
-                <w:color w:val="A31F34"/>
-                <w:sz w:val="18"/>
-              </w:rPr>
-              <w:t>BCPC-FAB-Platform-Admins</w:t>
+                <w:sz w:val="18"/>
+              </w:rPr>
+              <w:t>Capacity assignment</w:t>
             </w:r>
           </w:p>
         </w:tc>
@@ -8447,7 +8441,7 @@
               <w:rPr>
                 <w:sz w:val="18"/>
               </w:rPr>
-              <w:t>Platform team</w:t>
+              <w:t>yes</w:t>
             </w:r>
           </w:p>
         </w:tc>
@@ -8465,14 +8459,7 @@
               <w:rPr>
                 <w:sz w:val="18"/>
               </w:rPr>
-              <w:t xml:space="preserve">Tenant / capacity administration — </w:t>
-            </w:r>
-            <w:r>
-              <w:rPr>
-                <w:b/>
-                <w:sz w:val="18"/>
-              </w:rPr>
-              <w:t>PIM-enabled</w:t>
+              <w:t>—</w:t>
             </w:r>
           </w:p>
         </w:tc>
@@ -8490,11 +8477,9 @@
             </w:r>
             <w:r>
               <w:rPr>
-                <w:rFonts w:ascii="Consolas" w:hAnsi="Consolas"/>
-                <w:color w:val="A31F34"/>
-                <w:sz w:val="18"/>
-              </w:rPr>
-              <w:t>BCPC-FAB-Auditors</w:t>
+                <w:sz w:val="18"/>
+              </w:rPr>
+              <w:t>Semantic models</w:t>
             </w:r>
           </w:p>
         </w:tc>
@@ -8512,7 +8497,7 @@
               <w:rPr>
                 <w:sz w:val="18"/>
               </w:rPr>
-              <w:t>Security / audit</w:t>
+              <w:t>—</w:t>
             </w:r>
           </w:p>
         </w:tc>
@@ -8530,7 +8515,7 @@
               <w:rPr>
                 <w:sz w:val="18"/>
               </w:rPr>
-              <w:t>Read + audit-log access across environments</w:t>
+              <w:t>yes</w:t>
             </w:r>
           </w:p>
         </w:tc>
@@ -8548,11 +8533,9 @@
             </w:r>
             <w:r>
               <w:rPr>
-                <w:rFonts w:ascii="Consolas" w:hAnsi="Consolas"/>
-                <w:color w:val="A31F34"/>
-                <w:sz w:val="18"/>
-              </w:rPr>
-              <w:t>BCPC-FAB-SPN-{ENV}</w:t>
+                <w:sz w:val="18"/>
+              </w:rPr>
+              <w:t>Reports</w:t>
             </w:r>
           </w:p>
         </w:tc>
@@ -8570,7 +8553,7 @@
               <w:rPr>
                 <w:sz w:val="18"/>
               </w:rPr>
-              <w:t>Service principals</w:t>
+              <w:t>—</w:t>
             </w:r>
           </w:p>
         </w:tc>
@@ -8588,7 +8571,63 @@
               <w:rPr>
                 <w:sz w:val="18"/>
               </w:rPr>
-              <w:t>Container for automation identities; scopes tenant API access</w:t>
+              <w:t>yes</w:t>
+            </w:r>
+          </w:p>
+        </w:tc>
+      </w:tr>
+      <w:tr>
+        <w:tc>
+          <w:tcPr>
+            <w:tcW w:type="dxa" w:w="2880"/>
+          </w:tcPr>
+          <w:p>
+            <w:r>
+              <w:rPr>
+                <w:sz w:val="18"/>
+              </w:rPr>
+            </w:r>
+            <w:r>
+              <w:rPr>
+                <w:sz w:val="18"/>
+              </w:rPr>
+              <w:t>Warehouse (custom logic)</w:t>
+            </w:r>
+          </w:p>
+        </w:tc>
+        <w:tc>
+          <w:tcPr>
+            <w:tcW w:type="dxa" w:w="2880"/>
+          </w:tcPr>
+          <w:p>
+            <w:r>
+              <w:rPr>
+                <w:sz w:val="18"/>
+              </w:rPr>
+            </w:r>
+            <w:r>
+              <w:rPr>
+                <w:sz w:val="18"/>
+              </w:rPr>
+              <w:t>optional empty scaffold</w:t>
+            </w:r>
+          </w:p>
+        </w:tc>
+        <w:tc>
+          <w:tcPr>
+            <w:tcW w:type="dxa" w:w="2880"/>
+          </w:tcPr>
+          <w:p>
+            <w:r>
+              <w:rPr>
+                <w:sz w:val="18"/>
+              </w:rPr>
+            </w:r>
+            <w:r>
+              <w:rPr>
+                <w:sz w:val="18"/>
+              </w:rPr>
+              <w:t>yes (the logic)</w:t>
             </w:r>
           </w:p>
         </w:tc>
@@ -8597,50 +8636,261 @@
     <w:p/>
     <w:p>
       <w:r>
-        <w:t xml:space="preserve">*Supporting controls:* </w:t>
-      </w:r>
-      <w:r>
         <w:rPr>
           <w:b/>
         </w:rPr>
-        <w:t>Conditional Access</w:t>
-      </w:r>
-      <w:r>
-        <w:t xml:space="preserve"> (MFA + compliant device + allowed location) on all Fabric</w:t>
+        <w:t>Should we stand up spokes in the lower environments?</w:t>
+      </w:r>
+      <w:r>
+        <w:t xml:space="preserve"> Yes:</w:t>
       </w:r>
     </w:p>
     <w:p>
-      <w:r>
-        <w:t xml:space="preserve">access; </w:t>
-      </w:r>
+      <w:pPr>
+        <w:pStyle w:val="ListBullet"/>
+        <w:ind w:left="360"/>
+      </w:pPr>
       <w:r>
         <w:rPr>
           <w:b/>
         </w:rPr>
-        <w:t>PIM</w:t>
-      </w:r>
-      <w:r>
-        <w:t xml:space="preserve"> for admin and production roles; </w:t>
-      </w:r>
+        <w:t>At minimum UAT + PROD</w:t>
+      </w:r>
+      <w:r>
+        <w:t>, so business users validate in UAT (on masked / representative data) before</w:t>
+      </w:r>
+    </w:p>
+    <w:p>
+      <w:r>
+        <w:t xml:space="preserve">  anything reaches PROD — this is the UAT sign-off in the access matrix.</w:t>
+      </w:r>
+    </w:p>
+    <w:p>
+      <w:pPr>
+        <w:pStyle w:val="ListBullet"/>
+        <w:ind w:left="360"/>
+      </w:pPr>
       <w:r>
         <w:rPr>
           <w:b/>
         </w:rPr>
-        <w:t>quarterly access reviews</w:t>
-      </w:r>
-      <w:r>
-        <w:t>; and separately-held</w:t>
+        <w:t>Full DEV + UAT + PROD</w:t>
+      </w:r>
+      <w:r>
+        <w:t xml:space="preserve"> for any domain that actually *builds* content (custom models, warehouses) —</w:t>
       </w:r>
     </w:p>
     <w:p>
+      <w:r>
+        <w:t xml:space="preserve">  they need a DEV spoke to develop and a promotion path.</w:t>
+      </w:r>
+    </w:p>
+    <w:p>
+      <w:pPr>
+        <w:pStyle w:val="ListBullet"/>
+        <w:ind w:left="360"/>
+      </w:pPr>
+      <w:r>
+        <w:t xml:space="preserve">A </w:t>
+      </w:r>
       <w:r>
         <w:rPr>
           <w:b/>
         </w:rPr>
-        <w:t>break-glass</w:t>
-      </w:r>
-      <w:r>
-        <w:t xml:space="preserve"> admin accounts excluded from Conditional Access for emergencies only.</w:t>
+        <w:t>pure-consumer</w:t>
+      </w:r>
+      <w:r>
+        <w:t xml:space="preserve"> domain (reports only, on certified Gold) can start with UAT + PROD and add DEV later.</w:t>
+      </w:r>
+    </w:p>
+    <w:p>
+      <w:pPr>
+        <w:pStyle w:val="ListBullet"/>
+        <w:ind w:left="360"/>
+      </w:pPr>
+      <w:r>
+        <w:t xml:space="preserve">Lower-env spokes shortcut to the </w:t>
+      </w:r>
+      <w:r>
+        <w:rPr>
+          <w:b/>
+        </w:rPr>
+        <w:t>lower-env hub</w:t>
+      </w:r>
+      <w:r>
+        <w:t>, so testing uses safe (masked/synthetic) data —</w:t>
+      </w:r>
+    </w:p>
+    <w:p>
+      <w:r>
+        <w:t xml:space="preserve">  consistent with the privacy model.</w:t>
+      </w:r>
+    </w:p>
+    <w:p>
+      <w:r>
+        <w:rPr>
+          <w:b/>
+        </w:rPr>
+        <w:t>Is it easy to add spokes to the deployment template?</w:t>
+      </w:r>
+      <w:r>
+        <w:t xml:space="preserve"> Yes — a natural extension of the template we</w:t>
+      </w:r>
+    </w:p>
+    <w:p>
+      <w:r>
+        <w:t>already have, not new infrastructure:</w:t>
+      </w:r>
+    </w:p>
+    <w:p>
+      <w:pPr>
+        <w:pStyle w:val="ListBullet"/>
+        <w:ind w:left="360"/>
+      </w:pPr>
+      <w:r>
+        <w:t xml:space="preserve">Add a </w:t>
+      </w:r>
+      <w:r>
+        <w:rPr>
+          <w:b/>
+        </w:rPr>
+        <w:t>`feature_workspaces`</w:t>
+      </w:r>
+      <w:r>
+        <w:t xml:space="preserve"> (spokes) list to the manifest: name, domain, the hub Gold tables to</w:t>
+      </w:r>
+    </w:p>
+    <w:p>
+      <w:r>
+        <w:t xml:space="preserve">  shortcut, and the Entra groups + capacity to assign.</w:t>
+      </w:r>
+    </w:p>
+    <w:p>
+      <w:pPr>
+        <w:pStyle w:val="ListBullet"/>
+        <w:ind w:left="360"/>
+      </w:pPr>
+      <w:r>
+        <w:rPr>
+          <w:rFonts w:ascii="Consolas" w:hAnsi="Consolas"/>
+          <w:color w:val="A31F34"/>
+        </w:rPr>
+        <w:t>cp_bootstrap</w:t>
+      </w:r>
+      <w:r>
+        <w:t xml:space="preserve"> loops the list and, per spoke, creates the workspace, its lakehouse, the shortcuts</w:t>
+      </w:r>
+    </w:p>
+    <w:p>
+      <w:r>
+        <w:t xml:space="preserve">  (env-local hub), the role assignments, and the capacity binding — the **same REST patterns we already</w:t>
+      </w:r>
+    </w:p>
+    <w:p>
+      <w:r>
+        <w:t xml:space="preserve">  use for the hub**, plus a shortcut-creation helper (</w:t>
+      </w:r>
+      <w:r>
+        <w:rPr>
+          <w:color w:val="1A5FB4"/>
+          <w:u w:val="single"/>
+        </w:rPr>
+        <w:t>OneLake shortcuts</w:t>
+      </w:r>
+      <w:r>
+        <w:t>).</w:t>
+      </w:r>
+    </w:p>
+    <w:p>
+      <w:pPr>
+        <w:pStyle w:val="ListBullet"/>
+        <w:ind w:left="360"/>
+      </w:pPr>
+      <w:r>
+        <w:rPr>
+          <w:b/>
+        </w:rPr>
+        <w:t>Idempotent</w:t>
+      </w:r>
+      <w:r>
+        <w:t xml:space="preserve"> and per-environment: </w:t>
+      </w:r>
+      <w:r>
+        <w:rPr>
+          <w:rFonts w:ascii="Consolas" w:hAnsi="Consolas"/>
+          <w:color w:val="A31F34"/>
+        </w:rPr>
+        <w:t>deploy DEV|UAT|PROD</w:t>
+      </w:r>
+      <w:r>
+        <w:t xml:space="preserve"> brings up the hub </w:t>
+      </w:r>
+      <w:r>
+        <w:rPr>
+          <w:b/>
+        </w:rPr>
+        <w:t>and</w:t>
+      </w:r>
+      <w:r>
+        <w:t xml:space="preserve"> its full set of</w:t>
+      </w:r>
+    </w:p>
+    <w:p>
+      <w:r>
+        <w:t xml:space="preserve">  spokes in one command.</w:t>
+      </w:r>
+    </w:p>
+    <w:p>
+      <w:pPr>
+        <w:pStyle w:val="ListBullet"/>
+        <w:ind w:left="360"/>
+      </w:pPr>
+      <w:r>
+        <w:t>New spokes are added through the workspace-creation process (a config entry), keeping the set</w:t>
+      </w:r>
+    </w:p>
+    <w:p>
+      <w:r>
+        <w:t xml:space="preserve">  governed and consistent.</w:t>
+      </w:r>
+    </w:p>
+    <w:p>
+      <w:r>
+        <w:t>&gt; *This spoke-provisioning is a recommended enhancement to the current template — which today</w:t>
+      </w:r>
+    </w:p>
+    <w:p>
+      <w:r>
+        <w:t>&gt; provisions the hub. The workspace / lakehouse / role-assignment APIs are already in use, so it is</w:t>
+      </w:r>
+    </w:p>
+    <w:p>
+      <w:r>
+        <w:t>&gt; incremental work, not a rebuild.*</w:t>
+      </w:r>
+    </w:p>
+    <w:p>
+      <w:r>
+        <w:t xml:space="preserve">&gt; </w:t>
+      </w:r>
+      <w:r>
+        <w:rPr>
+          <w:b/>
+        </w:rPr>
+        <w:t>How it maps to the milestones.</w:t>
+      </w:r>
+      <w:r>
+        <w:t xml:space="preserve"> This topology realizes Milestone 1's *Define Workspace Structure*,</w:t>
+      </w:r>
+    </w:p>
+    <w:p>
+      <w:r>
+        <w:t>&gt; *Domain Alignment Strategy*, *Lakehouse Organization Standards*, and *Data Sharing Standards*; the</w:t>
+      </w:r>
+    </w:p>
+    <w:p>
+      <w:r>
+        <w:t>&gt; Milestone 3 semantic models and reports are what live in the spokes.</w:t>
       </w:r>
     </w:p>
     <w:p>
@@ -8649,7 +8899,266 @@
       </w:pPr>
       <w:r/>
       <w:r>
-        <w:t>Fabric access control — defense in depth</w:t>
+        <w:t>References</w:t>
+      </w:r>
+    </w:p>
+    <w:p>
+      <w:pPr>
+        <w:pStyle w:val="ListBullet"/>
+        <w:ind w:left="360"/>
+      </w:pPr>
+      <w:r>
+        <w:t xml:space="preserve">OneLake shortcuts — </w:t>
+      </w:r>
+      <w:r>
+        <w:rPr>
+          <w:color w:val="1A5FB4"/>
+          <w:u w:val="single"/>
+        </w:rPr>
+        <w:t>overview</w:t>
+      </w:r>
+      <w:r>
+        <w:t xml:space="preserve"> · </w:t>
+      </w:r>
+      <w:r>
+        <w:rPr>
+          <w:color w:val="1A5FB4"/>
+          <w:u w:val="single"/>
+        </w:rPr>
+        <w:t>secure &amp; manage shortcuts</w:t>
+      </w:r>
+    </w:p>
+    <w:p>
+      <w:pPr>
+        <w:pStyle w:val="ListBullet"/>
+        <w:ind w:left="360"/>
+      </w:pPr>
+      <w:r>
+        <w:t xml:space="preserve">OneLake Security — </w:t>
+      </w:r>
+      <w:r>
+        <w:rPr>
+          <w:color w:val="1A5FB4"/>
+          <w:u w:val="single"/>
+        </w:rPr>
+        <w:t>access-control model</w:t>
+      </w:r>
+      <w:r>
+        <w:t xml:space="preserve"> · </w:t>
+      </w:r>
+      <w:r>
+        <w:rPr>
+          <w:color w:val="1A5FB4"/>
+          <w:u w:val="single"/>
+        </w:rPr>
+        <w:t>with shortcuts (RLS/CLS behavior)</w:t>
+      </w:r>
+    </w:p>
+    <w:p>
+      <w:pPr>
+        <w:pStyle w:val="ListBullet"/>
+        <w:ind w:left="360"/>
+      </w:pPr>
+      <w:r>
+        <w:t xml:space="preserve">Fabric domains (data mesh) — </w:t>
+      </w:r>
+      <w:r>
+        <w:rPr>
+          <w:color w:val="1A5FB4"/>
+          <w:u w:val="single"/>
+        </w:rPr>
+        <w:t>domains</w:t>
+      </w:r>
+    </w:p>
+    <w:p>
+      <w:pPr>
+        <w:pStyle w:val="ListBullet"/>
+        <w:ind w:left="360"/>
+      </w:pPr>
+      <w:r>
+        <w:t xml:space="preserve">CI/CD — </w:t>
+      </w:r>
+      <w:r>
+        <w:rPr>
+          <w:color w:val="1A5FB4"/>
+          <w:u w:val="single"/>
+        </w:rPr>
+        <w:t>deployment pipelines</w:t>
+      </w:r>
+      <w:r>
+        <w:t xml:space="preserve"> · </w:t>
+      </w:r>
+      <w:r>
+        <w:rPr>
+          <w:color w:val="1A5FB4"/>
+          <w:u w:val="single"/>
+        </w:rPr>
+        <w:t>Git integration</w:t>
+      </w:r>
+    </w:p>
+    <w:p>
+      <w:pPr>
+        <w:pStyle w:val="Heading2"/>
+      </w:pPr>
+      <w:r/>
+      <w:r>
+        <w:t>Security, Access &amp; Environment Model — best-practice design</w:t>
+      </w:r>
+    </w:p>
+    <w:p>
+      <w:r>
+        <w:t>*BCPC is a government crown corporation: access control, data privacy, and environment isolation are</w:t>
+      </w:r>
+    </w:p>
+    <w:p>
+      <w:r>
+        <w:t>first-order requirements, not afterthoughts. This section expands the Security and Governance items</w:t>
+      </w:r>
+    </w:p>
+    <w:p>
+      <w:r>
+        <w:t>above into a concrete, best-practice design. It is a recommendation to adopt and refine with BCPC's</w:t>
+      </w:r>
+    </w:p>
+    <w:p>
+      <w:r>
+        <w:t>security team — the platform already provides the enforcement mechanisms it relies on.*</w:t>
+      </w:r>
+    </w:p>
+    <w:p>
+      <w:r>
+        <w:rPr>
+          <w:b/>
+        </w:rPr>
+        <w:t>Guiding principles</w:t>
+      </w:r>
+    </w:p>
+    <w:p>
+      <w:pPr>
+        <w:pStyle w:val="ListBullet"/>
+        <w:ind w:left="360"/>
+      </w:pPr>
+      <w:r>
+        <w:rPr>
+          <w:b/>
+        </w:rPr>
+        <w:t>Group-based, never individual.</w:t>
+      </w:r>
+      <w:r>
+        <w:t xml:space="preserve"> All access is granted to Microsoft Entra ID security groups; you</w:t>
+      </w:r>
+    </w:p>
+    <w:p>
+      <w:r>
+        <w:t xml:space="preserve">  change *membership*, never per-person permissions.</w:t>
+      </w:r>
+    </w:p>
+    <w:p>
+      <w:pPr>
+        <w:pStyle w:val="ListBullet"/>
+        <w:ind w:left="360"/>
+      </w:pPr>
+      <w:r>
+        <w:rPr>
+          <w:b/>
+        </w:rPr>
+        <w:t>Least privilege + just-in-time.</w:t>
+      </w:r>
+      <w:r>
+        <w:t xml:space="preserve"> People get the minimum role; privileged and production access is</w:t>
+      </w:r>
+    </w:p>
+    <w:p>
+      <w:r>
+        <w:t xml:space="preserve">  granted on demand through </w:t>
+      </w:r>
+      <w:r>
+        <w:rPr>
+          <w:b/>
+        </w:rPr>
+        <w:t>PIM</w:t>
+      </w:r>
+      <w:r>
+        <w:t xml:space="preserve"> (Privileged Identity Management) with approval — not standing.</w:t>
+      </w:r>
+    </w:p>
+    <w:p>
+      <w:pPr>
+        <w:pStyle w:val="ListBullet"/>
+        <w:ind w:left="360"/>
+      </w:pPr>
+      <w:r>
+        <w:rPr>
+          <w:b/>
+        </w:rPr>
+        <w:t>People and machines don't mix.</w:t>
+      </w:r>
+      <w:r>
+        <w:t xml:space="preserve"> Humans never authenticate as service principals; automation never</w:t>
+      </w:r>
+    </w:p>
+    <w:p>
+      <w:r>
+        <w:t xml:space="preserve">  runs as a personal account.</w:t>
+      </w:r>
+    </w:p>
+    <w:p>
+      <w:pPr>
+        <w:pStyle w:val="ListBullet"/>
+        <w:ind w:left="360"/>
+      </w:pPr>
+      <w:r>
+        <w:rPr>
+          <w:b/>
+        </w:rPr>
+        <w:t>Production data stays in production.</w:t>
+      </w:r>
+      <w:r>
+        <w:t xml:space="preserve"> Lower environments use masked, synthetic, or subset data.</w:t>
+      </w:r>
+    </w:p>
+    <w:p>
+      <w:pPr>
+        <w:pStyle w:val="ListBullet"/>
+        <w:ind w:left="360"/>
+      </w:pPr>
+      <w:r>
+        <w:rPr>
+          <w:b/>
+        </w:rPr>
+        <w:t>Change production only by promotion.</w:t>
+      </w:r>
+      <w:r>
+        <w:t xml:space="preserve"> No manual edits in PROD — changes flow through the</w:t>
+      </w:r>
+    </w:p>
+    <w:p>
+      <w:r>
+        <w:t xml:space="preserve">  deployment pipeline, executed by a service principal.</w:t>
+      </w:r>
+    </w:p>
+    <w:p>
+      <w:pPr>
+        <w:pStyle w:val="ListBullet"/>
+        <w:ind w:left="360"/>
+      </w:pPr>
+      <w:r>
+        <w:rPr>
+          <w:b/>
+        </w:rPr>
+        <w:t>Everything is auditable.</w:t>
+      </w:r>
+      <w:r>
+        <w:t xml:space="preserve"> Access grants, data reads, and pipeline actions are all logged.</w:t>
+      </w:r>
+    </w:p>
+    <w:p>
+      <w:pPr>
+        <w:pStyle w:val="Heading3"/>
+      </w:pPr>
+      <w:r/>
+      <w:r>
+        <w:t>Entra ID security model</w:t>
       </w:r>
     </w:p>
     <w:p>
@@ -8659,7 +9168,7 @@
       <w:r>
         <w:drawing>
           <wp:inline xmlns:a="http://schemas.openxmlformats.org/drawingml/2006/main" xmlns:pic="http://schemas.openxmlformats.org/drawingml/2006/picture">
-            <wp:extent cx="5669280" cy="14419690"/>
+            <wp:extent cx="5669280" cy="1879761"/>
             <wp:docPr id="11" name="Picture 11"/>
             <wp:cNvGraphicFramePr>
               <a:graphicFrameLocks noChangeAspect="1"/>
@@ -8680,7 +9189,7 @@
                   <pic:spPr>
                     <a:xfrm>
                       <a:off x="0" y="0"/>
-                      <a:ext cx="5669280" cy="14419690"/>
+                      <a:ext cx="5669280" cy="1879761"/>
                     </a:xfrm>
                     <a:prstGeom prst="rect"/>
                   </pic:spPr>
@@ -8693,44 +9202,557 @@
     </w:p>
     <w:p>
       <w:r>
-        <w:t xml:space="preserve">Access is controlled at </w:t>
+        <w:t xml:space="preserve">Access is assigned to </w:t>
       </w:r>
       <w:r>
         <w:rPr>
           <w:b/>
         </w:rPr>
-        <w:t>five layers</w:t>
-      </w:r>
-      <w:r>
-        <w:t>, each narrower than the last. A consumer, for example, passes</w:t>
+        <w:t>groups</w:t>
+      </w:r>
+      <w:r>
+        <w:t>, and the groups are assigned to workspaces and capacities. Adding or</w:t>
       </w:r>
     </w:p>
     <w:p>
       <w:r>
-        <w:t xml:space="preserve">tenant policy, sits on the capacity, gets </w:t>
+        <w:t>removing a person is a membership change — the permission model never changes.</w:t>
+      </w:r>
+    </w:p>
+    <w:tbl>
+      <w:tblPr>
+        <w:tblStyle w:val="LightGrid-Accent1"/>
+        <w:tblW w:type="auto" w:w="0"/>
+        <w:tblLook w:firstColumn="1" w:firstRow="1" w:lastColumn="0" w:lastRow="0" w:noHBand="0" w:noVBand="1" w:val="04A0"/>
+      </w:tblPr>
+      <w:tblGrid>
+        <w:gridCol w:w="2880"/>
+        <w:gridCol w:w="2880"/>
+        <w:gridCol w:w="2880"/>
+      </w:tblGrid>
+      <w:tr>
+        <w:tc>
+          <w:tcPr>
+            <w:tcW w:type="dxa" w:w="2880"/>
+          </w:tcPr>
+          <w:p>
+            <w:r>
+              <w:rPr>
+                <w:b/>
+                <w:sz w:val="18"/>
+              </w:rPr>
+            </w:r>
+            <w:r>
+              <w:rPr>
+                <w:b/>
+                <w:sz w:val="18"/>
+              </w:rPr>
+              <w:t>Group (naming convention)</w:t>
+            </w:r>
+          </w:p>
+        </w:tc>
+        <w:tc>
+          <w:tcPr>
+            <w:tcW w:type="dxa" w:w="2880"/>
+          </w:tcPr>
+          <w:p>
+            <w:r>
+              <w:rPr>
+                <w:b/>
+                <w:sz w:val="18"/>
+              </w:rPr>
+            </w:r>
+            <w:r>
+              <w:rPr>
+                <w:b/>
+                <w:sz w:val="18"/>
+              </w:rPr>
+              <w:t>Members</w:t>
+            </w:r>
+          </w:p>
+        </w:tc>
+        <w:tc>
+          <w:tcPr>
+            <w:tcW w:type="dxa" w:w="2880"/>
+          </w:tcPr>
+          <w:p>
+            <w:r>
+              <w:rPr>
+                <w:b/>
+                <w:sz w:val="18"/>
+              </w:rPr>
+            </w:r>
+            <w:r>
+              <w:rPr>
+                <w:b/>
+                <w:sz w:val="18"/>
+              </w:rPr>
+              <w:t>Purpose</w:t>
+            </w:r>
+          </w:p>
+        </w:tc>
+      </w:tr>
+      <w:tr>
+        <w:tc>
+          <w:tcPr>
+            <w:tcW w:type="dxa" w:w="2880"/>
+          </w:tcPr>
+          <w:p>
+            <w:r>
+              <w:rPr>
+                <w:sz w:val="18"/>
+              </w:rPr>
+            </w:r>
+            <w:r>
+              <w:rPr>
+                <w:rFonts w:ascii="Consolas" w:hAnsi="Consolas"/>
+                <w:color w:val="A31F34"/>
+                <w:sz w:val="18"/>
+              </w:rPr>
+              <w:t>BCPC-FAB-{ENV}-Engineers</w:t>
+            </w:r>
+          </w:p>
+        </w:tc>
+        <w:tc>
+          <w:tcPr>
+            <w:tcW w:type="dxa" w:w="2880"/>
+          </w:tcPr>
+          <w:p>
+            <w:r>
+              <w:rPr>
+                <w:sz w:val="18"/>
+              </w:rPr>
+            </w:r>
+            <w:r>
+              <w:rPr>
+                <w:sz w:val="18"/>
+              </w:rPr>
+              <w:t>Data engineers</w:t>
+            </w:r>
+          </w:p>
+        </w:tc>
+        <w:tc>
+          <w:tcPr>
+            <w:tcW w:type="dxa" w:w="2880"/>
+          </w:tcPr>
+          <w:p>
+            <w:r>
+              <w:rPr>
+                <w:sz w:val="18"/>
+              </w:rPr>
+            </w:r>
+            <w:r>
+              <w:rPr>
+                <w:sz w:val="18"/>
+              </w:rPr>
+              <w:t>Build access in that environment's workspaces</w:t>
+            </w:r>
+          </w:p>
+        </w:tc>
+      </w:tr>
+      <w:tr>
+        <w:tc>
+          <w:tcPr>
+            <w:tcW w:type="dxa" w:w="2880"/>
+          </w:tcPr>
+          <w:p>
+            <w:r>
+              <w:rPr>
+                <w:sz w:val="18"/>
+              </w:rPr>
+            </w:r>
+            <w:r>
+              <w:rPr>
+                <w:rFonts w:ascii="Consolas" w:hAnsi="Consolas"/>
+                <w:color w:val="A31F34"/>
+                <w:sz w:val="18"/>
+              </w:rPr>
+              <w:t>BCPC-FAB-{ENV}-ReportAuthors</w:t>
+            </w:r>
+          </w:p>
+        </w:tc>
+        <w:tc>
+          <w:tcPr>
+            <w:tcW w:type="dxa" w:w="2880"/>
+          </w:tcPr>
+          <w:p>
+            <w:r>
+              <w:rPr>
+                <w:sz w:val="18"/>
+              </w:rPr>
+            </w:r>
+            <w:r>
+              <w:rPr>
+                <w:sz w:val="18"/>
+              </w:rPr>
+              <w:t>Analysts</w:t>
+            </w:r>
+          </w:p>
+        </w:tc>
+        <w:tc>
+          <w:tcPr>
+            <w:tcW w:type="dxa" w:w="2880"/>
+          </w:tcPr>
+          <w:p>
+            <w:r>
+              <w:rPr>
+                <w:sz w:val="18"/>
+              </w:rPr>
+            </w:r>
+            <w:r>
+              <w:rPr>
+                <w:sz w:val="18"/>
+              </w:rPr>
+              <w:t>Author semantic models / reports in that environment</w:t>
+            </w:r>
+          </w:p>
+        </w:tc>
+      </w:tr>
+      <w:tr>
+        <w:tc>
+          <w:tcPr>
+            <w:tcW w:type="dxa" w:w="2880"/>
+          </w:tcPr>
+          <w:p>
+            <w:r>
+              <w:rPr>
+                <w:sz w:val="18"/>
+              </w:rPr>
+            </w:r>
+            <w:r>
+              <w:rPr>
+                <w:rFonts w:ascii="Consolas" w:hAnsi="Consolas"/>
+                <w:color w:val="A31F34"/>
+                <w:sz w:val="18"/>
+              </w:rPr>
+              <w:t>BCPC-FAB-{ENV}-Consumers</w:t>
+            </w:r>
+          </w:p>
+        </w:tc>
+        <w:tc>
+          <w:tcPr>
+            <w:tcW w:type="dxa" w:w="2880"/>
+          </w:tcPr>
+          <w:p>
+            <w:r>
+              <w:rPr>
+                <w:sz w:val="18"/>
+              </w:rPr>
+            </w:r>
+            <w:r>
+              <w:rPr>
+                <w:sz w:val="18"/>
+              </w:rPr>
+              <w:t>Business users</w:t>
+            </w:r>
+          </w:p>
+        </w:tc>
+        <w:tc>
+          <w:tcPr>
+            <w:tcW w:type="dxa" w:w="2880"/>
+          </w:tcPr>
+          <w:p>
+            <w:r>
+              <w:rPr>
+                <w:sz w:val="18"/>
+              </w:rPr>
+            </w:r>
+            <w:r>
+              <w:rPr>
+                <w:sz w:val="18"/>
+              </w:rPr>
+              <w:t>View published reports (via app)</w:t>
+            </w:r>
+          </w:p>
+        </w:tc>
+      </w:tr>
+      <w:tr>
+        <w:tc>
+          <w:tcPr>
+            <w:tcW w:type="dxa" w:w="2880"/>
+          </w:tcPr>
+          <w:p>
+            <w:r>
+              <w:rPr>
+                <w:sz w:val="18"/>
+              </w:rPr>
+            </w:r>
+            <w:r>
+              <w:rPr>
+                <w:rFonts w:ascii="Consolas" w:hAnsi="Consolas"/>
+                <w:color w:val="A31F34"/>
+                <w:sz w:val="18"/>
+              </w:rPr>
+              <w:t>BCPC-DATA-{DOMAIN}-Stewards</w:t>
+            </w:r>
+          </w:p>
+        </w:tc>
+        <w:tc>
+          <w:tcPr>
+            <w:tcW w:type="dxa" w:w="2880"/>
+          </w:tcPr>
+          <w:p>
+            <w:r>
+              <w:rPr>
+                <w:sz w:val="18"/>
+              </w:rPr>
+            </w:r>
+            <w:r>
+              <w:rPr>
+                <w:sz w:val="18"/>
+              </w:rPr>
+              <w:t>Data stewards</w:t>
+            </w:r>
+          </w:p>
+        </w:tc>
+        <w:tc>
+          <w:tcPr>
+            <w:tcW w:type="dxa" w:w="2880"/>
+          </w:tcPr>
+          <w:p>
+            <w:r>
+              <w:rPr>
+                <w:sz w:val="18"/>
+              </w:rPr>
+            </w:r>
+            <w:r>
+              <w:rPr>
+                <w:sz w:val="18"/>
+              </w:rPr>
+              <w:t>Governance for a data domain (Pensions, Employer, Member)</w:t>
+            </w:r>
+          </w:p>
+        </w:tc>
+      </w:tr>
+      <w:tr>
+        <w:tc>
+          <w:tcPr>
+            <w:tcW w:type="dxa" w:w="2880"/>
+          </w:tcPr>
+          <w:p>
+            <w:r>
+              <w:rPr>
+                <w:sz w:val="18"/>
+              </w:rPr>
+            </w:r>
+            <w:r>
+              <w:rPr>
+                <w:rFonts w:ascii="Consolas" w:hAnsi="Consolas"/>
+                <w:color w:val="A31F34"/>
+                <w:sz w:val="18"/>
+              </w:rPr>
+              <w:t>BCPC-FAB-Platform-Admins</w:t>
+            </w:r>
+          </w:p>
+        </w:tc>
+        <w:tc>
+          <w:tcPr>
+            <w:tcW w:type="dxa" w:w="2880"/>
+          </w:tcPr>
+          <w:p>
+            <w:r>
+              <w:rPr>
+                <w:sz w:val="18"/>
+              </w:rPr>
+            </w:r>
+            <w:r>
+              <w:rPr>
+                <w:sz w:val="18"/>
+              </w:rPr>
+              <w:t>Platform team</w:t>
+            </w:r>
+          </w:p>
+        </w:tc>
+        <w:tc>
+          <w:tcPr>
+            <w:tcW w:type="dxa" w:w="2880"/>
+          </w:tcPr>
+          <w:p>
+            <w:r>
+              <w:rPr>
+                <w:sz w:val="18"/>
+              </w:rPr>
+            </w:r>
+            <w:r>
+              <w:rPr>
+                <w:sz w:val="18"/>
+              </w:rPr>
+              <w:t xml:space="preserve">Tenant / capacity administration — </w:t>
+            </w:r>
+            <w:r>
+              <w:rPr>
+                <w:b/>
+                <w:sz w:val="18"/>
+              </w:rPr>
+              <w:t>PIM-enabled</w:t>
+            </w:r>
+          </w:p>
+        </w:tc>
+      </w:tr>
+      <w:tr>
+        <w:tc>
+          <w:tcPr>
+            <w:tcW w:type="dxa" w:w="2880"/>
+          </w:tcPr>
+          <w:p>
+            <w:r>
+              <w:rPr>
+                <w:sz w:val="18"/>
+              </w:rPr>
+            </w:r>
+            <w:r>
+              <w:rPr>
+                <w:rFonts w:ascii="Consolas" w:hAnsi="Consolas"/>
+                <w:color w:val="A31F34"/>
+                <w:sz w:val="18"/>
+              </w:rPr>
+              <w:t>BCPC-FAB-Auditors</w:t>
+            </w:r>
+          </w:p>
+        </w:tc>
+        <w:tc>
+          <w:tcPr>
+            <w:tcW w:type="dxa" w:w="2880"/>
+          </w:tcPr>
+          <w:p>
+            <w:r>
+              <w:rPr>
+                <w:sz w:val="18"/>
+              </w:rPr>
+            </w:r>
+            <w:r>
+              <w:rPr>
+                <w:sz w:val="18"/>
+              </w:rPr>
+              <w:t>Security / audit</w:t>
+            </w:r>
+          </w:p>
+        </w:tc>
+        <w:tc>
+          <w:tcPr>
+            <w:tcW w:type="dxa" w:w="2880"/>
+          </w:tcPr>
+          <w:p>
+            <w:r>
+              <w:rPr>
+                <w:sz w:val="18"/>
+              </w:rPr>
+            </w:r>
+            <w:r>
+              <w:rPr>
+                <w:sz w:val="18"/>
+              </w:rPr>
+              <w:t>Read + audit-log access across environments</w:t>
+            </w:r>
+          </w:p>
+        </w:tc>
+      </w:tr>
+      <w:tr>
+        <w:tc>
+          <w:tcPr>
+            <w:tcW w:type="dxa" w:w="2880"/>
+          </w:tcPr>
+          <w:p>
+            <w:r>
+              <w:rPr>
+                <w:sz w:val="18"/>
+              </w:rPr>
+            </w:r>
+            <w:r>
+              <w:rPr>
+                <w:rFonts w:ascii="Consolas" w:hAnsi="Consolas"/>
+                <w:color w:val="A31F34"/>
+                <w:sz w:val="18"/>
+              </w:rPr>
+              <w:t>BCPC-FAB-SPN-{ENV}</w:t>
+            </w:r>
+          </w:p>
+        </w:tc>
+        <w:tc>
+          <w:tcPr>
+            <w:tcW w:type="dxa" w:w="2880"/>
+          </w:tcPr>
+          <w:p>
+            <w:r>
+              <w:rPr>
+                <w:sz w:val="18"/>
+              </w:rPr>
+            </w:r>
+            <w:r>
+              <w:rPr>
+                <w:sz w:val="18"/>
+              </w:rPr>
+              <w:t>Service principals</w:t>
+            </w:r>
+          </w:p>
+        </w:tc>
+        <w:tc>
+          <w:tcPr>
+            <w:tcW w:type="dxa" w:w="2880"/>
+          </w:tcPr>
+          <w:p>
+            <w:r>
+              <w:rPr>
+                <w:sz w:val="18"/>
+              </w:rPr>
+            </w:r>
+            <w:r>
+              <w:rPr>
+                <w:sz w:val="18"/>
+              </w:rPr>
+              <w:t>Container for automation identities; scopes tenant API access</w:t>
+            </w:r>
+          </w:p>
+        </w:tc>
+      </w:tr>
+    </w:tbl>
+    <w:p/>
+    <w:p>
+      <w:r>
+        <w:t xml:space="preserve">*Supporting controls:* </w:t>
       </w:r>
       <w:r>
         <w:rPr>
           <w:b/>
         </w:rPr>
-        <w:t>Viewer</w:t>
-      </w:r>
-      <w:r>
-        <w:t xml:space="preserve"> on one workspace, sees only the published report</w:t>
+        <w:t>Conditional Access</w:t>
+      </w:r>
+      <w:r>
+        <w:t xml:space="preserve"> (MFA + compliant device + allowed location) on all Fabric</w:t>
       </w:r>
     </w:p>
     <w:p>
       <w:r>
-        <w:t xml:space="preserve">item, and even then only the </w:t>
+        <w:t xml:space="preserve">access; </w:t>
       </w:r>
       <w:r>
         <w:rPr>
           <w:b/>
         </w:rPr>
-        <w:t>rows and columns</w:t>
-      </w:r>
-      <w:r>
-        <w:t xml:space="preserve"> their data-level security allows.</w:t>
+        <w:t>PIM</w:t>
+      </w:r>
+      <w:r>
+        <w:t xml:space="preserve"> for admin and production roles; </w:t>
+      </w:r>
+      <w:r>
+        <w:rPr>
+          <w:b/>
+        </w:rPr>
+        <w:t>quarterly access reviews</w:t>
+      </w:r>
+      <w:r>
+        <w:t>; and separately-held</w:t>
+      </w:r>
+    </w:p>
+    <w:p>
+      <w:r>
+        <w:rPr>
+          <w:b/>
+        </w:rPr>
+        <w:t>break-glass</w:t>
+      </w:r>
+      <w:r>
+        <w:t xml:space="preserve"> admin accounts excluded from Conditional Access for emergencies only.</w:t>
       </w:r>
     </w:p>
     <w:p>
@@ -8739,115 +9761,7 @@
       </w:pPr>
       <w:r/>
       <w:r>
-        <w:t>Service principals (SPNs) and managed identities</w:t>
-      </w:r>
-    </w:p>
-    <w:p>
-      <w:r>
-        <w:t xml:space="preserve">Automation — deployment, scheduled runs, and source connections — uses </w:t>
-      </w:r>
-      <w:r>
-        <w:rPr>
-          <w:b/>
-        </w:rPr>
-        <w:t>service principals</w:t>
-      </w:r>
-      <w:r>
-        <w:t xml:space="preserve"> (or</w:t>
-      </w:r>
-    </w:p>
-    <w:p>
-      <w:r>
-        <w:t>managed identities where Fabric supports them), never personal accounts. Best practice:</w:t>
-      </w:r>
-    </w:p>
-    <w:p>
-      <w:pPr>
-        <w:pStyle w:val="ListBullet"/>
-        <w:ind w:left="360"/>
-      </w:pPr>
-      <w:r>
-        <w:rPr>
-          <w:b/>
-        </w:rPr>
-        <w:t>One SPN per environment</w:t>
-      </w:r>
-      <w:r>
-        <w:t>, so a lower-environment credential can never touch production.</w:t>
-      </w:r>
-    </w:p>
-    <w:p>
-      <w:pPr>
-        <w:pStyle w:val="ListBullet"/>
-        <w:ind w:left="360"/>
-      </w:pPr>
-      <w:r>
-        <w:rPr>
-          <w:b/>
-        </w:rPr>
-        <w:t>Least privilege</w:t>
-      </w:r>
-      <w:r>
-        <w:t xml:space="preserve"> — grant the SPN only the workspace role it needs, not tenant admin.</w:t>
-      </w:r>
-    </w:p>
-    <w:p>
-      <w:pPr>
-        <w:pStyle w:val="ListBullet"/>
-        <w:ind w:left="360"/>
-      </w:pPr>
-      <w:r>
-        <w:rPr>
-          <w:b/>
-        </w:rPr>
-        <w:t>Secrets/certificates in Key Vault</w:t>
-      </w:r>
-      <w:r>
-        <w:t xml:space="preserve"> (certificate auth preferred over secrets), </w:t>
-      </w:r>
-      <w:r>
-        <w:rPr>
-          <w:b/>
-        </w:rPr>
-        <w:t>rotated</w:t>
-      </w:r>
-      <w:r>
-        <w:t xml:space="preserve"> on a</w:t>
-      </w:r>
-    </w:p>
-    <w:p>
-      <w:r>
-        <w:t xml:space="preserve">  schedule, </w:t>
-      </w:r>
-      <w:r>
-        <w:rPr>
-          <w:b/>
-        </w:rPr>
-        <w:t>never in git</w:t>
-      </w:r>
-      <w:r>
-        <w:t>.</w:t>
-      </w:r>
-    </w:p>
-    <w:p>
-      <w:pPr>
-        <w:pStyle w:val="ListBullet"/>
-        <w:ind w:left="360"/>
-      </w:pPr>
-      <w:r>
-        <w:t xml:space="preserve">Enable the tenant setting *"service principals can use Fabric APIs"* **only for the </w:t>
-      </w:r>
-      <w:r>
-        <w:rPr>
-          <w:rFonts w:ascii="Consolas" w:hAnsi="Consolas"/>
-          <w:color w:val="A31F34"/>
-        </w:rPr>
-        <w:t>BCPC-FAB-SPN-*</w:t>
-      </w:r>
-    </w:p>
-    <w:p>
-      <w:r>
-        <w:t xml:space="preserve">  group**, not the whole organization.</w:t>
+        <w:t>Fabric access control — defense in depth</w:t>
       </w:r>
     </w:p>
     <w:p>
@@ -8857,7 +9771,7 @@
       <w:r>
         <w:drawing>
           <wp:inline xmlns:a="http://schemas.openxmlformats.org/drawingml/2006/main" xmlns:pic="http://schemas.openxmlformats.org/drawingml/2006/picture">
-            <wp:extent cx="5669280" cy="2746516"/>
+            <wp:extent cx="5669280" cy="14419690"/>
             <wp:docPr id="12" name="Picture 12"/>
             <wp:cNvGraphicFramePr>
               <a:graphicFrameLocks noChangeAspect="1"/>
@@ -8878,6 +9792,204 @@
                   <pic:spPr>
                     <a:xfrm>
                       <a:off x="0" y="0"/>
+                      <a:ext cx="5669280" cy="14419690"/>
+                    </a:xfrm>
+                    <a:prstGeom prst="rect"/>
+                  </pic:spPr>
+                </pic:pic>
+              </a:graphicData>
+            </a:graphic>
+          </wp:inline>
+        </w:drawing>
+      </w:r>
+    </w:p>
+    <w:p>
+      <w:r>
+        <w:t xml:space="preserve">Access is controlled at </w:t>
+      </w:r>
+      <w:r>
+        <w:rPr>
+          <w:b/>
+        </w:rPr>
+        <w:t>five layers</w:t>
+      </w:r>
+      <w:r>
+        <w:t>, each narrower than the last. A consumer, for example, passes</w:t>
+      </w:r>
+    </w:p>
+    <w:p>
+      <w:r>
+        <w:t xml:space="preserve">tenant policy, sits on the capacity, gets </w:t>
+      </w:r>
+      <w:r>
+        <w:rPr>
+          <w:b/>
+        </w:rPr>
+        <w:t>Viewer</w:t>
+      </w:r>
+      <w:r>
+        <w:t xml:space="preserve"> on one workspace, sees only the published report</w:t>
+      </w:r>
+    </w:p>
+    <w:p>
+      <w:r>
+        <w:t xml:space="preserve">item, and even then only the </w:t>
+      </w:r>
+      <w:r>
+        <w:rPr>
+          <w:b/>
+        </w:rPr>
+        <w:t>rows and columns</w:t>
+      </w:r>
+      <w:r>
+        <w:t xml:space="preserve"> their data-level security allows.</w:t>
+      </w:r>
+    </w:p>
+    <w:p>
+      <w:pPr>
+        <w:pStyle w:val="Heading3"/>
+      </w:pPr>
+      <w:r/>
+      <w:r>
+        <w:t>Service principals (SPNs) and managed identities</w:t>
+      </w:r>
+    </w:p>
+    <w:p>
+      <w:r>
+        <w:t xml:space="preserve">Automation — deployment, scheduled runs, and source connections — uses </w:t>
+      </w:r>
+      <w:r>
+        <w:rPr>
+          <w:b/>
+        </w:rPr>
+        <w:t>service principals</w:t>
+      </w:r>
+      <w:r>
+        <w:t xml:space="preserve"> (or</w:t>
+      </w:r>
+    </w:p>
+    <w:p>
+      <w:r>
+        <w:t>managed identities where Fabric supports them), never personal accounts. Best practice:</w:t>
+      </w:r>
+    </w:p>
+    <w:p>
+      <w:pPr>
+        <w:pStyle w:val="ListBullet"/>
+        <w:ind w:left="360"/>
+      </w:pPr>
+      <w:r>
+        <w:rPr>
+          <w:b/>
+        </w:rPr>
+        <w:t>One SPN per environment</w:t>
+      </w:r>
+      <w:r>
+        <w:t>, so a lower-environment credential can never touch production.</w:t>
+      </w:r>
+    </w:p>
+    <w:p>
+      <w:pPr>
+        <w:pStyle w:val="ListBullet"/>
+        <w:ind w:left="360"/>
+      </w:pPr>
+      <w:r>
+        <w:rPr>
+          <w:b/>
+        </w:rPr>
+        <w:t>Least privilege</w:t>
+      </w:r>
+      <w:r>
+        <w:t xml:space="preserve"> — grant the SPN only the workspace role it needs, not tenant admin.</w:t>
+      </w:r>
+    </w:p>
+    <w:p>
+      <w:pPr>
+        <w:pStyle w:val="ListBullet"/>
+        <w:ind w:left="360"/>
+      </w:pPr>
+      <w:r>
+        <w:rPr>
+          <w:b/>
+        </w:rPr>
+        <w:t>Secrets/certificates in Key Vault</w:t>
+      </w:r>
+      <w:r>
+        <w:t xml:space="preserve"> (certificate auth preferred over secrets), </w:t>
+      </w:r>
+      <w:r>
+        <w:rPr>
+          <w:b/>
+        </w:rPr>
+        <w:t>rotated</w:t>
+      </w:r>
+      <w:r>
+        <w:t xml:space="preserve"> on a</w:t>
+      </w:r>
+    </w:p>
+    <w:p>
+      <w:r>
+        <w:t xml:space="preserve">  schedule, </w:t>
+      </w:r>
+      <w:r>
+        <w:rPr>
+          <w:b/>
+        </w:rPr>
+        <w:t>never in git</w:t>
+      </w:r>
+      <w:r>
+        <w:t>.</w:t>
+      </w:r>
+    </w:p>
+    <w:p>
+      <w:pPr>
+        <w:pStyle w:val="ListBullet"/>
+        <w:ind w:left="360"/>
+      </w:pPr>
+      <w:r>
+        <w:t xml:space="preserve">Enable the tenant setting *"service principals can use Fabric APIs"* **only for the </w:t>
+      </w:r>
+      <w:r>
+        <w:rPr>
+          <w:rFonts w:ascii="Consolas" w:hAnsi="Consolas"/>
+          <w:color w:val="A31F34"/>
+        </w:rPr>
+        <w:t>BCPC-FAB-SPN-*</w:t>
+      </w:r>
+    </w:p>
+    <w:p>
+      <w:r>
+        <w:t xml:space="preserve">  group**, not the whole organization.</w:t>
+      </w:r>
+    </w:p>
+    <w:p>
+      <w:pPr>
+        <w:jc w:val="center"/>
+      </w:pPr>
+      <w:r>
+        <w:drawing>
+          <wp:inline xmlns:a="http://schemas.openxmlformats.org/drawingml/2006/main" xmlns:pic="http://schemas.openxmlformats.org/drawingml/2006/picture">
+            <wp:extent cx="5669280" cy="2746516"/>
+            <wp:docPr id="13" name="Picture 13"/>
+            <wp:cNvGraphicFramePr>
+              <a:graphicFrameLocks noChangeAspect="1"/>
+            </wp:cNvGraphicFramePr>
+            <a:graphic>
+              <a:graphicData uri="http://schemas.openxmlformats.org/drawingml/2006/picture">
+                <pic:pic>
+                  <pic:nvPicPr>
+                    <pic:cNvPr id="0" name="image.png"/>
+                    <pic:cNvPicPr/>
+                  </pic:nvPicPr>
+                  <pic:blipFill>
+                    <a:blip r:embed="rId21"/>
+                    <a:stretch>
+                      <a:fillRect/>
+                    </a:stretch>
+                  </pic:blipFill>
+                  <pic:spPr>
+                    <a:xfrm>
+                      <a:off x="0" y="0"/>
                       <a:ext cx="5669280" cy="2746516"/>
                     </a:xfrm>
                     <a:prstGeom prst="rect"/>
@@ -9332,7 +10444,7 @@
         <w:drawing>
           <wp:inline xmlns:a="http://schemas.openxmlformats.org/drawingml/2006/main" xmlns:pic="http://schemas.openxmlformats.org/drawingml/2006/picture">
             <wp:extent cx="5669280" cy="841019"/>
-            <wp:docPr id="13" name="Picture 13"/>
+            <wp:docPr id="14" name="Picture 14"/>
             <wp:cNvGraphicFramePr>
               <a:graphicFrameLocks noChangeAspect="1"/>
             </wp:cNvGraphicFramePr>
@@ -9344,7 +10456,7 @@
                     <pic:cNvPicPr/>
                   </pic:nvPicPr>
                   <pic:blipFill>
-                    <a:blip r:embed="rId21"/>
+                    <a:blip r:embed="rId22"/>
                     <a:stretch>
                       <a:fillRect/>
                     </a:stretch>

</xml_diff>

<commit_message>
Fabric guide: add validated DEV->UAT spoke promotion finding
Ran a real experiment: created a DEV feature spoke (lakehouse + OneLake shortcuts to hub Gold),
paired it to a UAT spoke in a Fabric deployment pipeline, deployed. Confirmed: promotion succeeds
(lakehouse + shortcuts land in UAT), but promoted shortcuts still point at the DEV hub -- the
cross-environment leak the design warns about. Fix documented: provision shortcuts per-env or
rebind via deployment rule. Added the validated finding to md/docx/html.
</commit_message>
<xml_diff>
--- a/milestone-guide/fabric-milestone-guide.docx
+++ b/milestone-guide/fabric-milestone-guide.docx
@@ -8102,6 +8102,90 @@
     <w:p>
       <w:r>
         <w:t>ever reference UAT data, never PROD. (Promote code/config — never data, never cross-env pointers.)</w:t>
+      </w:r>
+    </w:p>
+    <w:p>
+      <w:r>
+        <w:t xml:space="preserve">&gt; </w:t>
+      </w:r>
+      <w:r>
+        <w:rPr>
+          <w:b/>
+        </w:rPr>
+        <w:t>Validated in our tenant (DEV → UAT).</w:t>
+      </w:r>
+      <w:r>
+        <w:t xml:space="preserve"> We created a feature spoke in DEV — a lakehouse with</w:t>
+      </w:r>
+    </w:p>
+    <w:p>
+      <w:r>
+        <w:t xml:space="preserve">&gt; OneLake shortcuts to the hub's Gold — paired it to a UAT spoke in a Fabric </w:t>
+      </w:r>
+      <w:r>
+        <w:rPr>
+          <w:b/>
+        </w:rPr>
+        <w:t>deployment pipeline</w:t>
+      </w:r>
+      <w:r>
+        <w:t>,</w:t>
+      </w:r>
+    </w:p>
+    <w:p>
+      <w:r>
+        <w:t xml:space="preserve">&gt; and deployed. The pipeline </w:t>
+      </w:r>
+      <w:r>
+        <w:rPr>
+          <w:b/>
+        </w:rPr>
+        <w:t>successfully promoted</w:t>
+      </w:r>
+      <w:r>
+        <w:t xml:space="preserve"> the lakehouse *and* its shortcuts to UAT — but</w:t>
+      </w:r>
+    </w:p>
+    <w:p>
+      <w:r>
+        <w:t xml:space="preserve">&gt; the promoted shortcuts </w:t>
+      </w:r>
+      <w:r>
+        <w:rPr>
+          <w:b/>
+        </w:rPr>
+        <w:t>still pointed at the DEV hub</w:t>
+      </w:r>
+      <w:r>
+        <w:t>. That is exactly the cross-environment leak</w:t>
+      </w:r>
+    </w:p>
+    <w:p>
+      <w:r>
+        <w:t xml:space="preserve">&gt; this rule prevents. The fix: </w:t>
+      </w:r>
+      <w:r>
+        <w:rPr>
+          <w:b/>
+        </w:rPr>
+        <w:t>provision shortcuts per environment</w:t>
+      </w:r>
+      <w:r>
+        <w:t xml:space="preserve"> (template, pointing at the</w:t>
+      </w:r>
+    </w:p>
+    <w:p>
+      <w:r>
+        <w:t xml:space="preserve">&gt; env-local hub) or add a </w:t>
+      </w:r>
+      <w:r>
+        <w:rPr>
+          <w:b/>
+        </w:rPr>
+        <w:t>deployment rule</w:t>
+      </w:r>
+      <w:r>
+        <w:t xml:space="preserve"> to rebind the source — never promote shortcuts blindly.</w:t>
       </w:r>
     </w:p>
     <w:tbl>

</xml_diff>

<commit_message>
cp_bootstrap: build feature_workspaces (hub-and-spoke) provisioning
Add manifest-driven spoke provisioning: a feature_workspaces list (name, shortcuts[, lakehouse])
in manifest.yml, exposed via cp_manifest.FEATURE_WORKSPACES. cp_bootstrap.provision_spokes() creates
each spoke idempotently — its workspace (<base>-<name>-<env>), a lakehouse (LH_<name>), and OneLake
shortcuts to THIS environment's hub Gold (env-local, so a UAT spoke references UAT data, never
cross-env). Wired into cp_bootstrap.main() and exposed as standalone cp_spokes.py for re-runs after
a load. Validated on DEV: idempotent re-runs, shortcuts resolve to the DEV hub. Guide updated
(md/docx/html) to mark this implemented + the by-construction fix to the promotion leak.
</commit_message>
<xml_diff>
--- a/milestone-guide/fabric-milestone-guide.docx
+++ b/milestone-guide/fabric-milestone-guide.docx
@@ -8940,17 +8940,72 @@
     </w:p>
     <w:p>
       <w:r>
-        <w:t>&gt; *This spoke-provisioning is a recommended enhancement to the current template — which today</w:t>
+        <w:t xml:space="preserve">&gt; </w:t>
+      </w:r>
+      <w:r>
+        <w:rPr>
+          <w:b/>
+        </w:rPr>
+        <w:t>Implemented.</w:t>
+      </w:r>
+      <w:r>
+        <w:t xml:space="preserve"> Spoke provisioning is now part of the deployment template: a </w:t>
+      </w:r>
+      <w:r>
+        <w:rPr>
+          <w:rFonts w:ascii="Consolas" w:hAnsi="Consolas"/>
+          <w:color w:val="A31F34"/>
+        </w:rPr>
+        <w:t>feature_workspaces</w:t>
       </w:r>
     </w:p>
     <w:p>
       <w:r>
-        <w:t>&gt; provisions the hub. The workspace / lakehouse / role-assignment APIs are already in use, so it is</w:t>
+        <w:t xml:space="preserve">&gt; list in the manifest, provisioned idempotently by </w:t>
+      </w:r>
+      <w:r>
+        <w:rPr>
+          <w:rFonts w:ascii="Consolas" w:hAnsi="Consolas"/>
+          <w:color w:val="A31F34"/>
+        </w:rPr>
+        <w:t>cp_bootstrap</w:t>
+      </w:r>
+      <w:r>
+        <w:t xml:space="preserve"> (or the standalone </w:t>
+      </w:r>
+      <w:r>
+        <w:rPr>
+          <w:rFonts w:ascii="Consolas" w:hAnsi="Consolas"/>
+          <w:color w:val="A31F34"/>
+        </w:rPr>
+        <w:t>cp_spokes.py</w:t>
+      </w:r>
+      <w:r>
+        <w:t>)</w:t>
       </w:r>
     </w:p>
     <w:p>
       <w:r>
-        <w:t>&gt; incremental work, not a rebuild.*</w:t>
+        <w:t xml:space="preserve">&gt; — each spoke's workspace + lakehouse + </w:t>
+      </w:r>
+      <w:r>
+        <w:rPr>
+          <w:b/>
+        </w:rPr>
+        <w:t>env-local</w:t>
+      </w:r>
+      <w:r>
+        <w:t xml:space="preserve"> shortcuts to that environment's hub Gold.</w:t>
+      </w:r>
+    </w:p>
+    <w:p>
+      <w:r>
+        <w:t>&gt; Validated on DEV: re-runs are idempotent, and every shortcut resolves to the DEV hub (never</w:t>
+      </w:r>
+    </w:p>
+    <w:p>
+      <w:r>
+        <w:t>&gt; cross-env) — the by-construction fix to the promotion leak shown above.</w:t>
       </w:r>
     </w:p>
     <w:p>

</xml_diff>